<commit_message>
Avance de documentos Fase 2
</commit_message>
<xml_diff>
--- a/Fase 2/Evidencias Grupales/2.4_GuiaEstudiante_Fase 2_DesarrolloProyecto APT.docx
+++ b/Fase 2/Evidencias Grupales/2.4_GuiaEstudiante_Fase 2_DesarrolloProyecto APT.docx
@@ -1,11 +1,8 @@
 
 <file path=word/document.xml><?xml version="1.0" encoding="utf-8"?>
-<w:document xmlns:wpc="http://schemas.microsoft.com/office/word/2010/wordprocessingCanvas" xmlns:cx="http://schemas.microsoft.com/office/drawing/2014/chartex" xmlns:mc="http://schemas.openxmlformats.org/markup-compatibility/2006" xmlns:o="urn:schemas-microsoft-com:office:office" xmlns:r="http://schemas.openxmlformats.org/officeDocument/2006/relationships" xmlns:m="http://schemas.openxmlformats.org/officeDocument/2006/math" xmlns:v="urn:schemas-microsoft-com:vml" xmlns:wp14="http://schemas.microsoft.com/office/word/2010/wordprocessingDrawing" xmlns:wp="http://schemas.openxmlformats.org/drawingml/2006/wordprocessingDrawing" xmlns:w10="urn:schemas-microsoft-com:office:word" xmlns:w="http://schemas.openxmlformats.org/wordprocessingml/2006/main" xmlns:w14="http://schemas.microsoft.com/office/word/2010/wordml" xmlns:w15="http://schemas.microsoft.com/office/word/2012/wordml" xmlns:w16se="http://schemas.microsoft.com/office/word/2015/wordml/symex" xmlns:wpg="http://schemas.microsoft.com/office/word/2010/wordprocessingGroup" xmlns:wpi="http://schemas.microsoft.com/office/word/2010/wordprocessingInk" xmlns:wne="http://schemas.microsoft.com/office/word/2006/wordml" xmlns:wps="http://schemas.microsoft.com/office/word/2010/wordprocessingShape" mc:Ignorable="w14 w15 w16se wp14">
+<w:document xmlns:wpc="http://schemas.microsoft.com/office/word/2010/wordprocessingCanvas" xmlns:cx="http://schemas.microsoft.com/office/drawing/2014/chartex" xmlns:cx1="http://schemas.microsoft.com/office/drawing/2015/9/8/chartex" xmlns:cx2="http://schemas.microsoft.com/office/drawing/2015/10/21/chartex" xmlns:cx3="http://schemas.microsoft.com/office/drawing/2016/5/9/chartex" xmlns:cx4="http://schemas.microsoft.com/office/drawing/2016/5/10/chartex" xmlns:cx5="http://schemas.microsoft.com/office/drawing/2016/5/11/chartex" xmlns:cx6="http://schemas.microsoft.com/office/drawing/2016/5/12/chartex" xmlns:cx7="http://schemas.microsoft.com/office/drawing/2016/5/13/chartex" xmlns:cx8="http://schemas.microsoft.com/office/drawing/2016/5/14/chartex" xmlns:mc="http://schemas.openxmlformats.org/markup-compatibility/2006" xmlns:aink="http://schemas.microsoft.com/office/drawing/2016/ink" xmlns:am3d="http://schemas.microsoft.com/office/drawing/2017/model3d" xmlns:o="urn:schemas-microsoft-com:office:office" xmlns:r="http://schemas.openxmlformats.org/officeDocument/2006/relationships" xmlns:m="http://schemas.openxmlformats.org/officeDocument/2006/math" xmlns:v="urn:schemas-microsoft-com:vml" xmlns:wp14="http://schemas.microsoft.com/office/word/2010/wordprocessingDrawing" xmlns:wp="http://schemas.openxmlformats.org/drawingml/2006/wordprocessingDrawing" xmlns:w10="urn:schemas-microsoft-com:office:word" xmlns:w="http://schemas.openxmlformats.org/wordprocessingml/2006/main" xmlns:w14="http://schemas.microsoft.com/office/word/2010/wordml" xmlns:w15="http://schemas.microsoft.com/office/word/2012/wordml" xmlns:w16cex="http://schemas.microsoft.com/office/word/2018/wordml/cex" xmlns:w16cid="http://schemas.microsoft.com/office/word/2016/wordml/cid" xmlns:w16="http://schemas.microsoft.com/office/word/2018/wordml" xmlns:w16sdtdh="http://schemas.microsoft.com/office/word/2020/wordml/sdtdatahash" xmlns:w16se="http://schemas.microsoft.com/office/word/2015/wordml/symex" xmlns:wpg="http://schemas.microsoft.com/office/word/2010/wordprocessingGroup" xmlns:wpi="http://schemas.microsoft.com/office/word/2010/wordprocessingInk" xmlns:wne="http://schemas.microsoft.com/office/word/2006/wordml" xmlns:wps="http://schemas.microsoft.com/office/word/2010/wordprocessingShape" mc:Ignorable="w14 w15 w16se w16cid w16 w16cex w16sdtdh wp14">
   <w:body>
-    <w:p>
-      <w:bookmarkStart w:id="0" w:name="_GoBack"/>
-      <w:bookmarkEnd w:id="0"/>
-    </w:p>
+    <w:p/>
     <w:p>
       <w:pPr>
         <w:rPr>
@@ -98,16 +95,7 @@
                                   <w:sz w:val="48"/>
                                   <w:szCs w:val="48"/>
                                 </w:rPr>
-                                <w:t>Guía</w:t>
-                              </w:r>
-                              <w:r>
-                                <w:rPr>
-                                  <w:b/>
-                                  <w:color w:val="1F3864" w:themeColor="accent1" w:themeShade="80"/>
-                                  <w:sz w:val="48"/>
-                                  <w:szCs w:val="48"/>
-                                </w:rPr>
-                                <w:t>2.</w:t>
+                                <w:t>Guía 2. Desarrollo Proyecto APT</w:t>
                               </w:r>
                               <w:r>
                                 <w:rPr>
@@ -117,33 +105,6 @@
                                   <w:szCs w:val="48"/>
                                 </w:rPr>
                                 <w:t xml:space="preserve"> </w:t>
-                              </w:r>
-                              <w:r>
-                                <w:rPr>
-                                  <w:b/>
-                                  <w:color w:val="1F3864" w:themeColor="accent1" w:themeShade="80"/>
-                                  <w:sz w:val="48"/>
-                                  <w:szCs w:val="48"/>
-                                </w:rPr>
-                                <w:t>Desarrollo P</w:t>
-                              </w:r>
-                              <w:r>
-                                <w:rPr>
-                                  <w:b/>
-                                  <w:color w:val="1F3864" w:themeColor="accent1" w:themeShade="80"/>
-                                  <w:sz w:val="48"/>
-                                  <w:szCs w:val="48"/>
-                                </w:rPr>
-                                <w:t xml:space="preserve">royecto </w:t>
-                              </w:r>
-                              <w:r>
-                                <w:rPr>
-                                  <w:b/>
-                                  <w:color w:val="1F3864" w:themeColor="accent1" w:themeShade="80"/>
-                                  <w:sz w:val="48"/>
-                                  <w:szCs w:val="48"/>
-                                </w:rPr>
-                                <w:t xml:space="preserve">APT </w:t>
                               </w:r>
                             </w:p>
                             <w:p>
@@ -274,16 +235,7 @@
                             <w:sz w:val="48"/>
                             <w:szCs w:val="48"/>
                           </w:rPr>
-                          <w:t>Guía</w:t>
-                        </w:r>
-                        <w:r>
-                          <w:rPr>
-                            <w:b/>
-                            <w:color w:val="1F3864" w:themeColor="accent1" w:themeShade="80"/>
-                            <w:sz w:val="48"/>
-                            <w:szCs w:val="48"/>
-                          </w:rPr>
-                          <w:t>2.</w:t>
+                          <w:t>Guía 2. Desarrollo Proyecto APT</w:t>
                         </w:r>
                         <w:r>
                           <w:rPr>
@@ -293,33 +245,6 @@
                             <w:szCs w:val="48"/>
                           </w:rPr>
                           <w:t xml:space="preserve"> </w:t>
-                        </w:r>
-                        <w:r>
-                          <w:rPr>
-                            <w:b/>
-                            <w:color w:val="1F3864" w:themeColor="accent1" w:themeShade="80"/>
-                            <w:sz w:val="48"/>
-                            <w:szCs w:val="48"/>
-                          </w:rPr>
-                          <w:t>Desarrollo P</w:t>
-                        </w:r>
-                        <w:r>
-                          <w:rPr>
-                            <w:b/>
-                            <w:color w:val="1F3864" w:themeColor="accent1" w:themeShade="80"/>
-                            <w:sz w:val="48"/>
-                            <w:szCs w:val="48"/>
-                          </w:rPr>
-                          <w:t xml:space="preserve">royecto </w:t>
-                        </w:r>
-                        <w:r>
-                          <w:rPr>
-                            <w:b/>
-                            <w:color w:val="1F3864" w:themeColor="accent1" w:themeShade="80"/>
-                            <w:sz w:val="48"/>
-                            <w:szCs w:val="48"/>
-                          </w:rPr>
-                          <w:t xml:space="preserve">APT </w:t>
                         </w:r>
                       </w:p>
                       <w:p>
@@ -780,7 +705,18 @@
                 <w:szCs w:val="20"/>
                 <w:lang w:eastAsia="es-CL"/>
               </w:rPr>
-              <w:t>En caso que hayas realizado ajustes a los objetivos o metodología, debes incluir dichos apartados nuevamente en este informe, señalando cuáles son dichos ajustes.</w:t>
+              <w:t>En caso de que hayas realizado ajustes a los objetivos o la metodología</w:t>
+            </w:r>
+            <w:r>
+              <w:rPr>
+                <w:rFonts w:ascii="Calibri" w:hAnsi="Calibri" w:cs="Arial"/>
+                <w:i/>
+                <w:color w:val="548DD4"/>
+                <w:sz w:val="20"/>
+                <w:szCs w:val="20"/>
+                <w:lang w:eastAsia="es-CL"/>
+              </w:rPr>
+              <w:t>, debes incluir dichos apartados nuevamente en este informe, señalando cuáles son dichos ajustes.</w:t>
             </w:r>
           </w:p>
         </w:tc>
@@ -1295,7 +1231,7 @@
                 <w:szCs w:val="20"/>
                 <w:lang w:eastAsia="es-CL"/>
               </w:rPr>
-              <w:t>En este apartado adjuntar la(s) evidencia(s) seleccionada(s) para ser evaluada por el docente.</w:t>
+              <w:t>En este apartado adjunta la(s) evidencia(s) seleccionada(s) para ser evaluada por el docente.</w:t>
             </w:r>
           </w:p>
         </w:tc>
@@ -2217,7 +2153,7 @@
                 <w:szCs w:val="20"/>
                 <w:lang w:eastAsia="es-CL"/>
               </w:rPr>
-              <w:t>En curso/ Con retraso/ No iniciado/ Completado/ Ajustada</w:t>
+              <w:t>En curso / Con retraso / No iniciado / Completado / Ajustada</w:t>
             </w:r>
             <w:r>
               <w:rPr>
@@ -3300,7 +3236,12 @@
       </w:pPr>
     </w:p>
     <w:sectPr>
-      <w:headerReference w:type="default" r:id="rId10"/>
+      <w:headerReference w:type="even" r:id="rId10"/>
+      <w:headerReference w:type="default" r:id="rId11"/>
+      <w:footerReference w:type="even" r:id="rId12"/>
+      <w:footerReference w:type="default" r:id="rId13"/>
+      <w:headerReference w:type="first" r:id="rId14"/>
+      <w:footerReference w:type="first" r:id="rId15"/>
       <w:pgSz w:w="11906" w:h="16838"/>
       <w:pgMar w:top="1417" w:right="1701" w:bottom="1417" w:left="1701" w:header="708" w:footer="708" w:gutter="0"/>
       <w:cols w:space="708"/>
@@ -3311,7 +3252,7 @@
 </file>
 
 <file path=word/endnotes.xml><?xml version="1.0" encoding="utf-8"?>
-<w:endnotes xmlns:wpc="http://schemas.microsoft.com/office/word/2010/wordprocessingCanvas" xmlns:cx="http://schemas.microsoft.com/office/drawing/2014/chartex" xmlns:mc="http://schemas.openxmlformats.org/markup-compatibility/2006" xmlns:o="urn:schemas-microsoft-com:office:office" xmlns:r="http://schemas.openxmlformats.org/officeDocument/2006/relationships" xmlns:m="http://schemas.openxmlformats.org/officeDocument/2006/math" xmlns:v="urn:schemas-microsoft-com:vml" xmlns:wp14="http://schemas.microsoft.com/office/word/2010/wordprocessingDrawing" xmlns:wp="http://schemas.openxmlformats.org/drawingml/2006/wordprocessingDrawing" xmlns:w10="urn:schemas-microsoft-com:office:word" xmlns:w="http://schemas.openxmlformats.org/wordprocessingml/2006/main" xmlns:w14="http://schemas.microsoft.com/office/word/2010/wordml" xmlns:w15="http://schemas.microsoft.com/office/word/2012/wordml" xmlns:w16se="http://schemas.microsoft.com/office/word/2015/wordml/symex" xmlns:wpg="http://schemas.microsoft.com/office/word/2010/wordprocessingGroup" xmlns:wpi="http://schemas.microsoft.com/office/word/2010/wordprocessingInk" xmlns:wne="http://schemas.microsoft.com/office/word/2006/wordml" xmlns:wps="http://schemas.microsoft.com/office/word/2010/wordprocessingShape" mc:Ignorable="w14 w15 w16se wp14">
+<w:endnotes xmlns:wpc="http://schemas.microsoft.com/office/word/2010/wordprocessingCanvas" xmlns:cx="http://schemas.microsoft.com/office/drawing/2014/chartex" xmlns:cx1="http://schemas.microsoft.com/office/drawing/2015/9/8/chartex" xmlns:cx2="http://schemas.microsoft.com/office/drawing/2015/10/21/chartex" xmlns:cx3="http://schemas.microsoft.com/office/drawing/2016/5/9/chartex" xmlns:cx4="http://schemas.microsoft.com/office/drawing/2016/5/10/chartex" xmlns:cx5="http://schemas.microsoft.com/office/drawing/2016/5/11/chartex" xmlns:cx6="http://schemas.microsoft.com/office/drawing/2016/5/12/chartex" xmlns:cx7="http://schemas.microsoft.com/office/drawing/2016/5/13/chartex" xmlns:cx8="http://schemas.microsoft.com/office/drawing/2016/5/14/chartex" xmlns:mc="http://schemas.openxmlformats.org/markup-compatibility/2006" xmlns:aink="http://schemas.microsoft.com/office/drawing/2016/ink" xmlns:am3d="http://schemas.microsoft.com/office/drawing/2017/model3d" xmlns:o="urn:schemas-microsoft-com:office:office" xmlns:r="http://schemas.openxmlformats.org/officeDocument/2006/relationships" xmlns:m="http://schemas.openxmlformats.org/officeDocument/2006/math" xmlns:v="urn:schemas-microsoft-com:vml" xmlns:wp14="http://schemas.microsoft.com/office/word/2010/wordprocessingDrawing" xmlns:wp="http://schemas.openxmlformats.org/drawingml/2006/wordprocessingDrawing" xmlns:w10="urn:schemas-microsoft-com:office:word" xmlns:w="http://schemas.openxmlformats.org/wordprocessingml/2006/main" xmlns:w14="http://schemas.microsoft.com/office/word/2010/wordml" xmlns:w15="http://schemas.microsoft.com/office/word/2012/wordml" xmlns:w16cex="http://schemas.microsoft.com/office/word/2018/wordml/cex" xmlns:w16cid="http://schemas.microsoft.com/office/word/2016/wordml/cid" xmlns:w16="http://schemas.microsoft.com/office/word/2018/wordml" xmlns:w16sdtdh="http://schemas.microsoft.com/office/word/2020/wordml/sdtdatahash" xmlns:w16se="http://schemas.microsoft.com/office/word/2015/wordml/symex" xmlns:wpg="http://schemas.microsoft.com/office/word/2010/wordprocessingGroup" xmlns:wpi="http://schemas.microsoft.com/office/word/2010/wordprocessingInk" xmlns:wne="http://schemas.microsoft.com/office/word/2006/wordml" xmlns:wps="http://schemas.microsoft.com/office/word/2010/wordprocessingShape" mc:Ignorable="w14 w15 w16se w16cid w16 w16cex w16sdtdh wp14">
   <w:endnote w:type="separator" w:id="-1">
     <w:p>
       <w:pPr>
@@ -3335,8 +3276,38 @@
 </w:endnotes>
 </file>
 
+<file path=word/footer1.xml><?xml version="1.0" encoding="utf-8"?>
+<w:ftr xmlns:wpc="http://schemas.microsoft.com/office/word/2010/wordprocessingCanvas" xmlns:cx="http://schemas.microsoft.com/office/drawing/2014/chartex" xmlns:cx1="http://schemas.microsoft.com/office/drawing/2015/9/8/chartex" xmlns:cx2="http://schemas.microsoft.com/office/drawing/2015/10/21/chartex" xmlns:cx3="http://schemas.microsoft.com/office/drawing/2016/5/9/chartex" xmlns:cx4="http://schemas.microsoft.com/office/drawing/2016/5/10/chartex" xmlns:cx5="http://schemas.microsoft.com/office/drawing/2016/5/11/chartex" xmlns:cx6="http://schemas.microsoft.com/office/drawing/2016/5/12/chartex" xmlns:cx7="http://schemas.microsoft.com/office/drawing/2016/5/13/chartex" xmlns:cx8="http://schemas.microsoft.com/office/drawing/2016/5/14/chartex" xmlns:mc="http://schemas.openxmlformats.org/markup-compatibility/2006" xmlns:aink="http://schemas.microsoft.com/office/drawing/2016/ink" xmlns:am3d="http://schemas.microsoft.com/office/drawing/2017/model3d" xmlns:o="urn:schemas-microsoft-com:office:office" xmlns:r="http://schemas.openxmlformats.org/officeDocument/2006/relationships" xmlns:m="http://schemas.openxmlformats.org/officeDocument/2006/math" xmlns:v="urn:schemas-microsoft-com:vml" xmlns:wp14="http://schemas.microsoft.com/office/word/2010/wordprocessingDrawing" xmlns:wp="http://schemas.openxmlformats.org/drawingml/2006/wordprocessingDrawing" xmlns:w10="urn:schemas-microsoft-com:office:word" xmlns:w="http://schemas.openxmlformats.org/wordprocessingml/2006/main" xmlns:w14="http://schemas.microsoft.com/office/word/2010/wordml" xmlns:w15="http://schemas.microsoft.com/office/word/2012/wordml" xmlns:w16cex="http://schemas.microsoft.com/office/word/2018/wordml/cex" xmlns:w16cid="http://schemas.microsoft.com/office/word/2016/wordml/cid" xmlns:w16="http://schemas.microsoft.com/office/word/2018/wordml" xmlns:w16sdtdh="http://schemas.microsoft.com/office/word/2020/wordml/sdtdatahash" xmlns:w16se="http://schemas.microsoft.com/office/word/2015/wordml/symex" xmlns:wpg="http://schemas.microsoft.com/office/word/2010/wordprocessingGroup" xmlns:wpi="http://schemas.microsoft.com/office/word/2010/wordprocessingInk" xmlns:wne="http://schemas.microsoft.com/office/word/2006/wordml" xmlns:wps="http://schemas.microsoft.com/office/word/2010/wordprocessingShape" mc:Ignorable="w14 w15 w16se w16cid w16 w16cex w16sdtdh wp14">
+  <w:p>
+    <w:pPr>
+      <w:pStyle w:val="Piedepgina"/>
+    </w:pPr>
+  </w:p>
+</w:ftr>
+</file>
+
+<file path=word/footer2.xml><?xml version="1.0" encoding="utf-8"?>
+<w:ftr xmlns:wpc="http://schemas.microsoft.com/office/word/2010/wordprocessingCanvas" xmlns:cx="http://schemas.microsoft.com/office/drawing/2014/chartex" xmlns:cx1="http://schemas.microsoft.com/office/drawing/2015/9/8/chartex" xmlns:cx2="http://schemas.microsoft.com/office/drawing/2015/10/21/chartex" xmlns:cx3="http://schemas.microsoft.com/office/drawing/2016/5/9/chartex" xmlns:cx4="http://schemas.microsoft.com/office/drawing/2016/5/10/chartex" xmlns:cx5="http://schemas.microsoft.com/office/drawing/2016/5/11/chartex" xmlns:cx6="http://schemas.microsoft.com/office/drawing/2016/5/12/chartex" xmlns:cx7="http://schemas.microsoft.com/office/drawing/2016/5/13/chartex" xmlns:cx8="http://schemas.microsoft.com/office/drawing/2016/5/14/chartex" xmlns:mc="http://schemas.openxmlformats.org/markup-compatibility/2006" xmlns:aink="http://schemas.microsoft.com/office/drawing/2016/ink" xmlns:am3d="http://schemas.microsoft.com/office/drawing/2017/model3d" xmlns:o="urn:schemas-microsoft-com:office:office" xmlns:r="http://schemas.openxmlformats.org/officeDocument/2006/relationships" xmlns:m="http://schemas.openxmlformats.org/officeDocument/2006/math" xmlns:v="urn:schemas-microsoft-com:vml" xmlns:wp14="http://schemas.microsoft.com/office/word/2010/wordprocessingDrawing" xmlns:wp="http://schemas.openxmlformats.org/drawingml/2006/wordprocessingDrawing" xmlns:w10="urn:schemas-microsoft-com:office:word" xmlns:w="http://schemas.openxmlformats.org/wordprocessingml/2006/main" xmlns:w14="http://schemas.microsoft.com/office/word/2010/wordml" xmlns:w15="http://schemas.microsoft.com/office/word/2012/wordml" xmlns:w16cex="http://schemas.microsoft.com/office/word/2018/wordml/cex" xmlns:w16cid="http://schemas.microsoft.com/office/word/2016/wordml/cid" xmlns:w16="http://schemas.microsoft.com/office/word/2018/wordml" xmlns:w16sdtdh="http://schemas.microsoft.com/office/word/2020/wordml/sdtdatahash" xmlns:w16se="http://schemas.microsoft.com/office/word/2015/wordml/symex" xmlns:wpg="http://schemas.microsoft.com/office/word/2010/wordprocessingGroup" xmlns:wpi="http://schemas.microsoft.com/office/word/2010/wordprocessingInk" xmlns:wne="http://schemas.microsoft.com/office/word/2006/wordml" xmlns:wps="http://schemas.microsoft.com/office/word/2010/wordprocessingShape" mc:Ignorable="w14 w15 w16se w16cid w16 w16cex w16sdtdh wp14">
+  <w:p>
+    <w:pPr>
+      <w:pStyle w:val="Piedepgina"/>
+    </w:pPr>
+  </w:p>
+</w:ftr>
+</file>
+
+<file path=word/footer3.xml><?xml version="1.0" encoding="utf-8"?>
+<w:ftr xmlns:wpc="http://schemas.microsoft.com/office/word/2010/wordprocessingCanvas" xmlns:cx="http://schemas.microsoft.com/office/drawing/2014/chartex" xmlns:cx1="http://schemas.microsoft.com/office/drawing/2015/9/8/chartex" xmlns:cx2="http://schemas.microsoft.com/office/drawing/2015/10/21/chartex" xmlns:cx3="http://schemas.microsoft.com/office/drawing/2016/5/9/chartex" xmlns:cx4="http://schemas.microsoft.com/office/drawing/2016/5/10/chartex" xmlns:cx5="http://schemas.microsoft.com/office/drawing/2016/5/11/chartex" xmlns:cx6="http://schemas.microsoft.com/office/drawing/2016/5/12/chartex" xmlns:cx7="http://schemas.microsoft.com/office/drawing/2016/5/13/chartex" xmlns:cx8="http://schemas.microsoft.com/office/drawing/2016/5/14/chartex" xmlns:mc="http://schemas.openxmlformats.org/markup-compatibility/2006" xmlns:aink="http://schemas.microsoft.com/office/drawing/2016/ink" xmlns:am3d="http://schemas.microsoft.com/office/drawing/2017/model3d" xmlns:o="urn:schemas-microsoft-com:office:office" xmlns:r="http://schemas.openxmlformats.org/officeDocument/2006/relationships" xmlns:m="http://schemas.openxmlformats.org/officeDocument/2006/math" xmlns:v="urn:schemas-microsoft-com:vml" xmlns:wp14="http://schemas.microsoft.com/office/word/2010/wordprocessingDrawing" xmlns:wp="http://schemas.openxmlformats.org/drawingml/2006/wordprocessingDrawing" xmlns:w10="urn:schemas-microsoft-com:office:word" xmlns:w="http://schemas.openxmlformats.org/wordprocessingml/2006/main" xmlns:w14="http://schemas.microsoft.com/office/word/2010/wordml" xmlns:w15="http://schemas.microsoft.com/office/word/2012/wordml" xmlns:w16cex="http://schemas.microsoft.com/office/word/2018/wordml/cex" xmlns:w16cid="http://schemas.microsoft.com/office/word/2016/wordml/cid" xmlns:w16="http://schemas.microsoft.com/office/word/2018/wordml" xmlns:w16sdtdh="http://schemas.microsoft.com/office/word/2020/wordml/sdtdatahash" xmlns:w16se="http://schemas.microsoft.com/office/word/2015/wordml/symex" xmlns:wpg="http://schemas.microsoft.com/office/word/2010/wordprocessingGroup" xmlns:wpi="http://schemas.microsoft.com/office/word/2010/wordprocessingInk" xmlns:wne="http://schemas.microsoft.com/office/word/2006/wordml" xmlns:wps="http://schemas.microsoft.com/office/word/2010/wordprocessingShape" mc:Ignorable="w14 w15 w16se w16cid w16 w16cex w16sdtdh wp14">
+  <w:p>
+    <w:pPr>
+      <w:pStyle w:val="Piedepgina"/>
+    </w:pPr>
+  </w:p>
+</w:ftr>
+</file>
+
 <file path=word/footnotes.xml><?xml version="1.0" encoding="utf-8"?>
-<w:footnotes xmlns:wpc="http://schemas.microsoft.com/office/word/2010/wordprocessingCanvas" xmlns:cx="http://schemas.microsoft.com/office/drawing/2014/chartex" xmlns:mc="http://schemas.openxmlformats.org/markup-compatibility/2006" xmlns:o="urn:schemas-microsoft-com:office:office" xmlns:r="http://schemas.openxmlformats.org/officeDocument/2006/relationships" xmlns:m="http://schemas.openxmlformats.org/officeDocument/2006/math" xmlns:v="urn:schemas-microsoft-com:vml" xmlns:wp14="http://schemas.microsoft.com/office/word/2010/wordprocessingDrawing" xmlns:wp="http://schemas.openxmlformats.org/drawingml/2006/wordprocessingDrawing" xmlns:w10="urn:schemas-microsoft-com:office:word" xmlns:w="http://schemas.openxmlformats.org/wordprocessingml/2006/main" xmlns:w14="http://schemas.microsoft.com/office/word/2010/wordml" xmlns:w15="http://schemas.microsoft.com/office/word/2012/wordml" xmlns:w16se="http://schemas.microsoft.com/office/word/2015/wordml/symex" xmlns:wpg="http://schemas.microsoft.com/office/word/2010/wordprocessingGroup" xmlns:wpi="http://schemas.microsoft.com/office/word/2010/wordprocessingInk" xmlns:wne="http://schemas.microsoft.com/office/word/2006/wordml" xmlns:wps="http://schemas.microsoft.com/office/word/2010/wordprocessingShape" mc:Ignorable="w14 w15 w16se wp14">
+<w:footnotes xmlns:wpc="http://schemas.microsoft.com/office/word/2010/wordprocessingCanvas" xmlns:cx="http://schemas.microsoft.com/office/drawing/2014/chartex" xmlns:cx1="http://schemas.microsoft.com/office/drawing/2015/9/8/chartex" xmlns:cx2="http://schemas.microsoft.com/office/drawing/2015/10/21/chartex" xmlns:cx3="http://schemas.microsoft.com/office/drawing/2016/5/9/chartex" xmlns:cx4="http://schemas.microsoft.com/office/drawing/2016/5/10/chartex" xmlns:cx5="http://schemas.microsoft.com/office/drawing/2016/5/11/chartex" xmlns:cx6="http://schemas.microsoft.com/office/drawing/2016/5/12/chartex" xmlns:cx7="http://schemas.microsoft.com/office/drawing/2016/5/13/chartex" xmlns:cx8="http://schemas.microsoft.com/office/drawing/2016/5/14/chartex" xmlns:mc="http://schemas.openxmlformats.org/markup-compatibility/2006" xmlns:aink="http://schemas.microsoft.com/office/drawing/2016/ink" xmlns:am3d="http://schemas.microsoft.com/office/drawing/2017/model3d" xmlns:o="urn:schemas-microsoft-com:office:office" xmlns:r="http://schemas.openxmlformats.org/officeDocument/2006/relationships" xmlns:m="http://schemas.openxmlformats.org/officeDocument/2006/math" xmlns:v="urn:schemas-microsoft-com:vml" xmlns:wp14="http://schemas.microsoft.com/office/word/2010/wordprocessingDrawing" xmlns:wp="http://schemas.openxmlformats.org/drawingml/2006/wordprocessingDrawing" xmlns:w10="urn:schemas-microsoft-com:office:word" xmlns:w="http://schemas.openxmlformats.org/wordprocessingml/2006/main" xmlns:w14="http://schemas.microsoft.com/office/word/2010/wordml" xmlns:w15="http://schemas.microsoft.com/office/word/2012/wordml" xmlns:w16cex="http://schemas.microsoft.com/office/word/2018/wordml/cex" xmlns:w16cid="http://schemas.microsoft.com/office/word/2016/wordml/cid" xmlns:w16="http://schemas.microsoft.com/office/word/2018/wordml" xmlns:w16sdtdh="http://schemas.microsoft.com/office/word/2020/wordml/sdtdatahash" xmlns:w16se="http://schemas.microsoft.com/office/word/2015/wordml/symex" xmlns:wpg="http://schemas.microsoft.com/office/word/2010/wordprocessingGroup" xmlns:wpi="http://schemas.microsoft.com/office/word/2010/wordprocessingInk" xmlns:wne="http://schemas.microsoft.com/office/word/2006/wordml" xmlns:wps="http://schemas.microsoft.com/office/word/2010/wordprocessingShape" mc:Ignorable="w14 w15 w16se w16cid w16 w16cex w16sdtdh wp14">
   <w:footnote w:type="separator" w:id="-1">
     <w:p>
       <w:pPr>
@@ -3419,7 +3390,17 @@
 </file>
 
 <file path=word/header1.xml><?xml version="1.0" encoding="utf-8"?>
-<w:hdr xmlns:wpc="http://schemas.microsoft.com/office/word/2010/wordprocessingCanvas" xmlns:cx="http://schemas.microsoft.com/office/drawing/2014/chartex" xmlns:mc="http://schemas.openxmlformats.org/markup-compatibility/2006" xmlns:o="urn:schemas-microsoft-com:office:office" xmlns:r="http://schemas.openxmlformats.org/officeDocument/2006/relationships" xmlns:m="http://schemas.openxmlformats.org/officeDocument/2006/math" xmlns:v="urn:schemas-microsoft-com:vml" xmlns:wp14="http://schemas.microsoft.com/office/word/2010/wordprocessingDrawing" xmlns:wp="http://schemas.openxmlformats.org/drawingml/2006/wordprocessingDrawing" xmlns:w10="urn:schemas-microsoft-com:office:word" xmlns:w="http://schemas.openxmlformats.org/wordprocessingml/2006/main" xmlns:w14="http://schemas.microsoft.com/office/word/2010/wordml" xmlns:w15="http://schemas.microsoft.com/office/word/2012/wordml" xmlns:w16se="http://schemas.microsoft.com/office/word/2015/wordml/symex" xmlns:wpg="http://schemas.microsoft.com/office/word/2010/wordprocessingGroup" xmlns:wpi="http://schemas.microsoft.com/office/word/2010/wordprocessingInk" xmlns:wne="http://schemas.microsoft.com/office/word/2006/wordml" xmlns:wps="http://schemas.microsoft.com/office/word/2010/wordprocessingShape" mc:Ignorable="w14 w15 w16se wp14">
+<w:hdr xmlns:wpc="http://schemas.microsoft.com/office/word/2010/wordprocessingCanvas" xmlns:cx="http://schemas.microsoft.com/office/drawing/2014/chartex" xmlns:cx1="http://schemas.microsoft.com/office/drawing/2015/9/8/chartex" xmlns:cx2="http://schemas.microsoft.com/office/drawing/2015/10/21/chartex" xmlns:cx3="http://schemas.microsoft.com/office/drawing/2016/5/9/chartex" xmlns:cx4="http://schemas.microsoft.com/office/drawing/2016/5/10/chartex" xmlns:cx5="http://schemas.microsoft.com/office/drawing/2016/5/11/chartex" xmlns:cx6="http://schemas.microsoft.com/office/drawing/2016/5/12/chartex" xmlns:cx7="http://schemas.microsoft.com/office/drawing/2016/5/13/chartex" xmlns:cx8="http://schemas.microsoft.com/office/drawing/2016/5/14/chartex" xmlns:mc="http://schemas.openxmlformats.org/markup-compatibility/2006" xmlns:aink="http://schemas.microsoft.com/office/drawing/2016/ink" xmlns:am3d="http://schemas.microsoft.com/office/drawing/2017/model3d" xmlns:o="urn:schemas-microsoft-com:office:office" xmlns:r="http://schemas.openxmlformats.org/officeDocument/2006/relationships" xmlns:m="http://schemas.openxmlformats.org/officeDocument/2006/math" xmlns:v="urn:schemas-microsoft-com:vml" xmlns:wp14="http://schemas.microsoft.com/office/word/2010/wordprocessingDrawing" xmlns:wp="http://schemas.openxmlformats.org/drawingml/2006/wordprocessingDrawing" xmlns:w10="urn:schemas-microsoft-com:office:word" xmlns:w="http://schemas.openxmlformats.org/wordprocessingml/2006/main" xmlns:w14="http://schemas.microsoft.com/office/word/2010/wordml" xmlns:w15="http://schemas.microsoft.com/office/word/2012/wordml" xmlns:w16cex="http://schemas.microsoft.com/office/word/2018/wordml/cex" xmlns:w16cid="http://schemas.microsoft.com/office/word/2016/wordml/cid" xmlns:w16="http://schemas.microsoft.com/office/word/2018/wordml" xmlns:w16sdtdh="http://schemas.microsoft.com/office/word/2020/wordml/sdtdatahash" xmlns:w16se="http://schemas.microsoft.com/office/word/2015/wordml/symex" xmlns:wpg="http://schemas.microsoft.com/office/word/2010/wordprocessingGroup" xmlns:wpi="http://schemas.microsoft.com/office/word/2010/wordprocessingInk" xmlns:wne="http://schemas.microsoft.com/office/word/2006/wordml" xmlns:wps="http://schemas.microsoft.com/office/word/2010/wordprocessingShape" mc:Ignorable="w14 w15 w16se w16cid w16 w16cex w16sdtdh wp14">
+  <w:p>
+    <w:pPr>
+      <w:pStyle w:val="Encabezado"/>
+    </w:pPr>
+  </w:p>
+</w:hdr>
+</file>
+
+<file path=word/header2.xml><?xml version="1.0" encoding="utf-8"?>
+<w:hdr xmlns:wpc="http://schemas.microsoft.com/office/word/2010/wordprocessingCanvas" xmlns:cx="http://schemas.microsoft.com/office/drawing/2014/chartex" xmlns:cx1="http://schemas.microsoft.com/office/drawing/2015/9/8/chartex" xmlns:cx2="http://schemas.microsoft.com/office/drawing/2015/10/21/chartex" xmlns:cx3="http://schemas.microsoft.com/office/drawing/2016/5/9/chartex" xmlns:cx4="http://schemas.microsoft.com/office/drawing/2016/5/10/chartex" xmlns:cx5="http://schemas.microsoft.com/office/drawing/2016/5/11/chartex" xmlns:cx6="http://schemas.microsoft.com/office/drawing/2016/5/12/chartex" xmlns:cx7="http://schemas.microsoft.com/office/drawing/2016/5/13/chartex" xmlns:cx8="http://schemas.microsoft.com/office/drawing/2016/5/14/chartex" xmlns:mc="http://schemas.openxmlformats.org/markup-compatibility/2006" xmlns:aink="http://schemas.microsoft.com/office/drawing/2016/ink" xmlns:am3d="http://schemas.microsoft.com/office/drawing/2017/model3d" xmlns:o="urn:schemas-microsoft-com:office:office" xmlns:r="http://schemas.openxmlformats.org/officeDocument/2006/relationships" xmlns:m="http://schemas.openxmlformats.org/officeDocument/2006/math" xmlns:v="urn:schemas-microsoft-com:vml" xmlns:wp14="http://schemas.microsoft.com/office/word/2010/wordprocessingDrawing" xmlns:wp="http://schemas.openxmlformats.org/drawingml/2006/wordprocessingDrawing" xmlns:w10="urn:schemas-microsoft-com:office:word" xmlns:w="http://schemas.openxmlformats.org/wordprocessingml/2006/main" xmlns:w14="http://schemas.microsoft.com/office/word/2010/wordml" xmlns:w15="http://schemas.microsoft.com/office/word/2012/wordml" xmlns:w16cex="http://schemas.microsoft.com/office/word/2018/wordml/cex" xmlns:w16cid="http://schemas.microsoft.com/office/word/2016/wordml/cid" xmlns:w16="http://schemas.microsoft.com/office/word/2018/wordml" xmlns:w16sdtdh="http://schemas.microsoft.com/office/word/2020/wordml/sdtdatahash" xmlns:w16se="http://schemas.microsoft.com/office/word/2015/wordml/symex" xmlns:wpg="http://schemas.microsoft.com/office/word/2010/wordprocessingGroup" xmlns:wpi="http://schemas.microsoft.com/office/word/2010/wordprocessingInk" xmlns:wne="http://schemas.microsoft.com/office/word/2006/wordml" xmlns:wps="http://schemas.microsoft.com/office/word/2010/wordprocessingShape" mc:Ignorable="w14 w15 w16se w16cid w16 w16cex w16sdtdh wp14">
   <w:tbl>
     <w:tblPr>
       <w:tblStyle w:val="Tablaconcuadrcula1"/>
@@ -3643,8 +3624,18 @@
 </w:hdr>
 </file>
 
+<file path=word/header3.xml><?xml version="1.0" encoding="utf-8"?>
+<w:hdr xmlns:wpc="http://schemas.microsoft.com/office/word/2010/wordprocessingCanvas" xmlns:cx="http://schemas.microsoft.com/office/drawing/2014/chartex" xmlns:cx1="http://schemas.microsoft.com/office/drawing/2015/9/8/chartex" xmlns:cx2="http://schemas.microsoft.com/office/drawing/2015/10/21/chartex" xmlns:cx3="http://schemas.microsoft.com/office/drawing/2016/5/9/chartex" xmlns:cx4="http://schemas.microsoft.com/office/drawing/2016/5/10/chartex" xmlns:cx5="http://schemas.microsoft.com/office/drawing/2016/5/11/chartex" xmlns:cx6="http://schemas.microsoft.com/office/drawing/2016/5/12/chartex" xmlns:cx7="http://schemas.microsoft.com/office/drawing/2016/5/13/chartex" xmlns:cx8="http://schemas.microsoft.com/office/drawing/2016/5/14/chartex" xmlns:mc="http://schemas.openxmlformats.org/markup-compatibility/2006" xmlns:aink="http://schemas.microsoft.com/office/drawing/2016/ink" xmlns:am3d="http://schemas.microsoft.com/office/drawing/2017/model3d" xmlns:o="urn:schemas-microsoft-com:office:office" xmlns:r="http://schemas.openxmlformats.org/officeDocument/2006/relationships" xmlns:m="http://schemas.openxmlformats.org/officeDocument/2006/math" xmlns:v="urn:schemas-microsoft-com:vml" xmlns:wp14="http://schemas.microsoft.com/office/word/2010/wordprocessingDrawing" xmlns:wp="http://schemas.openxmlformats.org/drawingml/2006/wordprocessingDrawing" xmlns:w10="urn:schemas-microsoft-com:office:word" xmlns:w="http://schemas.openxmlformats.org/wordprocessingml/2006/main" xmlns:w14="http://schemas.microsoft.com/office/word/2010/wordml" xmlns:w15="http://schemas.microsoft.com/office/word/2012/wordml" xmlns:w16cex="http://schemas.microsoft.com/office/word/2018/wordml/cex" xmlns:w16cid="http://schemas.microsoft.com/office/word/2016/wordml/cid" xmlns:w16="http://schemas.microsoft.com/office/word/2018/wordml" xmlns:w16sdtdh="http://schemas.microsoft.com/office/word/2020/wordml/sdtdatahash" xmlns:w16se="http://schemas.microsoft.com/office/word/2015/wordml/symex" xmlns:wpg="http://schemas.microsoft.com/office/word/2010/wordprocessingGroup" xmlns:wpi="http://schemas.microsoft.com/office/word/2010/wordprocessingInk" xmlns:wne="http://schemas.microsoft.com/office/word/2006/wordml" xmlns:wps="http://schemas.microsoft.com/office/word/2010/wordprocessingShape" mc:Ignorable="w14 w15 w16se w16cid w16 w16cex w16sdtdh wp14">
+  <w:p>
+    <w:pPr>
+      <w:pStyle w:val="Encabezado"/>
+    </w:pPr>
+  </w:p>
+</w:hdr>
+</file>
+
 <file path=word/numbering.xml><?xml version="1.0" encoding="utf-8"?>
-<w:numbering xmlns:wpc="http://schemas.microsoft.com/office/word/2010/wordprocessingCanvas" xmlns:cx="http://schemas.microsoft.com/office/drawing/2014/chartex" xmlns:mc="http://schemas.openxmlformats.org/markup-compatibility/2006" xmlns:o="urn:schemas-microsoft-com:office:office" xmlns:r="http://schemas.openxmlformats.org/officeDocument/2006/relationships" xmlns:m="http://schemas.openxmlformats.org/officeDocument/2006/math" xmlns:v="urn:schemas-microsoft-com:vml" xmlns:wp14="http://schemas.microsoft.com/office/word/2010/wordprocessingDrawing" xmlns:wp="http://schemas.openxmlformats.org/drawingml/2006/wordprocessingDrawing" xmlns:w10="urn:schemas-microsoft-com:office:word" xmlns:w="http://schemas.openxmlformats.org/wordprocessingml/2006/main" xmlns:w14="http://schemas.microsoft.com/office/word/2010/wordml" xmlns:w15="http://schemas.microsoft.com/office/word/2012/wordml" xmlns:w16se="http://schemas.microsoft.com/office/word/2015/wordml/symex" xmlns:wpg="http://schemas.microsoft.com/office/word/2010/wordprocessingGroup" xmlns:wpi="http://schemas.microsoft.com/office/word/2010/wordprocessingInk" xmlns:wne="http://schemas.microsoft.com/office/word/2006/wordml" xmlns:wps="http://schemas.microsoft.com/office/word/2010/wordprocessingShape" mc:Ignorable="w14 w15 w16se wp14">
+<w:numbering xmlns:wpc="http://schemas.microsoft.com/office/word/2010/wordprocessingCanvas" xmlns:cx="http://schemas.microsoft.com/office/drawing/2014/chartex" xmlns:cx1="http://schemas.microsoft.com/office/drawing/2015/9/8/chartex" xmlns:cx2="http://schemas.microsoft.com/office/drawing/2015/10/21/chartex" xmlns:cx3="http://schemas.microsoft.com/office/drawing/2016/5/9/chartex" xmlns:cx4="http://schemas.microsoft.com/office/drawing/2016/5/10/chartex" xmlns:cx5="http://schemas.microsoft.com/office/drawing/2016/5/11/chartex" xmlns:cx6="http://schemas.microsoft.com/office/drawing/2016/5/12/chartex" xmlns:cx7="http://schemas.microsoft.com/office/drawing/2016/5/13/chartex" xmlns:cx8="http://schemas.microsoft.com/office/drawing/2016/5/14/chartex" xmlns:mc="http://schemas.openxmlformats.org/markup-compatibility/2006" xmlns:aink="http://schemas.microsoft.com/office/drawing/2016/ink" xmlns:am3d="http://schemas.microsoft.com/office/drawing/2017/model3d" xmlns:o="urn:schemas-microsoft-com:office:office" xmlns:r="http://schemas.openxmlformats.org/officeDocument/2006/relationships" xmlns:m="http://schemas.openxmlformats.org/officeDocument/2006/math" xmlns:v="urn:schemas-microsoft-com:vml" xmlns:wp14="http://schemas.microsoft.com/office/word/2010/wordprocessingDrawing" xmlns:wp="http://schemas.openxmlformats.org/drawingml/2006/wordprocessingDrawing" xmlns:w10="urn:schemas-microsoft-com:office:word" xmlns:w="http://schemas.openxmlformats.org/wordprocessingml/2006/main" xmlns:w14="http://schemas.microsoft.com/office/word/2010/wordml" xmlns:w15="http://schemas.microsoft.com/office/word/2012/wordml" xmlns:w16cex="http://schemas.microsoft.com/office/word/2018/wordml/cex" xmlns:w16cid="http://schemas.microsoft.com/office/word/2016/wordml/cid" xmlns:w16="http://schemas.microsoft.com/office/word/2018/wordml" xmlns:w16sdtdh="http://schemas.microsoft.com/office/word/2020/wordml/sdtdatahash" xmlns:w16se="http://schemas.microsoft.com/office/word/2015/wordml/symex" xmlns:wpg="http://schemas.microsoft.com/office/word/2010/wordprocessingGroup" xmlns:wpi="http://schemas.microsoft.com/office/word/2010/wordprocessingInk" xmlns:wne="http://schemas.microsoft.com/office/word/2006/wordml" xmlns:wps="http://schemas.microsoft.com/office/word/2010/wordprocessingShape" mc:Ignorable="w14 w15 w16se w16cid w16 w16cex w16sdtdh wp14">
   <w:abstractNum w:abstractNumId="0" w15:restartNumberingAfterBreak="0">
     <w:nsid w:val="2FFD4C7F"/>
     <w:multiLevelType w:val="multilevel"/>
@@ -3773,7 +3764,7 @@
 </file>
 
 <file path=word/styles.xml><?xml version="1.0" encoding="utf-8"?>
-<w:styles xmlns:mc="http://schemas.openxmlformats.org/markup-compatibility/2006" xmlns:r="http://schemas.openxmlformats.org/officeDocument/2006/relationships" xmlns:w="http://schemas.openxmlformats.org/wordprocessingml/2006/main" xmlns:w14="http://schemas.microsoft.com/office/word/2010/wordml" xmlns:w15="http://schemas.microsoft.com/office/word/2012/wordml" xmlns:w16se="http://schemas.microsoft.com/office/word/2015/wordml/symex" mc:Ignorable="w14 w15 w16se">
+<w:styles xmlns:mc="http://schemas.openxmlformats.org/markup-compatibility/2006" xmlns:r="http://schemas.openxmlformats.org/officeDocument/2006/relationships" xmlns:w="http://schemas.openxmlformats.org/wordprocessingml/2006/main" xmlns:w14="http://schemas.microsoft.com/office/word/2010/wordml" xmlns:w15="http://schemas.microsoft.com/office/word/2012/wordml" xmlns:w16cex="http://schemas.microsoft.com/office/word/2018/wordml/cex" xmlns:w16cid="http://schemas.microsoft.com/office/word/2016/wordml/cid" xmlns:w16="http://schemas.microsoft.com/office/word/2018/wordml" xmlns:w16sdtdh="http://schemas.microsoft.com/office/word/2020/wordml/sdtdatahash" xmlns:w16se="http://schemas.microsoft.com/office/word/2015/wordml/symex" mc:Ignorable="w14 w15 w16se w16cid w16 w16cex w16sdtdh">
   <w:docDefaults>
     <w:rPrDefault>
       <w:rPr>
@@ -3785,7 +3776,7 @@
     </w:rPrDefault>
     <w:pPrDefault/>
   </w:docDefaults>
-  <w:latentStyles w:defLockedState="0" w:defUIPriority="99" w:defSemiHidden="0" w:defUnhideWhenUsed="0" w:defQFormat="0" w:count="371">
+  <w:latentStyles w:defLockedState="0" w:defUIPriority="99" w:defSemiHidden="0" w:defUnhideWhenUsed="0" w:defQFormat="0" w:count="376">
     <w:lsdException w:name="Normal" w:uiPriority="0" w:qFormat="1"/>
     <w:lsdException w:name="heading 1" w:uiPriority="9" w:qFormat="1"/>
     <w:lsdException w:name="heading 2" w:semiHidden="1" w:uiPriority="9" w:unhideWhenUsed="1" w:qFormat="1"/>
@@ -3891,7 +3882,6 @@
     <w:lsdException w:name="HTML Sample" w:semiHidden="1" w:unhideWhenUsed="1"/>
     <w:lsdException w:name="HTML Typewriter" w:semiHidden="1" w:unhideWhenUsed="1"/>
     <w:lsdException w:name="HTML Variable" w:semiHidden="1" w:unhideWhenUsed="1"/>
-    <w:lsdException w:name="Normal Table" w:semiHidden="1" w:unhideWhenUsed="1"/>
     <w:lsdException w:name="annotation subject" w:semiHidden="1" w:unhideWhenUsed="1"/>
     <w:lsdException w:name="No List" w:semiHidden="1" w:unhideWhenUsed="1"/>
     <w:lsdException w:name="Outline List 1" w:semiHidden="1" w:unhideWhenUsed="1"/>
@@ -3934,11 +3924,8 @@
     <w:lsdException w:name="Table Contemporary" w:semiHidden="1" w:unhideWhenUsed="1"/>
     <w:lsdException w:name="Table Elegant" w:semiHidden="1" w:unhideWhenUsed="1"/>
     <w:lsdException w:name="Table Professional" w:semiHidden="1" w:unhideWhenUsed="1"/>
-    <w:lsdException w:name="Table Subtle 1" w:semiHidden="1" w:unhideWhenUsed="1"/>
     <w:lsdException w:name="Table Subtle 2" w:semiHidden="1" w:unhideWhenUsed="1"/>
     <w:lsdException w:name="Table Web 1" w:semiHidden="1" w:unhideWhenUsed="1"/>
-    <w:lsdException w:name="Table Web 2" w:semiHidden="1" w:unhideWhenUsed="1"/>
-    <w:lsdException w:name="Table Web 3" w:semiHidden="1" w:unhideWhenUsed="1"/>
     <w:lsdException w:name="Balloon Text" w:semiHidden="1" w:unhideWhenUsed="1"/>
     <w:lsdException w:name="Table Grid" w:uiPriority="39"/>
     <w:lsdException w:name="Table Theme" w:semiHidden="1" w:unhideWhenUsed="1"/>
@@ -4157,6 +4144,11 @@
     <w:lsdException w:name="List Table 5 Dark Accent 6" w:uiPriority="50"/>
     <w:lsdException w:name="List Table 6 Colorful Accent 6" w:uiPriority="51"/>
     <w:lsdException w:name="List Table 7 Colorful Accent 6" w:uiPriority="52"/>
+    <w:lsdException w:name="Mention" w:semiHidden="1" w:unhideWhenUsed="1"/>
+    <w:lsdException w:name="Smart Hyperlink" w:semiHidden="1" w:unhideWhenUsed="1"/>
+    <w:lsdException w:name="Hashtag" w:semiHidden="1" w:unhideWhenUsed="1"/>
+    <w:lsdException w:name="Unresolved Mention" w:semiHidden="1" w:unhideWhenUsed="1"/>
+    <w:lsdException w:name="Smart Link" w:semiHidden="1" w:unhideWhenUsed="1"/>
   </w:latentStyles>
   <w:style w:type="paragraph" w:default="1" w:styleId="Normal">
     <w:name w:val="Normal"/>
@@ -4759,9 +4751,12 @@
 </file>
 
 <file path=customXml/item1.xml><?xml version="1.0" encoding="utf-8"?>
-<p:properties xmlns:p="http://schemas.microsoft.com/office/2006/metadata/properties" xmlns:xsi="http://www.w3.org/2001/XMLSchema-instance" xmlns:pc="http://schemas.microsoft.com/office/infopath/2007/PartnerControls">
-  <documentManagement/>
-</p:properties>
+<?mso-contentType ?>
+<FormTemplates xmlns="http://schemas.microsoft.com/sharepoint/v3/contenttype/forms">
+  <Display>DocumentLibraryForm</Display>
+  <Edit>DocumentLibraryForm</Edit>
+  <New>DocumentLibraryForm</New>
+</FormTemplates>
 </file>
 
 <file path=customXml/item2.xml><?xml version="1.0" encoding="utf-8"?>
@@ -4897,26 +4892,15 @@
 </file>
 
 <file path=customXml/item3.xml><?xml version="1.0" encoding="utf-8"?>
-<?mso-contentType ?>
-<FormTemplates xmlns="http://schemas.microsoft.com/sharepoint/v3/contenttype/forms">
-  <Display>DocumentLibraryForm</Display>
-  <Edit>DocumentLibraryForm</Edit>
-  <New>DocumentLibraryForm</New>
-</FormTemplates>
+<p:properties xmlns:p="http://schemas.microsoft.com/office/2006/metadata/properties" xmlns:xsi="http://www.w3.org/2001/XMLSchema-instance" xmlns:pc="http://schemas.microsoft.com/office/infopath/2007/PartnerControls">
+  <documentManagement/>
+</p:properties>
 </file>
 
 <file path=customXml/itemProps1.xml><?xml version="1.0" encoding="utf-8"?>
-<ds:datastoreItem xmlns:ds="http://schemas.openxmlformats.org/officeDocument/2006/customXml" ds:itemID="{46CA5683-AF87-4E40-B841-2E23A3B52406}">
+<ds:datastoreItem xmlns:ds="http://schemas.openxmlformats.org/officeDocument/2006/customXml" ds:itemID="{D51C61E4-DB75-4684-AD25-71F546404E96}">
   <ds:schemaRefs>
-    <ds:schemaRef ds:uri="http://purl.org/dc/terms/"/>
-    <ds:schemaRef ds:uri="http://purl.org/dc/elements/1.1/"/>
-    <ds:schemaRef ds:uri="http://schemas.openxmlformats.org/package/2006/metadata/core-properties"/>
-    <ds:schemaRef ds:uri="http://www.w3.org/XML/1998/namespace"/>
-    <ds:schemaRef ds:uri="http://schemas.microsoft.com/office/2006/metadata/properties"/>
-    <ds:schemaRef ds:uri="http://schemas.microsoft.com/office/2006/documentManagement/types"/>
-    <ds:schemaRef ds:uri="http://purl.org/dc/dcmitype/"/>
-    <ds:schemaRef ds:uri="http://schemas.microsoft.com/office/infopath/2007/PartnerControls"/>
-    <ds:schemaRef ds:uri="126e8a1c-9ea9-435a-ac89-d06c80d62e30"/>
+    <ds:schemaRef ds:uri="http://schemas.microsoft.com/sharepoint/v3/contenttype/forms"/>
   </ds:schemaRefs>
 </ds:datastoreItem>
 </file>
@@ -4940,9 +4924,17 @@
 </file>
 
 <file path=customXml/itemProps3.xml><?xml version="1.0" encoding="utf-8"?>
-<ds:datastoreItem xmlns:ds="http://schemas.openxmlformats.org/officeDocument/2006/customXml" ds:itemID="{D51C61E4-DB75-4684-AD25-71F546404E96}">
+<ds:datastoreItem xmlns:ds="http://schemas.openxmlformats.org/officeDocument/2006/customXml" ds:itemID="{46CA5683-AF87-4E40-B841-2E23A3B52406}">
   <ds:schemaRefs>
-    <ds:schemaRef ds:uri="http://schemas.microsoft.com/sharepoint/v3/contenttype/forms"/>
+    <ds:schemaRef ds:uri="http://purl.org/dc/terms/"/>
+    <ds:schemaRef ds:uri="http://purl.org/dc/elements/1.1/"/>
+    <ds:schemaRef ds:uri="http://schemas.openxmlformats.org/package/2006/metadata/core-properties"/>
+    <ds:schemaRef ds:uri="http://www.w3.org/XML/1998/namespace"/>
+    <ds:schemaRef ds:uri="http://schemas.microsoft.com/office/2006/metadata/properties"/>
+    <ds:schemaRef ds:uri="http://schemas.microsoft.com/office/2006/documentManagement/types"/>
+    <ds:schemaRef ds:uri="http://purl.org/dc/dcmitype/"/>
+    <ds:schemaRef ds:uri="http://schemas.microsoft.com/office/infopath/2007/PartnerControls"/>
+    <ds:schemaRef ds:uri="126e8a1c-9ea9-435a-ac89-d06c80d62e30"/>
   </ds:schemaRefs>
 </ds:datastoreItem>
 </file>
</xml_diff>

<commit_message>
Se agrega Epica 7, Correción: documentos, Ortografia, propuesta de valor + Documentación
</commit_message>
<xml_diff>
--- a/Fase 2/Evidencias Grupales/2.4_GuiaEstudiante_Fase 2_DesarrolloProyecto APT.docx
+++ b/Fase 2/Evidencias Grupales/2.4_GuiaEstudiante_Fase 2_DesarrolloProyecto APT.docx
@@ -552,6 +552,32 @@
           </w:tcPr>
           <w:p>
             <w:pPr>
+              <w:rPr>
+                <w:lang w:eastAsia="es-CL"/>
+              </w:rPr>
+            </w:pPr>
+            <w:r>
+              <w:rPr>
+                <w:lang w:eastAsia="es-CL"/>
+              </w:rPr>
+              <w:t>Durante la Fase 2 se avanzó de forma significativa en la construcción del framework CACHAI-QA. Se consolidó la arquitectura Plug &amp; Play con un único archivo de configuración (.env) para ingresar la URL objetivo; se implementó el web crawler, capaz de recorrer el sitio y mapear e indexar automáticamente sus enlaces, imágenes, formularios y botones (con modos de escaneo rápido, completo y personalizado); y se desarrolló el generador de pruebas genéricas en lenguaje natural (Gherkin/BDD), que adapta el volumen de aserciones a la cantidad de elementos descubiertos y utiliza esperas dinámicas para evitar falsos positivos.</w:t>
+            </w:r>
+          </w:p>
+          <w:p>
+            <w:pPr>
+              <w:rPr>
+                <w:lang w:eastAsia="es-CL"/>
+              </w:rPr>
+            </w:pPr>
+            <w:r>
+              <w:rPr>
+                <w:lang w:eastAsia="es-CL"/>
+              </w:rPr>
+              <w:t>Además, se construyó un panel web local (dashboard) que permite visualizar, revisar y eliminar los escaneos y sus resultados, y un sitio de ejemplo (demo) con errores controlados para validar el sistema sin depender de Internet. En paralelo, se completaron los documentos de gestión ágil de la fase: Product Vision, Product Backlog (HU-001 a HU-008), Definition of Done y el Documento de Diseño basado en UML.</w:t>
+            </w:r>
+          </w:p>
+          <w:p>
+            <w:pPr>
               <w:jc w:val="both"/>
               <w:rPr>
                 <w:rFonts w:ascii="Calibri" w:hAnsi="Calibri" w:cs="Arial"/>
@@ -564,159 +590,9 @@
             </w:pPr>
             <w:r>
               <w:rPr>
-                <w:rFonts w:ascii="Calibri" w:hAnsi="Calibri" w:cs="Arial"/>
-                <w:i/>
-                <w:color w:val="548DD4"/>
-                <w:sz w:val="20"/>
-                <w:szCs w:val="20"/>
-                <w:lang w:eastAsia="es-CL"/>
-              </w:rPr>
-              <w:t xml:space="preserve">En esta </w:t>
-            </w:r>
-            <w:r>
-              <w:rPr>
-                <w:rFonts w:ascii="Calibri" w:hAnsi="Calibri" w:cs="Arial"/>
-                <w:i/>
-                <w:color w:val="548DD4"/>
-                <w:sz w:val="20"/>
-                <w:szCs w:val="20"/>
-                <w:lang w:eastAsia="es-CL"/>
-              </w:rPr>
-              <w:t>sección</w:t>
-            </w:r>
-            <w:r>
-              <w:rPr>
-                <w:rFonts w:ascii="Calibri" w:hAnsi="Calibri" w:cs="Arial"/>
-                <w:i/>
-                <w:color w:val="548DD4"/>
-                <w:sz w:val="20"/>
-                <w:szCs w:val="20"/>
-                <w:lang w:eastAsia="es-CL"/>
-              </w:rPr>
-              <w:t xml:space="preserve"> deberá</w:t>
-            </w:r>
-            <w:r>
-              <w:rPr>
-                <w:rFonts w:ascii="Calibri" w:hAnsi="Calibri" w:cs="Arial"/>
-                <w:i/>
-                <w:color w:val="548DD4"/>
-                <w:sz w:val="20"/>
-                <w:szCs w:val="20"/>
-                <w:lang w:eastAsia="es-CL"/>
-              </w:rPr>
-              <w:t>s</w:t>
-            </w:r>
-            <w:r>
-              <w:rPr>
-                <w:rFonts w:ascii="Calibri" w:hAnsi="Calibri" w:cs="Arial"/>
-                <w:i/>
-                <w:color w:val="548DD4"/>
-                <w:sz w:val="20"/>
-                <w:szCs w:val="20"/>
-                <w:lang w:eastAsia="es-CL"/>
-              </w:rPr>
-              <w:t xml:space="preserve"> </w:t>
-            </w:r>
-            <w:r>
-              <w:rPr>
-                <w:rFonts w:ascii="Calibri" w:hAnsi="Calibri" w:cs="Arial"/>
-                <w:i/>
-                <w:color w:val="548DD4"/>
-                <w:sz w:val="20"/>
-                <w:szCs w:val="20"/>
-                <w:lang w:eastAsia="es-CL"/>
-              </w:rPr>
-              <w:t xml:space="preserve">realizar un resumen de los avances que has realizado en tu proyecto APT. </w:t>
-            </w:r>
-            <w:r>
-              <w:rPr>
-                <w:rFonts w:ascii="Calibri" w:hAnsi="Calibri" w:cs="Arial"/>
-                <w:i/>
-                <w:color w:val="548DD4"/>
-                <w:sz w:val="20"/>
-                <w:szCs w:val="20"/>
-                <w:lang w:eastAsia="es-CL"/>
-              </w:rPr>
-              <w:t xml:space="preserve">Relata </w:t>
-            </w:r>
-            <w:r>
-              <w:rPr>
-                <w:rFonts w:ascii="Calibri" w:hAnsi="Calibri" w:cs="Arial"/>
-                <w:i/>
-                <w:color w:val="548DD4"/>
-                <w:sz w:val="20"/>
-                <w:szCs w:val="20"/>
-                <w:lang w:eastAsia="es-CL"/>
-              </w:rPr>
-              <w:t xml:space="preserve">brevemente </w:t>
-            </w:r>
-            <w:r>
-              <w:rPr>
-                <w:rFonts w:ascii="Calibri" w:hAnsi="Calibri" w:cs="Arial"/>
-                <w:i/>
-                <w:color w:val="548DD4"/>
-                <w:sz w:val="20"/>
-                <w:szCs w:val="20"/>
-                <w:lang w:eastAsia="es-CL"/>
-              </w:rPr>
-              <w:t xml:space="preserve">qué </w:t>
-            </w:r>
-            <w:r>
-              <w:rPr>
-                <w:rFonts w:ascii="Calibri" w:hAnsi="Calibri" w:cs="Arial"/>
-                <w:i/>
-                <w:color w:val="548DD4"/>
-                <w:sz w:val="20"/>
-                <w:szCs w:val="20"/>
-                <w:lang w:eastAsia="es-CL"/>
-              </w:rPr>
-              <w:t xml:space="preserve">actividades </w:t>
-            </w:r>
-            <w:r>
-              <w:rPr>
-                <w:rFonts w:ascii="Calibri" w:hAnsi="Calibri" w:cs="Arial"/>
-                <w:i/>
-                <w:color w:val="548DD4"/>
-                <w:sz w:val="20"/>
-                <w:szCs w:val="20"/>
-                <w:lang w:eastAsia="es-CL"/>
-              </w:rPr>
-              <w:t>del proyecto has llevado a cabo y qué objetivos específicos has cumplido hasta el minuto y de qué manera.</w:t>
-            </w:r>
-          </w:p>
-          <w:p>
-            <w:pPr>
-              <w:jc w:val="both"/>
-              <w:rPr>
-                <w:rFonts w:ascii="Calibri" w:hAnsi="Calibri" w:cs="Arial"/>
-                <w:i/>
-                <w:color w:val="548DD4"/>
-                <w:sz w:val="20"/>
-                <w:szCs w:val="20"/>
-                <w:lang w:eastAsia="es-CL"/>
-              </w:rPr>
-            </w:pPr>
-            <w:r>
-              <w:rPr>
-                <w:rFonts w:ascii="Calibri" w:hAnsi="Calibri" w:cs="Arial"/>
-                <w:i/>
-                <w:color w:val="548DD4"/>
-                <w:sz w:val="20"/>
-                <w:szCs w:val="20"/>
-                <w:lang w:eastAsia="es-CL"/>
-              </w:rPr>
-              <w:t>En caso de que hayas realizado ajustes a los objetivos o la metodología</w:t>
-            </w:r>
-            <w:r>
-              <w:rPr>
-                <w:rFonts w:ascii="Calibri" w:hAnsi="Calibri" w:cs="Arial"/>
-                <w:i/>
-                <w:color w:val="548DD4"/>
-                <w:sz w:val="20"/>
-                <w:szCs w:val="20"/>
-                <w:lang w:eastAsia="es-CL"/>
-              </w:rPr>
-              <w:t>, debes incluir dichos apartados nuevamente en este informe, señalando cuáles son dichos ajustes.</w:t>
+                <w:lang w:eastAsia="es-CL"/>
+              </w:rPr>
+              <w:t>Los objetivos específicos cumplidos hasta el minuto corresponden a la configuración inicial y recepción de la URL, al escaneo y lectura automática de la página, la ejecución automática de las pruebas sobre el sitio demo está en curso, y la ejecución en la nube con BrowserStack y la estabilización final quedan planificadas para el cierre.</w:t>
             </w:r>
           </w:p>
         </w:tc>
@@ -766,14 +642,16 @@
             </w:pPr>
             <w:r>
               <w:rPr>
-                <w:rFonts w:ascii="Calibri" w:hAnsi="Calibri" w:cs="Arial"/>
-                <w:i/>
-                <w:color w:val="548DD4"/>
-                <w:sz w:val="20"/>
-                <w:szCs w:val="20"/>
-                <w:lang w:eastAsia="es-CL"/>
-              </w:rPr>
-              <w:t>Opcional en caso de ajuste</w:t>
+                <w:lang w:eastAsia="es-CL"/>
+              </w:rPr>
+              <w:t xml:space="preserve">No se modificaron los objetivos generales ni específicos definidos en la Fase 1: estos se mantienen vigentes. El único ajuste fue de priorización, ya que se decidió asegurar primero la documentación ágil (visión, backlog y Definition </w:t>
+            </w:r>
+            <w:r>
+              <w:rPr>
+                <w:lang w:eastAsia="es-CL"/>
+              </w:rPr>
+              <w:lastRenderedPageBreak/>
+              <w:t>of Done) y el diseño UML antes de continuar con el desarrollo, para evitar los retrasos que la documentación generó en la fase anterior.</w:t>
             </w:r>
           </w:p>
         </w:tc>
@@ -799,6 +677,7 @@
                 <w:rFonts w:ascii="Calibri" w:hAnsi="Calibri"/>
                 <w:color w:val="1F3864" w:themeColor="accent1" w:themeShade="80"/>
               </w:rPr>
+              <w:lastRenderedPageBreak/>
               <w:t>Metodología</w:t>
             </w:r>
           </w:p>
@@ -822,14 +701,9 @@
             </w:pPr>
             <w:r>
               <w:rPr>
-                <w:rFonts w:ascii="Calibri" w:hAnsi="Calibri" w:cs="Arial"/>
-                <w:i/>
-                <w:color w:val="548DD4"/>
-                <w:sz w:val="20"/>
-                <w:szCs w:val="20"/>
-                <w:lang w:eastAsia="es-CL"/>
-              </w:rPr>
-              <w:t>Opcional en caso de ajuste</w:t>
+                <w:lang w:eastAsia="es-CL"/>
+              </w:rPr>
+              <w:t>Se mantiene la metodología ágil Scrum con entregables iterativos e incrementales. Se organizó el trabajo mediante un Product Backlog priorizado (HU-001 a HU-008) dimensionado con Poker Planning.</w:t>
             </w:r>
           </w:p>
         </w:tc>
@@ -866,9 +740,44 @@
           </w:tcPr>
           <w:p>
             <w:pPr>
+              <w:rPr>
+                <w:lang w:eastAsia="es-CL"/>
+              </w:rPr>
+            </w:pPr>
+            <w:r>
+              <w:rPr>
+                <w:lang w:eastAsia="es-CL"/>
+              </w:rPr>
+              <w:t xml:space="preserve">Las evidencias de avance que se presentan son: </w:t>
+            </w:r>
+            <w:r>
+              <w:rPr>
+                <w:lang w:eastAsia="es-CL"/>
+              </w:rPr>
+              <w:br/>
+              <w:t xml:space="preserve">1- El video demostrativo del escaneo automático de una página web </w:t>
+            </w:r>
+            <w:r>
+              <w:rPr>
+                <w:lang w:eastAsia="es-CL"/>
+              </w:rPr>
+              <w:br/>
+              <w:t>2- El panel web operativo con los resultados de los escaneos. Y</w:t>
+            </w:r>
+            <w:r>
+              <w:rPr>
+                <w:lang w:eastAsia="es-CL"/>
+              </w:rPr>
+              <w:br/>
+              <w:t>3- Los documentos de gestión y diseño (Product Vision, Product Backlog, Definition of Done y Documento de Diseño UML). El enlace a los videos está disponible en el archivo Drive-Videos de la carpeta de evidencias de la fase.</w:t>
+            </w:r>
+          </w:p>
+          <w:p>
+            <w:pPr>
               <w:jc w:val="both"/>
               <w:rPr>
                 <w:rFonts w:ascii="Calibri" w:hAnsi="Calibri" w:cs="Arial"/>
+                <w:b/>
                 <w:i/>
                 <w:color w:val="548DD4"/>
                 <w:sz w:val="20"/>
@@ -878,360 +787,9 @@
             </w:pPr>
             <w:r>
               <w:rPr>
-                <w:rFonts w:ascii="Calibri" w:hAnsi="Calibri" w:cs="Arial"/>
-                <w:i/>
-                <w:color w:val="548DD4"/>
-                <w:sz w:val="20"/>
-                <w:szCs w:val="20"/>
-                <w:lang w:eastAsia="es-CL"/>
-              </w:rPr>
-              <w:t>Describe la</w:t>
-            </w:r>
-            <w:r>
-              <w:rPr>
-                <w:rFonts w:ascii="Calibri" w:hAnsi="Calibri" w:cs="Arial"/>
-                <w:i/>
-                <w:color w:val="548DD4"/>
-                <w:sz w:val="20"/>
-                <w:szCs w:val="20"/>
-                <w:lang w:eastAsia="es-CL"/>
-              </w:rPr>
-              <w:t>(</w:t>
-            </w:r>
-            <w:r>
-              <w:rPr>
-                <w:rFonts w:ascii="Calibri" w:hAnsi="Calibri" w:cs="Arial"/>
-                <w:i/>
-                <w:color w:val="548DD4"/>
-                <w:sz w:val="20"/>
-                <w:szCs w:val="20"/>
-                <w:lang w:eastAsia="es-CL"/>
-              </w:rPr>
-              <w:t>s</w:t>
-            </w:r>
-            <w:r>
-              <w:rPr>
-                <w:rFonts w:ascii="Calibri" w:hAnsi="Calibri" w:cs="Arial"/>
-                <w:i/>
-                <w:color w:val="548DD4"/>
-                <w:sz w:val="20"/>
-                <w:szCs w:val="20"/>
-                <w:lang w:eastAsia="es-CL"/>
-              </w:rPr>
-              <w:t>)</w:t>
-            </w:r>
-            <w:r>
-              <w:rPr>
-                <w:rFonts w:ascii="Calibri" w:hAnsi="Calibri" w:cs="Arial"/>
-                <w:i/>
-                <w:color w:val="548DD4"/>
-                <w:sz w:val="20"/>
-                <w:szCs w:val="20"/>
-                <w:lang w:eastAsia="es-CL"/>
-              </w:rPr>
-              <w:t xml:space="preserve"> evidencia</w:t>
-            </w:r>
-            <w:r>
-              <w:rPr>
-                <w:rFonts w:ascii="Calibri" w:hAnsi="Calibri" w:cs="Arial"/>
-                <w:i/>
-                <w:color w:val="548DD4"/>
-                <w:sz w:val="20"/>
-                <w:szCs w:val="20"/>
-                <w:lang w:eastAsia="es-CL"/>
-              </w:rPr>
-              <w:t>(</w:t>
-            </w:r>
-            <w:r>
-              <w:rPr>
-                <w:rFonts w:ascii="Calibri" w:hAnsi="Calibri" w:cs="Arial"/>
-                <w:i/>
-                <w:color w:val="548DD4"/>
-                <w:sz w:val="20"/>
-                <w:szCs w:val="20"/>
-                <w:lang w:eastAsia="es-CL"/>
-              </w:rPr>
-              <w:t>s</w:t>
-            </w:r>
-            <w:r>
-              <w:rPr>
-                <w:rFonts w:ascii="Calibri" w:hAnsi="Calibri" w:cs="Arial"/>
-                <w:i/>
-                <w:color w:val="548DD4"/>
-                <w:sz w:val="20"/>
-                <w:szCs w:val="20"/>
-                <w:lang w:eastAsia="es-CL"/>
-              </w:rPr>
-              <w:t>)</w:t>
-            </w:r>
-            <w:r>
-              <w:rPr>
-                <w:rFonts w:ascii="Calibri" w:hAnsi="Calibri" w:cs="Arial"/>
-                <w:i/>
-                <w:color w:val="548DD4"/>
-                <w:sz w:val="20"/>
-                <w:szCs w:val="20"/>
-                <w:lang w:eastAsia="es-CL"/>
-              </w:rPr>
-              <w:t xml:space="preserve"> que </w:t>
-            </w:r>
-            <w:r>
-              <w:rPr>
-                <w:rFonts w:ascii="Calibri" w:hAnsi="Calibri" w:cs="Arial"/>
-                <w:i/>
-                <w:color w:val="548DD4"/>
-                <w:sz w:val="20"/>
-                <w:szCs w:val="20"/>
-                <w:lang w:eastAsia="es-CL"/>
-              </w:rPr>
-              <w:t xml:space="preserve">presentarás en este informe de avance y justifica </w:t>
-            </w:r>
-            <w:r>
-              <w:rPr>
-                <w:rFonts w:ascii="Calibri" w:hAnsi="Calibri" w:cs="Arial"/>
-                <w:i/>
-                <w:color w:val="548DD4"/>
-                <w:sz w:val="20"/>
-                <w:szCs w:val="20"/>
-                <w:lang w:eastAsia="es-CL"/>
-              </w:rPr>
-              <w:t xml:space="preserve">de qué manera </w:t>
-            </w:r>
-            <w:r>
-              <w:rPr>
-                <w:rFonts w:ascii="Calibri" w:hAnsi="Calibri" w:cs="Arial"/>
-                <w:i/>
-                <w:color w:val="548DD4"/>
-                <w:sz w:val="20"/>
-                <w:szCs w:val="20"/>
-                <w:lang w:eastAsia="es-CL"/>
-              </w:rPr>
-              <w:t>esta</w:t>
-            </w:r>
-            <w:r>
-              <w:rPr>
-                <w:rFonts w:ascii="Calibri" w:hAnsi="Calibri" w:cs="Arial"/>
-                <w:i/>
-                <w:color w:val="548DD4"/>
-                <w:sz w:val="20"/>
-                <w:szCs w:val="20"/>
-                <w:lang w:eastAsia="es-CL"/>
-              </w:rPr>
-              <w:t>(</w:t>
-            </w:r>
-            <w:r>
-              <w:rPr>
-                <w:rFonts w:ascii="Calibri" w:hAnsi="Calibri" w:cs="Arial"/>
-                <w:i/>
-                <w:color w:val="548DD4"/>
-                <w:sz w:val="20"/>
-                <w:szCs w:val="20"/>
-                <w:lang w:eastAsia="es-CL"/>
-              </w:rPr>
-              <w:t>s</w:t>
-            </w:r>
-            <w:r>
-              <w:rPr>
-                <w:rFonts w:ascii="Calibri" w:hAnsi="Calibri" w:cs="Arial"/>
-                <w:i/>
-                <w:color w:val="548DD4"/>
-                <w:sz w:val="20"/>
-                <w:szCs w:val="20"/>
-                <w:lang w:eastAsia="es-CL"/>
-              </w:rPr>
-              <w:t>)</w:t>
-            </w:r>
-            <w:r>
-              <w:rPr>
-                <w:rFonts w:ascii="Calibri" w:hAnsi="Calibri" w:cs="Arial"/>
-                <w:i/>
-                <w:color w:val="548DD4"/>
-                <w:sz w:val="20"/>
-                <w:szCs w:val="20"/>
-                <w:lang w:eastAsia="es-CL"/>
-              </w:rPr>
-              <w:t xml:space="preserve"> evidencia</w:t>
-            </w:r>
-            <w:r>
-              <w:rPr>
-                <w:rFonts w:ascii="Calibri" w:hAnsi="Calibri" w:cs="Arial"/>
-                <w:i/>
-                <w:color w:val="548DD4"/>
-                <w:sz w:val="20"/>
-                <w:szCs w:val="20"/>
-                <w:lang w:eastAsia="es-CL"/>
-              </w:rPr>
-              <w:t>(</w:t>
-            </w:r>
-            <w:r>
-              <w:rPr>
-                <w:rFonts w:ascii="Calibri" w:hAnsi="Calibri" w:cs="Arial"/>
-                <w:i/>
-                <w:color w:val="548DD4"/>
-                <w:sz w:val="20"/>
-                <w:szCs w:val="20"/>
-                <w:lang w:eastAsia="es-CL"/>
-              </w:rPr>
-              <w:t>s</w:t>
-            </w:r>
-            <w:r>
-              <w:rPr>
-                <w:rFonts w:ascii="Calibri" w:hAnsi="Calibri" w:cs="Arial"/>
-                <w:i/>
-                <w:color w:val="548DD4"/>
-                <w:sz w:val="20"/>
-                <w:szCs w:val="20"/>
-                <w:lang w:eastAsia="es-CL"/>
-              </w:rPr>
-              <w:t>)</w:t>
-            </w:r>
-            <w:r>
-              <w:rPr>
-                <w:rFonts w:ascii="Calibri" w:hAnsi="Calibri" w:cs="Arial"/>
-                <w:i/>
-                <w:color w:val="548DD4"/>
-                <w:sz w:val="20"/>
-                <w:szCs w:val="20"/>
-                <w:lang w:eastAsia="es-CL"/>
-              </w:rPr>
-              <w:t xml:space="preserve"> </w:t>
-            </w:r>
-            <w:r>
-              <w:rPr>
-                <w:rFonts w:ascii="Calibri" w:hAnsi="Calibri" w:cs="Arial"/>
-                <w:i/>
-                <w:color w:val="548DD4"/>
-                <w:sz w:val="20"/>
-                <w:szCs w:val="20"/>
-                <w:lang w:eastAsia="es-CL"/>
-              </w:rPr>
-              <w:t xml:space="preserve">permite(n) </w:t>
-            </w:r>
-            <w:r>
-              <w:rPr>
-                <w:rFonts w:ascii="Calibri" w:hAnsi="Calibri" w:cs="Arial"/>
-                <w:i/>
-                <w:color w:val="548DD4"/>
-                <w:sz w:val="20"/>
-                <w:szCs w:val="20"/>
-                <w:lang w:eastAsia="es-CL"/>
-              </w:rPr>
-              <w:t>da</w:t>
-            </w:r>
-            <w:r>
-              <w:rPr>
-                <w:rFonts w:ascii="Calibri" w:hAnsi="Calibri" w:cs="Arial"/>
-                <w:i/>
-                <w:color w:val="548DD4"/>
-                <w:sz w:val="20"/>
-                <w:szCs w:val="20"/>
-                <w:lang w:eastAsia="es-CL"/>
-              </w:rPr>
-              <w:t>r</w:t>
-            </w:r>
-            <w:r>
-              <w:rPr>
-                <w:rFonts w:ascii="Calibri" w:hAnsi="Calibri" w:cs="Arial"/>
-                <w:i/>
-                <w:color w:val="548DD4"/>
-                <w:sz w:val="20"/>
-                <w:szCs w:val="20"/>
-                <w:lang w:eastAsia="es-CL"/>
-              </w:rPr>
-              <w:t xml:space="preserve"> cuenta del </w:t>
-            </w:r>
-            <w:r>
-              <w:rPr>
-                <w:rFonts w:ascii="Calibri" w:hAnsi="Calibri" w:cs="Arial"/>
-                <w:i/>
-                <w:color w:val="548DD4"/>
-                <w:sz w:val="20"/>
-                <w:szCs w:val="20"/>
-                <w:lang w:eastAsia="es-CL"/>
-              </w:rPr>
-              <w:t>desarrollo</w:t>
-            </w:r>
-            <w:r>
-              <w:rPr>
-                <w:rFonts w:ascii="Calibri" w:hAnsi="Calibri" w:cs="Arial"/>
-                <w:i/>
-                <w:color w:val="548DD4"/>
-                <w:sz w:val="20"/>
-                <w:szCs w:val="20"/>
-                <w:lang w:eastAsia="es-CL"/>
-              </w:rPr>
-              <w:t xml:space="preserve"> </w:t>
-            </w:r>
-            <w:r>
-              <w:rPr>
-                <w:rFonts w:ascii="Calibri" w:hAnsi="Calibri" w:cs="Arial"/>
-                <w:i/>
-                <w:color w:val="548DD4"/>
-                <w:sz w:val="20"/>
-                <w:szCs w:val="20"/>
-                <w:lang w:eastAsia="es-CL"/>
-              </w:rPr>
-              <w:t>del proyecto.</w:t>
-            </w:r>
-          </w:p>
-          <w:p>
-            <w:pPr>
-              <w:jc w:val="both"/>
-              <w:rPr>
-                <w:rFonts w:ascii="Calibri" w:hAnsi="Calibri" w:cs="Arial"/>
-                <w:i/>
-                <w:color w:val="548DD4"/>
-                <w:sz w:val="20"/>
-                <w:szCs w:val="20"/>
-                <w:lang w:eastAsia="es-CL"/>
-              </w:rPr>
-            </w:pPr>
-            <w:r>
-              <w:rPr>
-                <w:rFonts w:ascii="Calibri" w:hAnsi="Calibri" w:cs="Arial"/>
-                <w:i/>
-                <w:color w:val="548DD4"/>
-                <w:sz w:val="20"/>
-                <w:szCs w:val="20"/>
-                <w:lang w:eastAsia="es-CL"/>
-              </w:rPr>
-              <w:t xml:space="preserve">En caso de ser pertinente </w:t>
-            </w:r>
-            <w:r>
-              <w:rPr>
-                <w:rFonts w:ascii="Calibri" w:hAnsi="Calibri" w:cs="Arial"/>
-                <w:i/>
-                <w:color w:val="548DD4"/>
-                <w:sz w:val="20"/>
-                <w:szCs w:val="20"/>
-                <w:lang w:eastAsia="es-CL"/>
-              </w:rPr>
-              <w:t>explica cómo resguardaste la calidad de tu Proyecto APT a partir de aspectos propios de tu disciplina (correcta aplicación de metodologías, actividades, herramientas, recursos propios, etc.).</w:t>
-            </w:r>
-          </w:p>
-          <w:p>
-            <w:pPr>
-              <w:jc w:val="both"/>
-              <w:rPr>
-                <w:rFonts w:ascii="Calibri" w:hAnsi="Calibri" w:cs="Arial"/>
-                <w:b/>
-                <w:i/>
-                <w:color w:val="548DD4"/>
-                <w:sz w:val="20"/>
-                <w:szCs w:val="20"/>
-                <w:lang w:eastAsia="es-CL"/>
-              </w:rPr>
-            </w:pPr>
-            <w:r>
-              <w:rPr>
-                <w:rFonts w:ascii="Calibri" w:hAnsi="Calibri" w:cs="Arial"/>
-                <w:i/>
-                <w:color w:val="548DD4"/>
-                <w:sz w:val="20"/>
-                <w:szCs w:val="20"/>
-                <w:lang w:eastAsia="es-CL"/>
-              </w:rPr>
-              <w:t>En este apartado adjunta la(s) evidencia(s) seleccionada(s) para ser evaluada por el docente.</w:t>
+                <w:lang w:eastAsia="es-CL"/>
+              </w:rPr>
+              <w:t>Estas evidencias dan cuenta del desarrollo del proyecto porque muestran de manera tangible cada etapa del flujo Plug &amp; Play: el ingreso de la URL, el escaneo del sitio, la generación de las pruebas genéricas y la visualización de los resultados.</w:t>
             </w:r>
           </w:p>
         </w:tc>
@@ -1280,7 +838,6 @@
                 <w:sz w:val="28"/>
                 <w:szCs w:val="28"/>
               </w:rPr>
-              <w:lastRenderedPageBreak/>
               <w:t>2</w:t>
             </w:r>
             <w:r>
@@ -1376,14 +933,14 @@
         <w:tblLook w:val="04A0" w:firstRow="1" w:lastRow="0" w:firstColumn="1" w:lastColumn="0" w:noHBand="0" w:noVBand="1"/>
       </w:tblPr>
       <w:tblGrid>
-        <w:gridCol w:w="1328"/>
-        <w:gridCol w:w="1077"/>
-        <w:gridCol w:w="1276"/>
+        <w:gridCol w:w="1271"/>
+        <w:gridCol w:w="1559"/>
+        <w:gridCol w:w="851"/>
         <w:gridCol w:w="1276"/>
         <w:gridCol w:w="1275"/>
         <w:gridCol w:w="1276"/>
-        <w:gridCol w:w="1418"/>
-        <w:gridCol w:w="850"/>
+        <w:gridCol w:w="1276"/>
+        <w:gridCol w:w="992"/>
       </w:tblGrid>
       <w:tr>
         <w:trPr>
@@ -1410,6 +967,7 @@
                 <w:color w:val="1F3864" w:themeColor="accent1" w:themeShade="80"/>
                 <w:sz w:val="18"/>
               </w:rPr>
+              <w:lastRenderedPageBreak/>
               <w:t>Plan de Trabajo</w:t>
             </w:r>
           </w:p>
@@ -1421,7 +979,7 @@
         </w:trPr>
         <w:tc>
           <w:tcPr>
-            <w:tcW w:w="1328" w:type="dxa"/>
+            <w:tcW w:w="1271" w:type="dxa"/>
             <w:vAlign w:val="center"/>
           </w:tcPr>
           <w:p>
@@ -1461,7 +1019,7 @@
         </w:tc>
         <w:tc>
           <w:tcPr>
-            <w:tcW w:w="1077" w:type="dxa"/>
+            <w:tcW w:w="1559" w:type="dxa"/>
             <w:vAlign w:val="center"/>
           </w:tcPr>
           <w:p>
@@ -1480,6 +1038,30 @@
                 <w:sz w:val="18"/>
               </w:rPr>
               <w:t>Actividades</w:t>
+            </w:r>
+          </w:p>
+        </w:tc>
+        <w:tc>
+          <w:tcPr>
+            <w:tcW w:w="851" w:type="dxa"/>
+            <w:vAlign w:val="center"/>
+          </w:tcPr>
+          <w:p>
+            <w:pPr>
+              <w:jc w:val="center"/>
+              <w:rPr>
+                <w:rFonts w:ascii="Calibri" w:hAnsi="Calibri"/>
+                <w:color w:val="1F3864" w:themeColor="accent1" w:themeShade="80"/>
+                <w:sz w:val="18"/>
+              </w:rPr>
+            </w:pPr>
+            <w:r>
+              <w:rPr>
+                <w:rFonts w:ascii="Calibri" w:hAnsi="Calibri"/>
+                <w:color w:val="1F3864" w:themeColor="accent1" w:themeShade="80"/>
+                <w:sz w:val="18"/>
+              </w:rPr>
+              <w:t>Recursos</w:t>
             </w:r>
           </w:p>
         </w:tc>
@@ -1503,7 +1085,40 @@
                 <w:color w:val="1F3864" w:themeColor="accent1" w:themeShade="80"/>
                 <w:sz w:val="18"/>
               </w:rPr>
-              <w:t>Recursos</w:t>
+              <w:t>Duración de la actividad</w:t>
+            </w:r>
+          </w:p>
+        </w:tc>
+        <w:tc>
+          <w:tcPr>
+            <w:tcW w:w="1275" w:type="dxa"/>
+            <w:vAlign w:val="center"/>
+          </w:tcPr>
+          <w:p>
+            <w:pPr>
+              <w:jc w:val="center"/>
+              <w:rPr>
+                <w:rFonts w:ascii="Calibri" w:hAnsi="Calibri"/>
+                <w:color w:val="1F3864" w:themeColor="accent1" w:themeShade="80"/>
+                <w:sz w:val="18"/>
+              </w:rPr>
+            </w:pPr>
+            <w:r>
+              <w:rPr>
+                <w:rFonts w:ascii="Calibri" w:hAnsi="Calibri"/>
+                <w:color w:val="1F3864" w:themeColor="accent1" w:themeShade="80"/>
+                <w:sz w:val="18"/>
+              </w:rPr>
+              <w:t>Responsable</w:t>
+            </w:r>
+            <w:r>
+              <w:rPr>
+                <w:rStyle w:val="Refdenotaalpie"/>
+                <w:rFonts w:ascii="Calibri" w:hAnsi="Calibri"/>
+                <w:color w:val="1F3864" w:themeColor="accent1" w:themeShade="80"/>
+                <w:sz w:val="18"/>
+              </w:rPr>
+              <w:footnoteReference w:id="1"/>
             </w:r>
           </w:p>
         </w:tc>
@@ -1527,40 +1142,7 @@
                 <w:color w:val="1F3864" w:themeColor="accent1" w:themeShade="80"/>
                 <w:sz w:val="18"/>
               </w:rPr>
-              <w:t>Duración de la actividad</w:t>
-            </w:r>
-          </w:p>
-        </w:tc>
-        <w:tc>
-          <w:tcPr>
-            <w:tcW w:w="1275" w:type="dxa"/>
-            <w:vAlign w:val="center"/>
-          </w:tcPr>
-          <w:p>
-            <w:pPr>
-              <w:jc w:val="center"/>
-              <w:rPr>
-                <w:rFonts w:ascii="Calibri" w:hAnsi="Calibri"/>
-                <w:color w:val="1F3864" w:themeColor="accent1" w:themeShade="80"/>
-                <w:sz w:val="18"/>
-              </w:rPr>
-            </w:pPr>
-            <w:r>
-              <w:rPr>
-                <w:rFonts w:ascii="Calibri" w:hAnsi="Calibri"/>
-                <w:color w:val="1F3864" w:themeColor="accent1" w:themeShade="80"/>
-                <w:sz w:val="18"/>
-              </w:rPr>
-              <w:t>Responsable</w:t>
-            </w:r>
-            <w:r>
-              <w:rPr>
-                <w:rStyle w:val="Refdenotaalpie"/>
-                <w:rFonts w:ascii="Calibri" w:hAnsi="Calibri"/>
-                <w:color w:val="1F3864" w:themeColor="accent1" w:themeShade="80"/>
-                <w:sz w:val="18"/>
-              </w:rPr>
-              <w:footnoteReference w:id="1"/>
+              <w:t>Observaciones</w:t>
             </w:r>
           </w:p>
         </w:tc>
@@ -1584,37 +1166,13 @@
                 <w:color w:val="1F3864" w:themeColor="accent1" w:themeShade="80"/>
                 <w:sz w:val="18"/>
               </w:rPr>
-              <w:t>Observaciones</w:t>
-            </w:r>
-          </w:p>
-        </w:tc>
-        <w:tc>
-          <w:tcPr>
-            <w:tcW w:w="1418" w:type="dxa"/>
-            <w:vAlign w:val="center"/>
-          </w:tcPr>
-          <w:p>
-            <w:pPr>
-              <w:jc w:val="center"/>
-              <w:rPr>
-                <w:rFonts w:ascii="Calibri" w:hAnsi="Calibri"/>
-                <w:color w:val="1F3864" w:themeColor="accent1" w:themeShade="80"/>
-                <w:sz w:val="18"/>
-              </w:rPr>
-            </w:pPr>
-            <w:r>
-              <w:rPr>
-                <w:rFonts w:ascii="Calibri" w:hAnsi="Calibri"/>
-                <w:color w:val="1F3864" w:themeColor="accent1" w:themeShade="80"/>
-                <w:sz w:val="18"/>
-              </w:rPr>
               <w:t>Estado de avance</w:t>
             </w:r>
           </w:p>
         </w:tc>
         <w:tc>
           <w:tcPr>
-            <w:tcW w:w="850" w:type="dxa"/>
+            <w:tcW w:w="992" w:type="dxa"/>
             <w:vAlign w:val="center"/>
           </w:tcPr>
           <w:p>
@@ -1651,7 +1209,7 @@
         </w:trPr>
         <w:tc>
           <w:tcPr>
-            <w:tcW w:w="1328" w:type="dxa"/>
+            <w:tcW w:w="1271" w:type="dxa"/>
           </w:tcPr>
           <w:p>
             <w:pPr>
@@ -1721,7 +1279,7 @@
         </w:tc>
         <w:tc>
           <w:tcPr>
-            <w:tcW w:w="1077" w:type="dxa"/>
+            <w:tcW w:w="1559" w:type="dxa"/>
           </w:tcPr>
           <w:p>
             <w:pPr>
@@ -1794,6 +1352,54 @@
         </w:tc>
         <w:tc>
           <w:tcPr>
+            <w:tcW w:w="851" w:type="dxa"/>
+          </w:tcPr>
+          <w:p>
+            <w:pPr>
+              <w:jc w:val="both"/>
+              <w:rPr>
+                <w:b/>
+                <w:sz w:val="18"/>
+                <w:szCs w:val="24"/>
+              </w:rPr>
+            </w:pPr>
+            <w:r>
+              <w:rPr>
+                <w:rFonts w:ascii="Calibri" w:hAnsi="Calibri" w:cs="Arial"/>
+                <w:i/>
+                <w:color w:val="548DD4"/>
+                <w:sz w:val="18"/>
+                <w:szCs w:val="20"/>
+                <w:lang w:eastAsia="es-CL"/>
+              </w:rPr>
+              <w:t>Nombra los recursos necesarios para llevar a cabo las actividades</w:t>
+            </w:r>
+            <w:r>
+              <w:rPr>
+                <w:rFonts w:ascii="Calibri" w:hAnsi="Calibri" w:cs="Arial"/>
+                <w:i/>
+                <w:color w:val="548DD4"/>
+                <w:sz w:val="18"/>
+                <w:szCs w:val="20"/>
+                <w:lang w:eastAsia="es-CL"/>
+              </w:rPr>
+              <w:t xml:space="preserve"> </w:t>
+            </w:r>
+            <w:r>
+              <w:rPr>
+                <w:rFonts w:ascii="Calibri" w:hAnsi="Calibri" w:cs="Arial"/>
+                <w:i/>
+                <w:color w:val="548DD4"/>
+                <w:sz w:val="18"/>
+                <w:szCs w:val="20"/>
+                <w:lang w:eastAsia="es-CL"/>
+              </w:rPr>
+              <w:t>definidas.</w:t>
+            </w:r>
+          </w:p>
+        </w:tc>
+        <w:tc>
+          <w:tcPr>
             <w:tcW w:w="1276" w:type="dxa"/>
           </w:tcPr>
           <w:p>
@@ -1814,29 +1420,113 @@
                 <w:szCs w:val="20"/>
                 <w:lang w:eastAsia="es-CL"/>
               </w:rPr>
-              <w:t>Nombra los recursos necesarios para llevar a cabo las actividades</w:t>
-            </w:r>
-            <w:r>
-              <w:rPr>
-                <w:rFonts w:ascii="Calibri" w:hAnsi="Calibri" w:cs="Arial"/>
-                <w:i/>
-                <w:color w:val="548DD4"/>
-                <w:sz w:val="18"/>
-                <w:szCs w:val="20"/>
-                <w:lang w:eastAsia="es-CL"/>
-              </w:rPr>
-              <w:t xml:space="preserve"> </w:t>
-            </w:r>
-            <w:r>
-              <w:rPr>
-                <w:rFonts w:ascii="Calibri" w:hAnsi="Calibri" w:cs="Arial"/>
-                <w:i/>
-                <w:color w:val="548DD4"/>
-                <w:sz w:val="18"/>
-                <w:szCs w:val="20"/>
-                <w:lang w:eastAsia="es-CL"/>
-              </w:rPr>
-              <w:t>definidas.</w:t>
+              <w:t xml:space="preserve">Señala </w:t>
+            </w:r>
+            <w:r>
+              <w:rPr>
+                <w:rFonts w:ascii="Calibri" w:hAnsi="Calibri" w:cs="Arial"/>
+                <w:i/>
+                <w:color w:val="548DD4"/>
+                <w:sz w:val="18"/>
+                <w:szCs w:val="20"/>
+                <w:lang w:eastAsia="es-CL"/>
+              </w:rPr>
+              <w:t>la duración de</w:t>
+            </w:r>
+            <w:r>
+              <w:rPr>
+                <w:rFonts w:ascii="Calibri" w:hAnsi="Calibri" w:cs="Arial"/>
+                <w:i/>
+                <w:color w:val="548DD4"/>
+                <w:sz w:val="18"/>
+                <w:szCs w:val="20"/>
+                <w:lang w:eastAsia="es-CL"/>
+              </w:rPr>
+              <w:t xml:space="preserve"> cada </w:t>
+            </w:r>
+            <w:r>
+              <w:rPr>
+                <w:rFonts w:ascii="Calibri" w:hAnsi="Calibri" w:cs="Arial"/>
+                <w:i/>
+                <w:color w:val="548DD4"/>
+                <w:sz w:val="18"/>
+                <w:szCs w:val="20"/>
+                <w:lang w:eastAsia="es-CL"/>
+              </w:rPr>
+              <w:t>actividad</w:t>
+            </w:r>
+            <w:r>
+              <w:rPr>
+                <w:rFonts w:ascii="Calibri" w:hAnsi="Calibri" w:cs="Arial"/>
+                <w:i/>
+                <w:color w:val="548DD4"/>
+                <w:sz w:val="18"/>
+                <w:szCs w:val="20"/>
+                <w:lang w:eastAsia="es-CL"/>
+              </w:rPr>
+              <w:t xml:space="preserve">. </w:t>
+            </w:r>
+          </w:p>
+        </w:tc>
+        <w:tc>
+          <w:tcPr>
+            <w:tcW w:w="1275" w:type="dxa"/>
+          </w:tcPr>
+          <w:p>
+            <w:pPr>
+              <w:jc w:val="both"/>
+              <w:rPr>
+                <w:rFonts w:ascii="Calibri" w:hAnsi="Calibri" w:cs="Arial"/>
+                <w:i/>
+                <w:color w:val="548DD4"/>
+                <w:sz w:val="18"/>
+                <w:szCs w:val="20"/>
+                <w:lang w:eastAsia="es-CL"/>
+              </w:rPr>
+            </w:pPr>
+            <w:r>
+              <w:rPr>
+                <w:rFonts w:ascii="Calibri" w:hAnsi="Calibri" w:cs="Arial"/>
+                <w:i/>
+                <w:color w:val="548DD4"/>
+                <w:sz w:val="18"/>
+                <w:szCs w:val="20"/>
+                <w:lang w:eastAsia="es-CL"/>
+              </w:rPr>
+              <w:t xml:space="preserve">Escribe el </w:t>
+            </w:r>
+            <w:r>
+              <w:rPr>
+                <w:rFonts w:ascii="Calibri" w:hAnsi="Calibri" w:cs="Arial"/>
+                <w:i/>
+                <w:color w:val="548DD4"/>
+                <w:sz w:val="18"/>
+                <w:szCs w:val="20"/>
+                <w:lang w:eastAsia="es-CL"/>
+              </w:rPr>
+              <w:t xml:space="preserve">nombre del integrante del equipo responsable de </w:t>
+            </w:r>
+            <w:r>
+              <w:rPr>
+                <w:rFonts w:ascii="Calibri" w:hAnsi="Calibri" w:cs="Arial"/>
+                <w:i/>
+                <w:color w:val="548DD4"/>
+                <w:sz w:val="18"/>
+                <w:szCs w:val="20"/>
+                <w:lang w:eastAsia="es-CL"/>
+              </w:rPr>
+              <w:t xml:space="preserve">cada </w:t>
+            </w:r>
+            <w:r>
+              <w:rPr>
+                <w:rFonts w:ascii="Calibri" w:hAnsi="Calibri" w:cs="Arial"/>
+                <w:i/>
+                <w:color w:val="548DD4"/>
+                <w:sz w:val="18"/>
+                <w:szCs w:val="20"/>
+                <w:lang w:eastAsia="es-CL"/>
+              </w:rPr>
+              <w:t>actividad.</w:t>
             </w:r>
           </w:p>
         </w:tc>
@@ -1848,9 +1538,12 @@
             <w:pPr>
               <w:jc w:val="both"/>
               <w:rPr>
-                <w:b/>
-                <w:sz w:val="18"/>
-                <w:szCs w:val="24"/>
+                <w:rFonts w:ascii="Calibri" w:hAnsi="Calibri" w:cs="Arial"/>
+                <w:i/>
+                <w:color w:val="548DD4"/>
+                <w:sz w:val="18"/>
+                <w:szCs w:val="20"/>
+                <w:lang w:eastAsia="es-CL"/>
               </w:rPr>
             </w:pPr>
             <w:r>
@@ -1873,170 +1566,35 @@
                 <w:szCs w:val="20"/>
                 <w:lang w:eastAsia="es-CL"/>
               </w:rPr>
-              <w:t>la duración de</w:t>
-            </w:r>
-            <w:r>
-              <w:rPr>
-                <w:rFonts w:ascii="Calibri" w:hAnsi="Calibri" w:cs="Arial"/>
-                <w:i/>
-                <w:color w:val="548DD4"/>
-                <w:sz w:val="18"/>
-                <w:szCs w:val="20"/>
-                <w:lang w:eastAsia="es-CL"/>
-              </w:rPr>
-              <w:t xml:space="preserve"> cada </w:t>
-            </w:r>
-            <w:r>
-              <w:rPr>
-                <w:rFonts w:ascii="Calibri" w:hAnsi="Calibri" w:cs="Arial"/>
-                <w:i/>
-                <w:color w:val="548DD4"/>
-                <w:sz w:val="18"/>
-                <w:szCs w:val="20"/>
-                <w:lang w:eastAsia="es-CL"/>
-              </w:rPr>
-              <w:t>actividad</w:t>
-            </w:r>
-            <w:r>
-              <w:rPr>
-                <w:rFonts w:ascii="Calibri" w:hAnsi="Calibri" w:cs="Arial"/>
-                <w:i/>
-                <w:color w:val="548DD4"/>
-                <w:sz w:val="18"/>
-                <w:szCs w:val="20"/>
-                <w:lang w:eastAsia="es-CL"/>
-              </w:rPr>
-              <w:t xml:space="preserve">. </w:t>
-            </w:r>
-          </w:p>
-        </w:tc>
-        <w:tc>
-          <w:tcPr>
-            <w:tcW w:w="1275" w:type="dxa"/>
-          </w:tcPr>
-          <w:p>
-            <w:pPr>
-              <w:jc w:val="both"/>
-              <w:rPr>
-                <w:rFonts w:ascii="Calibri" w:hAnsi="Calibri" w:cs="Arial"/>
-                <w:i/>
-                <w:color w:val="548DD4"/>
-                <w:sz w:val="18"/>
-                <w:szCs w:val="20"/>
-                <w:lang w:eastAsia="es-CL"/>
-              </w:rPr>
-            </w:pPr>
-            <w:r>
-              <w:rPr>
-                <w:rFonts w:ascii="Calibri" w:hAnsi="Calibri" w:cs="Arial"/>
-                <w:i/>
-                <w:color w:val="548DD4"/>
-                <w:sz w:val="18"/>
-                <w:szCs w:val="20"/>
-                <w:lang w:eastAsia="es-CL"/>
-              </w:rPr>
-              <w:t xml:space="preserve">Escribe el </w:t>
-            </w:r>
-            <w:r>
-              <w:rPr>
-                <w:rFonts w:ascii="Calibri" w:hAnsi="Calibri" w:cs="Arial"/>
-                <w:i/>
-                <w:color w:val="548DD4"/>
-                <w:sz w:val="18"/>
-                <w:szCs w:val="20"/>
-                <w:lang w:eastAsia="es-CL"/>
-              </w:rPr>
-              <w:t xml:space="preserve">nombre del integrante del equipo responsable de </w:t>
-            </w:r>
-            <w:r>
-              <w:rPr>
-                <w:rFonts w:ascii="Calibri" w:hAnsi="Calibri" w:cs="Arial"/>
-                <w:i/>
-                <w:color w:val="548DD4"/>
-                <w:sz w:val="18"/>
-                <w:szCs w:val="20"/>
-                <w:lang w:eastAsia="es-CL"/>
-              </w:rPr>
-              <w:t xml:space="preserve">cada </w:t>
-            </w:r>
-            <w:r>
-              <w:rPr>
-                <w:rFonts w:ascii="Calibri" w:hAnsi="Calibri" w:cs="Arial"/>
-                <w:i/>
-                <w:color w:val="548DD4"/>
-                <w:sz w:val="18"/>
-                <w:szCs w:val="20"/>
-                <w:lang w:eastAsia="es-CL"/>
-              </w:rPr>
-              <w:t>actividad.</w:t>
+              <w:t>las dific</w:t>
+            </w:r>
+            <w:r>
+              <w:rPr>
+                <w:rFonts w:ascii="Calibri" w:hAnsi="Calibri" w:cs="Arial"/>
+                <w:i/>
+                <w:color w:val="548DD4"/>
+                <w:sz w:val="18"/>
+                <w:szCs w:val="20"/>
+                <w:lang w:eastAsia="es-CL"/>
+              </w:rPr>
+              <w:t>ult</w:t>
+            </w:r>
+            <w:r>
+              <w:rPr>
+                <w:rFonts w:ascii="Calibri" w:hAnsi="Calibri" w:cs="Arial"/>
+                <w:i/>
+                <w:color w:val="548DD4"/>
+                <w:sz w:val="18"/>
+                <w:szCs w:val="20"/>
+                <w:lang w:eastAsia="es-CL"/>
+              </w:rPr>
+              <w:t>ades o facilitadores que se podrían presentar durante la ejecución de cada una de las actividades propuestas.</w:t>
             </w:r>
           </w:p>
         </w:tc>
         <w:tc>
           <w:tcPr>
             <w:tcW w:w="1276" w:type="dxa"/>
-          </w:tcPr>
-          <w:p>
-            <w:pPr>
-              <w:jc w:val="both"/>
-              <w:rPr>
-                <w:rFonts w:ascii="Calibri" w:hAnsi="Calibri" w:cs="Arial"/>
-                <w:i/>
-                <w:color w:val="548DD4"/>
-                <w:sz w:val="18"/>
-                <w:szCs w:val="20"/>
-                <w:lang w:eastAsia="es-CL"/>
-              </w:rPr>
-            </w:pPr>
-            <w:r>
-              <w:rPr>
-                <w:rFonts w:ascii="Calibri" w:hAnsi="Calibri" w:cs="Arial"/>
-                <w:i/>
-                <w:color w:val="548DD4"/>
-                <w:sz w:val="18"/>
-                <w:szCs w:val="20"/>
-                <w:lang w:eastAsia="es-CL"/>
-              </w:rPr>
-              <w:t xml:space="preserve">Señala </w:t>
-            </w:r>
-            <w:r>
-              <w:rPr>
-                <w:rFonts w:ascii="Calibri" w:hAnsi="Calibri" w:cs="Arial"/>
-                <w:i/>
-                <w:color w:val="548DD4"/>
-                <w:sz w:val="18"/>
-                <w:szCs w:val="20"/>
-                <w:lang w:eastAsia="es-CL"/>
-              </w:rPr>
-              <w:t>las dific</w:t>
-            </w:r>
-            <w:r>
-              <w:rPr>
-                <w:rFonts w:ascii="Calibri" w:hAnsi="Calibri" w:cs="Arial"/>
-                <w:i/>
-                <w:color w:val="548DD4"/>
-                <w:sz w:val="18"/>
-                <w:szCs w:val="20"/>
-                <w:lang w:eastAsia="es-CL"/>
-              </w:rPr>
-              <w:t>ult</w:t>
-            </w:r>
-            <w:r>
-              <w:rPr>
-                <w:rFonts w:ascii="Calibri" w:hAnsi="Calibri" w:cs="Arial"/>
-                <w:i/>
-                <w:color w:val="548DD4"/>
-                <w:sz w:val="18"/>
-                <w:szCs w:val="20"/>
-                <w:lang w:eastAsia="es-CL"/>
-              </w:rPr>
-              <w:t>ades o facilitadores que se podrían presentar durante la ejecución de cada una de las actividades propuestas.</w:t>
-            </w:r>
-          </w:p>
-        </w:tc>
-        <w:tc>
-          <w:tcPr>
-            <w:tcW w:w="1418" w:type="dxa"/>
           </w:tcPr>
           <w:p>
             <w:pPr>
@@ -2170,7 +1728,7 @@
         </w:tc>
         <w:tc>
           <w:tcPr>
-            <w:tcW w:w="850" w:type="dxa"/>
+            <w:tcW w:w="992" w:type="dxa"/>
           </w:tcPr>
           <w:p>
             <w:pPr>
@@ -2239,6 +1797,2162 @@
               </w:rPr>
               <w:t xml:space="preserve">do. </w:t>
             </w:r>
+          </w:p>
+        </w:tc>
+      </w:tr>
+      <w:tr>
+        <w:trPr>
+          <w:trHeight w:val="2410"/>
+        </w:trPr>
+        <w:tc>
+          <w:tcPr>
+            <w:tcW w:w="1271" w:type="dxa"/>
+          </w:tcPr>
+          <w:p>
+            <w:pPr>
+              <w:rPr>
+                <w:rFonts w:ascii="Calibri" w:hAnsi="Calibri" w:cs="Arial"/>
+                <w:iCs/>
+                <w:sz w:val="18"/>
+                <w:szCs w:val="20"/>
+                <w:lang w:eastAsia="es-CL"/>
+              </w:rPr>
+            </w:pPr>
+            <w:r>
+              <w:rPr>
+                <w:rFonts w:ascii="Calibri" w:hAnsi="Calibri" w:cs="Arial"/>
+                <w:iCs/>
+                <w:sz w:val="18"/>
+                <w:szCs w:val="20"/>
+                <w:lang w:eastAsia="es-CL"/>
+              </w:rPr>
+              <w:t>Diseño de pruebas de software</w:t>
+            </w:r>
+          </w:p>
+        </w:tc>
+        <w:tc>
+          <w:tcPr>
+            <w:tcW w:w="1559" w:type="dxa"/>
+          </w:tcPr>
+          <w:p>
+            <w:pPr>
+              <w:rPr>
+                <w:rFonts w:ascii="Calibri" w:hAnsi="Calibri" w:cs="Arial"/>
+                <w:iCs/>
+                <w:sz w:val="18"/>
+                <w:szCs w:val="20"/>
+                <w:lang w:eastAsia="es-CL"/>
+              </w:rPr>
+            </w:pPr>
+            <w:r>
+              <w:rPr>
+                <w:rFonts w:ascii="Calibri" w:hAnsi="Calibri" w:cs="Arial"/>
+                <w:iCs/>
+                <w:sz w:val="18"/>
+                <w:szCs w:val="20"/>
+                <w:lang w:eastAsia="es-CL"/>
+              </w:rPr>
+              <w:t>Definir la arquitectura, el alcance y la documentación ágil del framework (Plug &amp; Play)</w:t>
+            </w:r>
+          </w:p>
+        </w:tc>
+        <w:tc>
+          <w:tcPr>
+            <w:tcW w:w="851" w:type="dxa"/>
+          </w:tcPr>
+          <w:p>
+            <w:pPr>
+              <w:rPr>
+                <w:rFonts w:ascii="Calibri" w:hAnsi="Calibri" w:cs="Arial"/>
+                <w:iCs/>
+                <w:sz w:val="18"/>
+                <w:szCs w:val="20"/>
+                <w:lang w:eastAsia="es-CL"/>
+              </w:rPr>
+            </w:pPr>
+            <w:r>
+              <w:rPr>
+                <w:rFonts w:ascii="Calibri" w:hAnsi="Calibri" w:cs="Arial"/>
+                <w:iCs/>
+                <w:sz w:val="18"/>
+                <w:szCs w:val="20"/>
+                <w:lang w:eastAsia="es-CL"/>
+              </w:rPr>
+              <w:t>Reuniones de equipo, GitHub, estándar IEEE 830, plantillas DUOC</w:t>
+            </w:r>
+          </w:p>
+        </w:tc>
+        <w:tc>
+          <w:tcPr>
+            <w:tcW w:w="1276" w:type="dxa"/>
+          </w:tcPr>
+          <w:p>
+            <w:pPr>
+              <w:rPr>
+                <w:rFonts w:ascii="Calibri" w:hAnsi="Calibri" w:cs="Arial"/>
+                <w:iCs/>
+                <w:sz w:val="18"/>
+                <w:szCs w:val="20"/>
+                <w:lang w:eastAsia="es-CL"/>
+              </w:rPr>
+            </w:pPr>
+            <w:r>
+              <w:rPr>
+                <w:rFonts w:ascii="Calibri" w:hAnsi="Calibri" w:cs="Arial"/>
+                <w:iCs/>
+                <w:sz w:val="18"/>
+                <w:szCs w:val="20"/>
+                <w:lang w:eastAsia="es-CL"/>
+              </w:rPr>
+              <w:t>Semanas 5-6</w:t>
+            </w:r>
+          </w:p>
+        </w:tc>
+        <w:tc>
+          <w:tcPr>
+            <w:tcW w:w="1275" w:type="dxa"/>
+          </w:tcPr>
+          <w:p>
+            <w:pPr>
+              <w:rPr>
+                <w:rFonts w:ascii="Calibri" w:hAnsi="Calibri" w:cs="Arial"/>
+                <w:iCs/>
+                <w:sz w:val="18"/>
+                <w:szCs w:val="20"/>
+                <w:lang w:eastAsia="es-CL"/>
+              </w:rPr>
+            </w:pPr>
+            <w:r>
+              <w:rPr>
+                <w:rFonts w:ascii="Calibri" w:hAnsi="Calibri" w:cs="Arial"/>
+                <w:iCs/>
+                <w:sz w:val="18"/>
+                <w:szCs w:val="20"/>
+                <w:lang w:eastAsia="es-CL"/>
+              </w:rPr>
+              <w:t>Alex Mauricio Puebla Allendes</w:t>
+            </w:r>
+            <w:r>
+              <w:rPr>
+                <w:rFonts w:ascii="Calibri" w:hAnsi="Calibri" w:cs="Arial"/>
+                <w:iCs/>
+                <w:sz w:val="18"/>
+                <w:szCs w:val="20"/>
+                <w:lang w:eastAsia="es-CL"/>
+              </w:rPr>
+              <w:br/>
+              <w:t xml:space="preserve"> José Ignacio Valdivia Mendoza</w:t>
+            </w:r>
+          </w:p>
+        </w:tc>
+        <w:tc>
+          <w:tcPr>
+            <w:tcW w:w="1276" w:type="dxa"/>
+          </w:tcPr>
+          <w:p>
+            <w:pPr>
+              <w:rPr>
+                <w:rFonts w:ascii="Calibri" w:hAnsi="Calibri" w:cs="Arial"/>
+                <w:iCs/>
+                <w:sz w:val="18"/>
+                <w:szCs w:val="20"/>
+                <w:lang w:eastAsia="es-CL"/>
+              </w:rPr>
+            </w:pPr>
+            <w:r>
+              <w:rPr>
+                <w:rFonts w:ascii="Calibri" w:hAnsi="Calibri" w:cs="Arial"/>
+                <w:iCs/>
+                <w:sz w:val="18"/>
+                <w:szCs w:val="20"/>
+                <w:lang w:eastAsia="es-CL"/>
+              </w:rPr>
+              <w:t>Claridad del alcance</w:t>
+            </w:r>
+          </w:p>
+        </w:tc>
+        <w:tc>
+          <w:tcPr>
+            <w:tcW w:w="1276" w:type="dxa"/>
+          </w:tcPr>
+          <w:p>
+            <w:pPr>
+              <w:rPr>
+                <w:rFonts w:ascii="Calibri" w:hAnsi="Calibri" w:cs="Arial"/>
+                <w:iCs/>
+                <w:sz w:val="18"/>
+                <w:szCs w:val="20"/>
+                <w:lang w:eastAsia="es-CL"/>
+              </w:rPr>
+            </w:pPr>
+            <w:r>
+              <w:rPr>
+                <w:rFonts w:ascii="Calibri" w:hAnsi="Calibri" w:cs="Arial"/>
+                <w:iCs/>
+                <w:sz w:val="18"/>
+                <w:szCs w:val="20"/>
+                <w:lang w:eastAsia="es-CL"/>
+              </w:rPr>
+              <w:t>Completado</w:t>
+            </w:r>
+          </w:p>
+        </w:tc>
+        <w:tc>
+          <w:tcPr>
+            <w:tcW w:w="992" w:type="dxa"/>
+          </w:tcPr>
+          <w:p>
+            <w:pPr>
+              <w:rPr>
+                <w:rFonts w:ascii="Calibri" w:hAnsi="Calibri" w:cs="Arial"/>
+                <w:iCs/>
+                <w:sz w:val="18"/>
+                <w:szCs w:val="20"/>
+                <w:lang w:eastAsia="es-CL"/>
+              </w:rPr>
+            </w:pPr>
+            <w:r>
+              <w:rPr>
+                <w:rFonts w:ascii="Calibri" w:hAnsi="Calibri" w:cs="Arial"/>
+                <w:iCs/>
+                <w:sz w:val="18"/>
+                <w:szCs w:val="20"/>
+                <w:lang w:eastAsia="es-CL"/>
+              </w:rPr>
+              <w:t>Se priorizó la documentación antes que el código</w:t>
+            </w:r>
+          </w:p>
+        </w:tc>
+      </w:tr>
+      <w:tr>
+        <w:trPr>
+          <w:trHeight w:val="2410"/>
+        </w:trPr>
+        <w:tc>
+          <w:tcPr>
+            <w:tcW w:w="1271" w:type="dxa"/>
+          </w:tcPr>
+          <w:p>
+            <w:pPr>
+              <w:rPr>
+                <w:rFonts w:ascii="Calibri" w:hAnsi="Calibri" w:cs="Arial"/>
+                <w:iCs/>
+                <w:sz w:val="18"/>
+                <w:szCs w:val="20"/>
+                <w:lang w:eastAsia="es-CL"/>
+              </w:rPr>
+            </w:pPr>
+            <w:r>
+              <w:rPr>
+                <w:rFonts w:ascii="Calibri" w:hAnsi="Calibri" w:cs="Arial"/>
+                <w:iCs/>
+                <w:sz w:val="18"/>
+                <w:szCs w:val="20"/>
+                <w:lang w:eastAsia="es-CL"/>
+              </w:rPr>
+              <w:t>Programación de soluciones de software</w:t>
+            </w:r>
+          </w:p>
+        </w:tc>
+        <w:tc>
+          <w:tcPr>
+            <w:tcW w:w="1559" w:type="dxa"/>
+          </w:tcPr>
+          <w:p>
+            <w:pPr>
+              <w:rPr>
+                <w:rFonts w:ascii="Calibri" w:hAnsi="Calibri" w:cs="Arial"/>
+                <w:iCs/>
+                <w:sz w:val="18"/>
+                <w:szCs w:val="20"/>
+                <w:lang w:eastAsia="es-CL"/>
+              </w:rPr>
+            </w:pPr>
+            <w:r>
+              <w:rPr>
+                <w:rFonts w:ascii="Calibri" w:hAnsi="Calibri" w:cs="Arial"/>
+                <w:iCs/>
+                <w:sz w:val="18"/>
+                <w:szCs w:val="20"/>
+                <w:lang w:eastAsia="es-CL"/>
+              </w:rPr>
+              <w:t>Implementar el web crawler (escaneo e indexación del DOM: enlaces, imágenes, formularios y botones)</w:t>
+            </w:r>
+          </w:p>
+        </w:tc>
+        <w:tc>
+          <w:tcPr>
+            <w:tcW w:w="851" w:type="dxa"/>
+          </w:tcPr>
+          <w:p>
+            <w:pPr>
+              <w:rPr>
+                <w:rFonts w:ascii="Calibri" w:hAnsi="Calibri" w:cs="Arial"/>
+                <w:iCs/>
+                <w:sz w:val="18"/>
+                <w:szCs w:val="20"/>
+                <w:lang w:eastAsia="es-CL"/>
+              </w:rPr>
+            </w:pPr>
+            <w:r>
+              <w:rPr>
+                <w:rFonts w:ascii="Calibri" w:hAnsi="Calibri" w:cs="Arial"/>
+                <w:iCs/>
+                <w:sz w:val="18"/>
+                <w:szCs w:val="20"/>
+                <w:lang w:eastAsia="es-CL"/>
+              </w:rPr>
+              <w:t>Node.js, TypeScript, Playwright, VS Code</w:t>
+            </w:r>
+          </w:p>
+        </w:tc>
+        <w:tc>
+          <w:tcPr>
+            <w:tcW w:w="1276" w:type="dxa"/>
+          </w:tcPr>
+          <w:p>
+            <w:pPr>
+              <w:rPr>
+                <w:rFonts w:ascii="Calibri" w:hAnsi="Calibri" w:cs="Arial"/>
+                <w:iCs/>
+                <w:sz w:val="18"/>
+                <w:szCs w:val="20"/>
+                <w:lang w:eastAsia="es-CL"/>
+              </w:rPr>
+            </w:pPr>
+            <w:r>
+              <w:rPr>
+                <w:rFonts w:ascii="Calibri" w:hAnsi="Calibri" w:cs="Arial"/>
+                <w:iCs/>
+                <w:sz w:val="18"/>
+                <w:szCs w:val="20"/>
+                <w:lang w:eastAsia="es-CL"/>
+              </w:rPr>
+              <w:t>Semanas 6-8</w:t>
+            </w:r>
+          </w:p>
+        </w:tc>
+        <w:tc>
+          <w:tcPr>
+            <w:tcW w:w="1275" w:type="dxa"/>
+          </w:tcPr>
+          <w:p>
+            <w:pPr>
+              <w:rPr>
+                <w:rFonts w:ascii="Calibri" w:hAnsi="Calibri" w:cs="Arial"/>
+                <w:iCs/>
+                <w:sz w:val="18"/>
+                <w:szCs w:val="20"/>
+                <w:lang w:eastAsia="es-CL"/>
+              </w:rPr>
+            </w:pPr>
+            <w:r>
+              <w:rPr>
+                <w:rFonts w:ascii="Calibri" w:hAnsi="Calibri" w:cs="Arial"/>
+                <w:iCs/>
+                <w:sz w:val="18"/>
+                <w:szCs w:val="20"/>
+                <w:lang w:eastAsia="es-CL"/>
+              </w:rPr>
+              <w:t>Alex Mauricio Puebla Allendes</w:t>
+            </w:r>
+          </w:p>
+        </w:tc>
+        <w:tc>
+          <w:tcPr>
+            <w:tcW w:w="1276" w:type="dxa"/>
+          </w:tcPr>
+          <w:p>
+            <w:pPr>
+              <w:rPr>
+                <w:rFonts w:ascii="Calibri" w:hAnsi="Calibri" w:cs="Arial"/>
+                <w:iCs/>
+                <w:sz w:val="18"/>
+                <w:szCs w:val="20"/>
+                <w:lang w:eastAsia="es-CL"/>
+              </w:rPr>
+            </w:pPr>
+            <w:r>
+              <w:rPr>
+                <w:rFonts w:ascii="Calibri" w:hAnsi="Calibri" w:cs="Arial"/>
+                <w:iCs/>
+                <w:sz w:val="18"/>
+                <w:szCs w:val="20"/>
+                <w:lang w:eastAsia="es-CL"/>
+              </w:rPr>
+              <w:t>Curva de aprendizaje del crawler</w:t>
+            </w:r>
+          </w:p>
+        </w:tc>
+        <w:tc>
+          <w:tcPr>
+            <w:tcW w:w="1276" w:type="dxa"/>
+          </w:tcPr>
+          <w:p>
+            <w:pPr>
+              <w:rPr>
+                <w:rFonts w:ascii="Calibri" w:hAnsi="Calibri" w:cs="Arial"/>
+                <w:iCs/>
+                <w:sz w:val="18"/>
+                <w:szCs w:val="20"/>
+                <w:lang w:eastAsia="es-CL"/>
+              </w:rPr>
+            </w:pPr>
+            <w:r>
+              <w:rPr>
+                <w:rFonts w:ascii="Calibri" w:hAnsi="Calibri" w:cs="Arial"/>
+                <w:iCs/>
+                <w:sz w:val="18"/>
+                <w:szCs w:val="20"/>
+                <w:lang w:eastAsia="es-CL"/>
+              </w:rPr>
+              <w:t>Completado</w:t>
+            </w:r>
+          </w:p>
+        </w:tc>
+        <w:tc>
+          <w:tcPr>
+            <w:tcW w:w="992" w:type="dxa"/>
+          </w:tcPr>
+          <w:p>
+            <w:pPr>
+              <w:rPr>
+                <w:rFonts w:ascii="Calibri" w:hAnsi="Calibri" w:cs="Arial"/>
+                <w:iCs/>
+                <w:sz w:val="18"/>
+                <w:szCs w:val="20"/>
+                <w:lang w:eastAsia="es-CL"/>
+              </w:rPr>
+            </w:pPr>
+            <w:r>
+              <w:rPr>
+                <w:rFonts w:ascii="Calibri" w:hAnsi="Calibri" w:cs="Arial"/>
+                <w:iCs/>
+                <w:sz w:val="18"/>
+                <w:szCs w:val="20"/>
+                <w:lang w:eastAsia="es-CL"/>
+              </w:rPr>
+              <w:t>Se añadieron los modos de escaneo rápido, completo y personalizado</w:t>
+            </w:r>
+          </w:p>
+        </w:tc>
+      </w:tr>
+      <w:tr>
+        <w:trPr>
+          <w:trHeight w:val="2410"/>
+        </w:trPr>
+        <w:tc>
+          <w:tcPr>
+            <w:tcW w:w="1271" w:type="dxa"/>
+          </w:tcPr>
+          <w:p>
+            <w:pPr>
+              <w:rPr>
+                <w:rFonts w:ascii="Calibri" w:hAnsi="Calibri" w:cs="Arial"/>
+                <w:iCs/>
+                <w:sz w:val="18"/>
+                <w:szCs w:val="20"/>
+                <w:lang w:eastAsia="es-CL"/>
+              </w:rPr>
+            </w:pPr>
+            <w:r>
+              <w:rPr>
+                <w:rFonts w:ascii="Calibri" w:hAnsi="Calibri" w:cs="Arial"/>
+                <w:iCs/>
+                <w:sz w:val="18"/>
+                <w:szCs w:val="20"/>
+                <w:lang w:eastAsia="es-CL"/>
+              </w:rPr>
+              <w:lastRenderedPageBreak/>
+              <w:t>Diseño de pruebas de software</w:t>
+            </w:r>
+          </w:p>
+        </w:tc>
+        <w:tc>
+          <w:tcPr>
+            <w:tcW w:w="1559" w:type="dxa"/>
+          </w:tcPr>
+          <w:p>
+            <w:pPr>
+              <w:rPr>
+                <w:rFonts w:ascii="Calibri" w:hAnsi="Calibri" w:cs="Arial"/>
+                <w:iCs/>
+                <w:sz w:val="18"/>
+                <w:szCs w:val="20"/>
+                <w:lang w:eastAsia="es-CL"/>
+              </w:rPr>
+            </w:pPr>
+            <w:r>
+              <w:rPr>
+                <w:rFonts w:ascii="Calibri" w:hAnsi="Calibri" w:cs="Arial"/>
+                <w:iCs/>
+                <w:sz w:val="18"/>
+                <w:szCs w:val="20"/>
+                <w:lang w:eastAsia="es-CL"/>
+              </w:rPr>
+              <w:t>Redactar y programar los escenarios genéricos en Gherkin (BDD) en lenguaje natural</w:t>
+            </w:r>
+          </w:p>
+        </w:tc>
+        <w:tc>
+          <w:tcPr>
+            <w:tcW w:w="851" w:type="dxa"/>
+          </w:tcPr>
+          <w:p>
+            <w:pPr>
+              <w:rPr>
+                <w:rFonts w:ascii="Calibri" w:hAnsi="Calibri" w:cs="Arial"/>
+                <w:iCs/>
+                <w:sz w:val="18"/>
+                <w:szCs w:val="20"/>
+                <w:lang w:eastAsia="es-CL"/>
+              </w:rPr>
+            </w:pPr>
+            <w:r>
+              <w:rPr>
+                <w:rFonts w:ascii="Calibri" w:hAnsi="Calibri" w:cs="Arial"/>
+                <w:iCs/>
+                <w:sz w:val="18"/>
+                <w:szCs w:val="20"/>
+                <w:lang w:eastAsia="es-CL"/>
+              </w:rPr>
+              <w:t>Playwright, sintaxis Gherkin</w:t>
+            </w:r>
+          </w:p>
+        </w:tc>
+        <w:tc>
+          <w:tcPr>
+            <w:tcW w:w="1276" w:type="dxa"/>
+          </w:tcPr>
+          <w:p>
+            <w:pPr>
+              <w:rPr>
+                <w:rFonts w:ascii="Calibri" w:hAnsi="Calibri" w:cs="Arial"/>
+                <w:iCs/>
+                <w:sz w:val="18"/>
+                <w:szCs w:val="20"/>
+                <w:lang w:eastAsia="es-CL"/>
+              </w:rPr>
+            </w:pPr>
+            <w:r>
+              <w:rPr>
+                <w:rFonts w:ascii="Calibri" w:hAnsi="Calibri" w:cs="Arial"/>
+                <w:iCs/>
+                <w:sz w:val="18"/>
+                <w:szCs w:val="20"/>
+                <w:lang w:eastAsia="es-CL"/>
+              </w:rPr>
+              <w:t>Semanas 8-9</w:t>
+            </w:r>
+          </w:p>
+        </w:tc>
+        <w:tc>
+          <w:tcPr>
+            <w:tcW w:w="1275" w:type="dxa"/>
+          </w:tcPr>
+          <w:p>
+            <w:pPr>
+              <w:rPr>
+                <w:rFonts w:ascii="Calibri" w:hAnsi="Calibri" w:cs="Arial"/>
+                <w:iCs/>
+                <w:sz w:val="18"/>
+                <w:szCs w:val="20"/>
+                <w:lang w:eastAsia="es-CL"/>
+              </w:rPr>
+            </w:pPr>
+            <w:r>
+              <w:rPr>
+                <w:rFonts w:ascii="Calibri" w:hAnsi="Calibri" w:cs="Arial"/>
+                <w:iCs/>
+                <w:sz w:val="18"/>
+                <w:szCs w:val="20"/>
+                <w:lang w:eastAsia="es-CL"/>
+              </w:rPr>
+              <w:t>Alex Mauricio Puebla Allendes</w:t>
+            </w:r>
+          </w:p>
+        </w:tc>
+        <w:tc>
+          <w:tcPr>
+            <w:tcW w:w="1276" w:type="dxa"/>
+          </w:tcPr>
+          <w:p>
+            <w:pPr>
+              <w:rPr>
+                <w:rFonts w:ascii="Calibri" w:hAnsi="Calibri" w:cs="Arial"/>
+                <w:iCs/>
+                <w:sz w:val="18"/>
+                <w:szCs w:val="20"/>
+                <w:lang w:eastAsia="es-CL"/>
+              </w:rPr>
+            </w:pPr>
+            <w:r>
+              <w:rPr>
+                <w:rFonts w:ascii="Calibri" w:hAnsi="Calibri" w:cs="Arial"/>
+                <w:iCs/>
+                <w:sz w:val="18"/>
+                <w:szCs w:val="20"/>
+                <w:lang w:eastAsia="es-CL"/>
+              </w:rPr>
+              <w:t>Traducir las reglas de calidad a escenarios</w:t>
+            </w:r>
+          </w:p>
+        </w:tc>
+        <w:tc>
+          <w:tcPr>
+            <w:tcW w:w="1276" w:type="dxa"/>
+          </w:tcPr>
+          <w:p>
+            <w:pPr>
+              <w:rPr>
+                <w:rFonts w:ascii="Calibri" w:hAnsi="Calibri" w:cs="Arial"/>
+                <w:iCs/>
+                <w:sz w:val="18"/>
+                <w:szCs w:val="20"/>
+                <w:lang w:eastAsia="es-CL"/>
+              </w:rPr>
+            </w:pPr>
+            <w:r>
+              <w:rPr>
+                <w:rFonts w:ascii="Calibri" w:hAnsi="Calibri" w:cs="Arial"/>
+                <w:iCs/>
+                <w:sz w:val="18"/>
+                <w:szCs w:val="20"/>
+                <w:lang w:eastAsia="es-CL"/>
+              </w:rPr>
+              <w:t>En curso</w:t>
+            </w:r>
+          </w:p>
+        </w:tc>
+        <w:tc>
+          <w:tcPr>
+            <w:tcW w:w="992" w:type="dxa"/>
+          </w:tcPr>
+          <w:p>
+            <w:pPr>
+              <w:rPr>
+                <w:rFonts w:ascii="Calibri" w:hAnsi="Calibri" w:cs="Arial"/>
+                <w:iCs/>
+                <w:sz w:val="18"/>
+                <w:szCs w:val="20"/>
+                <w:lang w:eastAsia="es-CL"/>
+              </w:rPr>
+            </w:pPr>
+            <w:r>
+              <w:rPr>
+                <w:rFonts w:ascii="Calibri" w:hAnsi="Calibri" w:cs="Arial"/>
+                <w:iCs/>
+                <w:sz w:val="18"/>
+                <w:szCs w:val="20"/>
+                <w:lang w:eastAsia="es-CL"/>
+              </w:rPr>
+              <w:t>En fase de estudio</w:t>
+            </w:r>
+          </w:p>
+        </w:tc>
+      </w:tr>
+      <w:tr>
+        <w:trPr>
+          <w:trHeight w:val="2410"/>
+        </w:trPr>
+        <w:tc>
+          <w:tcPr>
+            <w:tcW w:w="1271" w:type="dxa"/>
+          </w:tcPr>
+          <w:p>
+            <w:pPr>
+              <w:rPr>
+                <w:rFonts w:ascii="Calibri" w:hAnsi="Calibri" w:cs="Arial"/>
+                <w:iCs/>
+                <w:sz w:val="18"/>
+                <w:szCs w:val="20"/>
+                <w:lang w:eastAsia="es-CL"/>
+              </w:rPr>
+            </w:pPr>
+            <w:r>
+              <w:rPr>
+                <w:rFonts w:ascii="Calibri" w:hAnsi="Calibri" w:cs="Arial"/>
+                <w:iCs/>
+                <w:sz w:val="18"/>
+                <w:szCs w:val="20"/>
+                <w:lang w:eastAsia="es-CL"/>
+              </w:rPr>
+              <w:t>Programación de soluciones de software</w:t>
+            </w:r>
+          </w:p>
+        </w:tc>
+        <w:tc>
+          <w:tcPr>
+            <w:tcW w:w="1559" w:type="dxa"/>
+          </w:tcPr>
+          <w:p>
+            <w:pPr>
+              <w:rPr>
+                <w:rFonts w:ascii="Calibri" w:hAnsi="Calibri" w:cs="Arial"/>
+                <w:iCs/>
+                <w:sz w:val="18"/>
+                <w:szCs w:val="20"/>
+                <w:lang w:eastAsia="es-CL"/>
+              </w:rPr>
+            </w:pPr>
+            <w:r>
+              <w:rPr>
+                <w:rFonts w:ascii="Calibri" w:hAnsi="Calibri" w:cs="Arial"/>
+                <w:iCs/>
+                <w:sz w:val="18"/>
+                <w:szCs w:val="20"/>
+                <w:lang w:eastAsia="es-CL"/>
+              </w:rPr>
+              <w:t>Implementar las esperas dinámicas (Smart Waits) y la parametrización dinámica del volumen de pruebas</w:t>
+            </w:r>
+          </w:p>
+        </w:tc>
+        <w:tc>
+          <w:tcPr>
+            <w:tcW w:w="851" w:type="dxa"/>
+          </w:tcPr>
+          <w:p>
+            <w:pPr>
+              <w:rPr>
+                <w:rFonts w:ascii="Calibri" w:hAnsi="Calibri" w:cs="Arial"/>
+                <w:iCs/>
+                <w:sz w:val="18"/>
+                <w:szCs w:val="20"/>
+                <w:lang w:eastAsia="es-CL"/>
+              </w:rPr>
+            </w:pPr>
+            <w:r>
+              <w:rPr>
+                <w:rFonts w:ascii="Calibri" w:hAnsi="Calibri" w:cs="Arial"/>
+                <w:iCs/>
+                <w:sz w:val="18"/>
+                <w:szCs w:val="20"/>
+                <w:lang w:eastAsia="es-CL"/>
+              </w:rPr>
+              <w:t>Node.js, TypeScript, Playwright</w:t>
+            </w:r>
+          </w:p>
+        </w:tc>
+        <w:tc>
+          <w:tcPr>
+            <w:tcW w:w="1276" w:type="dxa"/>
+          </w:tcPr>
+          <w:p>
+            <w:pPr>
+              <w:rPr>
+                <w:rFonts w:ascii="Calibri" w:hAnsi="Calibri" w:cs="Arial"/>
+                <w:iCs/>
+                <w:sz w:val="18"/>
+                <w:szCs w:val="20"/>
+                <w:lang w:eastAsia="es-CL"/>
+              </w:rPr>
+            </w:pPr>
+            <w:r>
+              <w:rPr>
+                <w:rFonts w:ascii="Calibri" w:hAnsi="Calibri" w:cs="Arial"/>
+                <w:iCs/>
+                <w:sz w:val="18"/>
+                <w:szCs w:val="20"/>
+                <w:lang w:eastAsia="es-CL"/>
+              </w:rPr>
+              <w:t>Semanas 9-10</w:t>
+            </w:r>
+          </w:p>
+        </w:tc>
+        <w:tc>
+          <w:tcPr>
+            <w:tcW w:w="1275" w:type="dxa"/>
+          </w:tcPr>
+          <w:p>
+            <w:pPr>
+              <w:rPr>
+                <w:rFonts w:ascii="Calibri" w:hAnsi="Calibri" w:cs="Arial"/>
+                <w:iCs/>
+                <w:sz w:val="18"/>
+                <w:szCs w:val="20"/>
+                <w:lang w:eastAsia="es-CL"/>
+              </w:rPr>
+            </w:pPr>
+            <w:r>
+              <w:rPr>
+                <w:rFonts w:ascii="Calibri" w:hAnsi="Calibri" w:cs="Arial"/>
+                <w:iCs/>
+                <w:sz w:val="18"/>
+                <w:szCs w:val="20"/>
+                <w:lang w:eastAsia="es-CL"/>
+              </w:rPr>
+              <w:t>José Ignacio Valdivia Mendoza</w:t>
+            </w:r>
+          </w:p>
+        </w:tc>
+        <w:tc>
+          <w:tcPr>
+            <w:tcW w:w="1276" w:type="dxa"/>
+          </w:tcPr>
+          <w:p>
+            <w:pPr>
+              <w:rPr>
+                <w:rFonts w:ascii="Calibri" w:hAnsi="Calibri" w:cs="Arial"/>
+                <w:iCs/>
+                <w:sz w:val="18"/>
+                <w:szCs w:val="20"/>
+                <w:lang w:eastAsia="es-CL"/>
+              </w:rPr>
+            </w:pPr>
+            <w:r>
+              <w:rPr>
+                <w:rFonts w:ascii="Calibri" w:hAnsi="Calibri" w:cs="Arial"/>
+                <w:iCs/>
+                <w:sz w:val="18"/>
+                <w:szCs w:val="20"/>
+                <w:lang w:eastAsia="es-CL"/>
+              </w:rPr>
+              <w:t>Evitar falsos positivos por carga asíncrona</w:t>
+            </w:r>
+          </w:p>
+        </w:tc>
+        <w:tc>
+          <w:tcPr>
+            <w:tcW w:w="1276" w:type="dxa"/>
+          </w:tcPr>
+          <w:p>
+            <w:pPr>
+              <w:rPr>
+                <w:rFonts w:ascii="Calibri" w:hAnsi="Calibri" w:cs="Arial"/>
+                <w:iCs/>
+                <w:sz w:val="18"/>
+                <w:szCs w:val="20"/>
+                <w:lang w:eastAsia="es-CL"/>
+              </w:rPr>
+            </w:pPr>
+            <w:r>
+              <w:rPr>
+                <w:rFonts w:ascii="Calibri" w:hAnsi="Calibri" w:cs="Arial"/>
+                <w:iCs/>
+                <w:sz w:val="18"/>
+                <w:szCs w:val="20"/>
+                <w:lang w:eastAsia="es-CL"/>
+              </w:rPr>
+              <w:t>En curso</w:t>
+            </w:r>
+          </w:p>
+        </w:tc>
+        <w:tc>
+          <w:tcPr>
+            <w:tcW w:w="992" w:type="dxa"/>
+          </w:tcPr>
+          <w:p>
+            <w:pPr>
+              <w:rPr>
+                <w:rFonts w:ascii="Calibri" w:hAnsi="Calibri" w:cs="Arial"/>
+                <w:iCs/>
+                <w:sz w:val="18"/>
+                <w:szCs w:val="20"/>
+                <w:lang w:eastAsia="es-CL"/>
+              </w:rPr>
+            </w:pPr>
+          </w:p>
+        </w:tc>
+      </w:tr>
+      <w:tr>
+        <w:trPr>
+          <w:trHeight w:val="2410"/>
+        </w:trPr>
+        <w:tc>
+          <w:tcPr>
+            <w:tcW w:w="1271" w:type="dxa"/>
+          </w:tcPr>
+          <w:p>
+            <w:pPr>
+              <w:rPr>
+                <w:rFonts w:ascii="Calibri" w:hAnsi="Calibri" w:cs="Arial"/>
+                <w:iCs/>
+                <w:sz w:val="18"/>
+                <w:szCs w:val="20"/>
+                <w:lang w:eastAsia="es-CL"/>
+              </w:rPr>
+            </w:pPr>
+            <w:r>
+              <w:rPr>
+                <w:rFonts w:ascii="Calibri" w:hAnsi="Calibri" w:cs="Arial"/>
+                <w:iCs/>
+                <w:sz w:val="18"/>
+                <w:szCs w:val="20"/>
+                <w:lang w:eastAsia="es-CL"/>
+              </w:rPr>
+              <w:t>Gestión de proyectos de TI</w:t>
+            </w:r>
+          </w:p>
+        </w:tc>
+        <w:tc>
+          <w:tcPr>
+            <w:tcW w:w="1559" w:type="dxa"/>
+          </w:tcPr>
+          <w:p>
+            <w:pPr>
+              <w:rPr>
+                <w:rFonts w:ascii="Calibri" w:hAnsi="Calibri" w:cs="Arial"/>
+                <w:iCs/>
+                <w:sz w:val="18"/>
+                <w:szCs w:val="20"/>
+                <w:lang w:eastAsia="es-CL"/>
+              </w:rPr>
+            </w:pPr>
+            <w:r>
+              <w:rPr>
+                <w:rFonts w:ascii="Calibri" w:hAnsi="Calibri" w:cs="Arial"/>
+                <w:iCs/>
+                <w:sz w:val="18"/>
+                <w:szCs w:val="20"/>
+                <w:lang w:eastAsia="es-CL"/>
+              </w:rPr>
+              <w:t>Construir el panel web (dashboard) para visualizar y eliminar escaneos y resultados</w:t>
+            </w:r>
+          </w:p>
+        </w:tc>
+        <w:tc>
+          <w:tcPr>
+            <w:tcW w:w="851" w:type="dxa"/>
+          </w:tcPr>
+          <w:p>
+            <w:pPr>
+              <w:rPr>
+                <w:rFonts w:ascii="Calibri" w:hAnsi="Calibri" w:cs="Arial"/>
+                <w:iCs/>
+                <w:sz w:val="18"/>
+                <w:szCs w:val="20"/>
+                <w:lang w:eastAsia="es-CL"/>
+              </w:rPr>
+            </w:pPr>
+            <w:r>
+              <w:rPr>
+                <w:rFonts w:ascii="Calibri" w:hAnsi="Calibri" w:cs="Arial"/>
+                <w:iCs/>
+                <w:sz w:val="18"/>
+                <w:szCs w:val="20"/>
+                <w:lang w:eastAsia="es-CL"/>
+              </w:rPr>
+              <w:t>Node.js, HTML/CSS/JavaScript</w:t>
+            </w:r>
+          </w:p>
+        </w:tc>
+        <w:tc>
+          <w:tcPr>
+            <w:tcW w:w="1276" w:type="dxa"/>
+          </w:tcPr>
+          <w:p>
+            <w:pPr>
+              <w:rPr>
+                <w:rFonts w:ascii="Calibri" w:hAnsi="Calibri" w:cs="Arial"/>
+                <w:iCs/>
+                <w:sz w:val="18"/>
+                <w:szCs w:val="20"/>
+                <w:lang w:eastAsia="es-CL"/>
+              </w:rPr>
+            </w:pPr>
+            <w:r>
+              <w:rPr>
+                <w:rFonts w:ascii="Calibri" w:hAnsi="Calibri" w:cs="Arial"/>
+                <w:iCs/>
+                <w:sz w:val="18"/>
+                <w:szCs w:val="20"/>
+                <w:lang w:eastAsia="es-CL"/>
+              </w:rPr>
+              <w:t>Semanas 10-11</w:t>
+            </w:r>
+          </w:p>
+        </w:tc>
+        <w:tc>
+          <w:tcPr>
+            <w:tcW w:w="1275" w:type="dxa"/>
+          </w:tcPr>
+          <w:p>
+            <w:pPr>
+              <w:rPr>
+                <w:rFonts w:ascii="Calibri" w:hAnsi="Calibri" w:cs="Arial"/>
+                <w:iCs/>
+                <w:sz w:val="18"/>
+                <w:szCs w:val="20"/>
+                <w:lang w:eastAsia="es-CL"/>
+              </w:rPr>
+            </w:pPr>
+            <w:r>
+              <w:rPr>
+                <w:rFonts w:ascii="Calibri" w:hAnsi="Calibri" w:cs="Arial"/>
+                <w:iCs/>
+                <w:sz w:val="18"/>
+                <w:szCs w:val="20"/>
+                <w:lang w:eastAsia="es-CL"/>
+              </w:rPr>
+              <w:t>Alex Mauricio Puebla Allendes</w:t>
+            </w:r>
+          </w:p>
+        </w:tc>
+        <w:tc>
+          <w:tcPr>
+            <w:tcW w:w="1276" w:type="dxa"/>
+          </w:tcPr>
+          <w:p>
+            <w:pPr>
+              <w:rPr>
+                <w:rFonts w:ascii="Calibri" w:hAnsi="Calibri" w:cs="Arial"/>
+                <w:iCs/>
+                <w:sz w:val="18"/>
+                <w:szCs w:val="20"/>
+                <w:lang w:eastAsia="es-CL"/>
+              </w:rPr>
+            </w:pPr>
+            <w:r>
+              <w:rPr>
+                <w:rFonts w:ascii="Calibri" w:hAnsi="Calibri" w:cs="Arial"/>
+                <w:iCs/>
+                <w:sz w:val="18"/>
+                <w:szCs w:val="20"/>
+                <w:lang w:eastAsia="es-CL"/>
+              </w:rPr>
+              <w:t>Integración de las APIs locales de reportes</w:t>
+            </w:r>
+          </w:p>
+        </w:tc>
+        <w:tc>
+          <w:tcPr>
+            <w:tcW w:w="1276" w:type="dxa"/>
+          </w:tcPr>
+          <w:p>
+            <w:pPr>
+              <w:rPr>
+                <w:rFonts w:ascii="Calibri" w:hAnsi="Calibri" w:cs="Arial"/>
+                <w:iCs/>
+                <w:sz w:val="18"/>
+                <w:szCs w:val="20"/>
+                <w:lang w:eastAsia="es-CL"/>
+              </w:rPr>
+            </w:pPr>
+            <w:r>
+              <w:rPr>
+                <w:rFonts w:ascii="Calibri" w:hAnsi="Calibri" w:cs="Arial"/>
+                <w:iCs/>
+                <w:sz w:val="18"/>
+                <w:szCs w:val="20"/>
+                <w:lang w:eastAsia="es-CL"/>
+              </w:rPr>
+              <w:t>Completado</w:t>
+            </w:r>
+          </w:p>
+        </w:tc>
+        <w:tc>
+          <w:tcPr>
+            <w:tcW w:w="992" w:type="dxa"/>
+          </w:tcPr>
+          <w:p>
+            <w:pPr>
+              <w:rPr>
+                <w:rFonts w:ascii="Calibri" w:hAnsi="Calibri" w:cs="Arial"/>
+                <w:iCs/>
+                <w:sz w:val="18"/>
+                <w:szCs w:val="20"/>
+                <w:lang w:eastAsia="es-CL"/>
+              </w:rPr>
+            </w:pPr>
+            <w:r>
+              <w:rPr>
+                <w:rFonts w:ascii="Calibri" w:hAnsi="Calibri" w:cs="Arial"/>
+                <w:iCs/>
+                <w:sz w:val="18"/>
+                <w:szCs w:val="20"/>
+                <w:lang w:eastAsia="es-CL"/>
+              </w:rPr>
+              <w:t>Se agregó la eliminación de escaneos</w:t>
+            </w:r>
+          </w:p>
+        </w:tc>
+      </w:tr>
+      <w:tr>
+        <w:trPr>
+          <w:trHeight w:val="2410"/>
+        </w:trPr>
+        <w:tc>
+          <w:tcPr>
+            <w:tcW w:w="1271" w:type="dxa"/>
+          </w:tcPr>
+          <w:p>
+            <w:pPr>
+              <w:rPr>
+                <w:rFonts w:ascii="Calibri" w:hAnsi="Calibri" w:cs="Arial"/>
+                <w:iCs/>
+                <w:sz w:val="18"/>
+                <w:szCs w:val="20"/>
+                <w:lang w:eastAsia="es-CL"/>
+              </w:rPr>
+            </w:pPr>
+            <w:r>
+              <w:rPr>
+                <w:rFonts w:ascii="Calibri" w:hAnsi="Calibri" w:cs="Arial"/>
+                <w:iCs/>
+                <w:sz w:val="18"/>
+                <w:szCs w:val="20"/>
+                <w:lang w:eastAsia="es-CL"/>
+              </w:rPr>
+              <w:t>Diseño de pruebas de software</w:t>
+            </w:r>
+          </w:p>
+        </w:tc>
+        <w:tc>
+          <w:tcPr>
+            <w:tcW w:w="1559" w:type="dxa"/>
+          </w:tcPr>
+          <w:p>
+            <w:pPr>
+              <w:rPr>
+                <w:rFonts w:ascii="Calibri" w:hAnsi="Calibri" w:cs="Arial"/>
+                <w:iCs/>
+                <w:sz w:val="18"/>
+                <w:szCs w:val="20"/>
+                <w:lang w:eastAsia="es-CL"/>
+              </w:rPr>
+            </w:pPr>
+            <w:r>
+              <w:rPr>
+                <w:rFonts w:ascii="Calibri" w:hAnsi="Calibri" w:cs="Arial"/>
+                <w:iCs/>
+                <w:sz w:val="18"/>
+                <w:szCs w:val="20"/>
+                <w:lang w:eastAsia="es-CL"/>
+              </w:rPr>
+              <w:t>Crear el sitio de ejemplo (demo) con errores controlados para las pruebas</w:t>
+            </w:r>
+          </w:p>
+        </w:tc>
+        <w:tc>
+          <w:tcPr>
+            <w:tcW w:w="851" w:type="dxa"/>
+          </w:tcPr>
+          <w:p>
+            <w:pPr>
+              <w:rPr>
+                <w:rFonts w:ascii="Calibri" w:hAnsi="Calibri" w:cs="Arial"/>
+                <w:iCs/>
+                <w:sz w:val="18"/>
+                <w:szCs w:val="20"/>
+                <w:lang w:eastAsia="es-CL"/>
+              </w:rPr>
+            </w:pPr>
+            <w:r>
+              <w:rPr>
+                <w:rFonts w:ascii="Calibri" w:hAnsi="Calibri" w:cs="Arial"/>
+                <w:iCs/>
+                <w:sz w:val="18"/>
+                <w:szCs w:val="20"/>
+                <w:lang w:eastAsia="es-CL"/>
+              </w:rPr>
+              <w:t>HTML/CSS, servidor estático de Node.js</w:t>
+            </w:r>
+          </w:p>
+        </w:tc>
+        <w:tc>
+          <w:tcPr>
+            <w:tcW w:w="1276" w:type="dxa"/>
+          </w:tcPr>
+          <w:p>
+            <w:pPr>
+              <w:rPr>
+                <w:rFonts w:ascii="Calibri" w:hAnsi="Calibri" w:cs="Arial"/>
+                <w:iCs/>
+                <w:sz w:val="18"/>
+                <w:szCs w:val="20"/>
+                <w:lang w:eastAsia="es-CL"/>
+              </w:rPr>
+            </w:pPr>
+            <w:r>
+              <w:rPr>
+                <w:rFonts w:ascii="Calibri" w:hAnsi="Calibri" w:cs="Arial"/>
+                <w:iCs/>
+                <w:sz w:val="18"/>
+                <w:szCs w:val="20"/>
+                <w:lang w:eastAsia="es-CL"/>
+              </w:rPr>
+              <w:t>Semana 11</w:t>
+            </w:r>
+          </w:p>
+        </w:tc>
+        <w:tc>
+          <w:tcPr>
+            <w:tcW w:w="1275" w:type="dxa"/>
+          </w:tcPr>
+          <w:p>
+            <w:pPr>
+              <w:rPr>
+                <w:rFonts w:ascii="Calibri" w:hAnsi="Calibri" w:cs="Arial"/>
+                <w:iCs/>
+                <w:sz w:val="18"/>
+                <w:szCs w:val="20"/>
+                <w:lang w:eastAsia="es-CL"/>
+              </w:rPr>
+            </w:pPr>
+            <w:r>
+              <w:rPr>
+                <w:rFonts w:ascii="Calibri" w:hAnsi="Calibri" w:cs="Arial"/>
+                <w:iCs/>
+                <w:sz w:val="18"/>
+                <w:szCs w:val="20"/>
+                <w:lang w:eastAsia="es-CL"/>
+              </w:rPr>
+              <w:t>Alex Mauricio Puebla Allendes</w:t>
+            </w:r>
+          </w:p>
+        </w:tc>
+        <w:tc>
+          <w:tcPr>
+            <w:tcW w:w="1276" w:type="dxa"/>
+          </w:tcPr>
+          <w:p>
+            <w:pPr>
+              <w:rPr>
+                <w:rFonts w:ascii="Calibri" w:hAnsi="Calibri" w:cs="Arial"/>
+                <w:iCs/>
+                <w:sz w:val="18"/>
+                <w:szCs w:val="20"/>
+                <w:lang w:eastAsia="es-CL"/>
+              </w:rPr>
+            </w:pPr>
+            <w:r>
+              <w:rPr>
+                <w:rFonts w:ascii="Calibri" w:hAnsi="Calibri" w:cs="Arial"/>
+                <w:iCs/>
+                <w:sz w:val="18"/>
+                <w:szCs w:val="20"/>
+                <w:lang w:eastAsia="es-CL"/>
+              </w:rPr>
+              <w:t>Disponer de un entorno de prueba sin Internet</w:t>
+            </w:r>
+          </w:p>
+        </w:tc>
+        <w:tc>
+          <w:tcPr>
+            <w:tcW w:w="1276" w:type="dxa"/>
+          </w:tcPr>
+          <w:p>
+            <w:pPr>
+              <w:rPr>
+                <w:rFonts w:ascii="Calibri" w:hAnsi="Calibri" w:cs="Arial"/>
+                <w:iCs/>
+                <w:sz w:val="18"/>
+                <w:szCs w:val="20"/>
+                <w:lang w:eastAsia="es-CL"/>
+              </w:rPr>
+            </w:pPr>
+            <w:r>
+              <w:rPr>
+                <w:rFonts w:ascii="Calibri" w:hAnsi="Calibri" w:cs="Arial"/>
+                <w:iCs/>
+                <w:sz w:val="18"/>
+                <w:szCs w:val="20"/>
+                <w:lang w:eastAsia="es-CL"/>
+              </w:rPr>
+              <w:t>Completado</w:t>
+            </w:r>
+          </w:p>
+        </w:tc>
+        <w:tc>
+          <w:tcPr>
+            <w:tcW w:w="992" w:type="dxa"/>
+          </w:tcPr>
+          <w:p>
+            <w:pPr>
+              <w:rPr>
+                <w:rFonts w:ascii="Calibri" w:hAnsi="Calibri" w:cs="Arial"/>
+                <w:iCs/>
+                <w:sz w:val="18"/>
+                <w:szCs w:val="20"/>
+                <w:lang w:eastAsia="es-CL"/>
+              </w:rPr>
+            </w:pPr>
+            <w:r>
+              <w:rPr>
+                <w:rFonts w:ascii="Calibri" w:hAnsi="Calibri" w:cs="Arial"/>
+                <w:iCs/>
+                <w:sz w:val="18"/>
+                <w:szCs w:val="20"/>
+                <w:lang w:eastAsia="es-CL"/>
+              </w:rPr>
+              <w:t>Se incorporaron enlaces rotos e imágenes faltantes para validar las detecciones</w:t>
+            </w:r>
+          </w:p>
+        </w:tc>
+      </w:tr>
+      <w:tr>
+        <w:trPr>
+          <w:trHeight w:val="2410"/>
+        </w:trPr>
+        <w:tc>
+          <w:tcPr>
+            <w:tcW w:w="1271" w:type="dxa"/>
+          </w:tcPr>
+          <w:p>
+            <w:pPr>
+              <w:rPr>
+                <w:rFonts w:ascii="Calibri" w:hAnsi="Calibri" w:cs="Arial"/>
+                <w:iCs/>
+                <w:sz w:val="18"/>
+                <w:szCs w:val="20"/>
+                <w:lang w:eastAsia="es-CL"/>
+              </w:rPr>
+            </w:pPr>
+            <w:r>
+              <w:rPr>
+                <w:rFonts w:ascii="Calibri" w:hAnsi="Calibri" w:cs="Arial"/>
+                <w:iCs/>
+                <w:sz w:val="18"/>
+                <w:szCs w:val="20"/>
+                <w:lang w:eastAsia="es-CL"/>
+              </w:rPr>
+              <w:t>Modelamiento de software</w:t>
+            </w:r>
+          </w:p>
+        </w:tc>
+        <w:tc>
+          <w:tcPr>
+            <w:tcW w:w="1559" w:type="dxa"/>
+          </w:tcPr>
+          <w:p>
+            <w:pPr>
+              <w:rPr>
+                <w:rFonts w:ascii="Calibri" w:hAnsi="Calibri" w:cs="Arial"/>
+                <w:iCs/>
+                <w:sz w:val="18"/>
+                <w:szCs w:val="20"/>
+                <w:lang w:eastAsia="es-CL"/>
+              </w:rPr>
+            </w:pPr>
+            <w:r>
+              <w:rPr>
+                <w:rFonts w:ascii="Calibri" w:hAnsi="Calibri" w:cs="Arial"/>
+                <w:iCs/>
+                <w:sz w:val="18"/>
+                <w:szCs w:val="20"/>
+                <w:lang w:eastAsia="es-CL"/>
+              </w:rPr>
+              <w:t>Diseñar los diagramas UML del sistema (casos de uso, E-R, clases, secuencia y componentes)</w:t>
+            </w:r>
+          </w:p>
+        </w:tc>
+        <w:tc>
+          <w:tcPr>
+            <w:tcW w:w="851" w:type="dxa"/>
+          </w:tcPr>
+          <w:p>
+            <w:pPr>
+              <w:rPr>
+                <w:rFonts w:ascii="Calibri" w:hAnsi="Calibri" w:cs="Arial"/>
+                <w:iCs/>
+                <w:sz w:val="18"/>
+                <w:szCs w:val="20"/>
+                <w:lang w:eastAsia="es-CL"/>
+              </w:rPr>
+            </w:pPr>
+            <w:r>
+              <w:rPr>
+                <w:rFonts w:ascii="Calibri" w:hAnsi="Calibri" w:cs="Arial"/>
+                <w:iCs/>
+                <w:sz w:val="18"/>
+                <w:szCs w:val="20"/>
+                <w:lang w:eastAsia="es-CL"/>
+              </w:rPr>
+              <w:t>UML, herramientas de diagramación</w:t>
+            </w:r>
+          </w:p>
+        </w:tc>
+        <w:tc>
+          <w:tcPr>
+            <w:tcW w:w="1276" w:type="dxa"/>
+          </w:tcPr>
+          <w:p>
+            <w:pPr>
+              <w:rPr>
+                <w:rFonts w:ascii="Calibri" w:hAnsi="Calibri" w:cs="Arial"/>
+                <w:iCs/>
+                <w:sz w:val="18"/>
+                <w:szCs w:val="20"/>
+                <w:lang w:eastAsia="es-CL"/>
+              </w:rPr>
+            </w:pPr>
+            <w:r>
+              <w:rPr>
+                <w:rFonts w:ascii="Calibri" w:hAnsi="Calibri" w:cs="Arial"/>
+                <w:iCs/>
+                <w:sz w:val="18"/>
+                <w:szCs w:val="20"/>
+                <w:lang w:eastAsia="es-CL"/>
+              </w:rPr>
+              <w:t>Semanas 11-12</w:t>
+            </w:r>
+          </w:p>
+        </w:tc>
+        <w:tc>
+          <w:tcPr>
+            <w:tcW w:w="1275" w:type="dxa"/>
+          </w:tcPr>
+          <w:p>
+            <w:pPr>
+              <w:rPr>
+                <w:rFonts w:ascii="Calibri" w:hAnsi="Calibri" w:cs="Arial"/>
+                <w:iCs/>
+                <w:sz w:val="18"/>
+                <w:szCs w:val="20"/>
+                <w:lang w:eastAsia="es-CL"/>
+              </w:rPr>
+            </w:pPr>
+            <w:r>
+              <w:rPr>
+                <w:rFonts w:ascii="Calibri" w:hAnsi="Calibri" w:cs="Arial"/>
+                <w:iCs/>
+                <w:sz w:val="18"/>
+                <w:szCs w:val="20"/>
+                <w:lang w:eastAsia="es-CL"/>
+              </w:rPr>
+              <w:t>Alex Mauricio Puebla Allendes</w:t>
+            </w:r>
+            <w:r>
+              <w:rPr>
+                <w:rFonts w:ascii="Calibri" w:hAnsi="Calibri" w:cs="Arial"/>
+                <w:iCs/>
+                <w:sz w:val="18"/>
+                <w:szCs w:val="20"/>
+                <w:lang w:eastAsia="es-CL"/>
+              </w:rPr>
+              <w:br/>
+              <w:t>José Ignacio Valdivia Mendoza</w:t>
+            </w:r>
+          </w:p>
+        </w:tc>
+        <w:tc>
+          <w:tcPr>
+            <w:tcW w:w="1276" w:type="dxa"/>
+          </w:tcPr>
+          <w:p>
+            <w:pPr>
+              <w:rPr>
+                <w:rFonts w:ascii="Calibri" w:hAnsi="Calibri" w:cs="Arial"/>
+                <w:iCs/>
+                <w:sz w:val="18"/>
+                <w:szCs w:val="20"/>
+                <w:lang w:eastAsia="es-CL"/>
+              </w:rPr>
+            </w:pPr>
+            <w:r>
+              <w:rPr>
+                <w:rFonts w:ascii="Calibri" w:hAnsi="Calibri" w:cs="Arial"/>
+                <w:iCs/>
+                <w:sz w:val="18"/>
+                <w:szCs w:val="20"/>
+                <w:lang w:eastAsia="es-CL"/>
+              </w:rPr>
+              <w:t>Coherencia con los requisitos definidos</w:t>
+            </w:r>
+          </w:p>
+        </w:tc>
+        <w:tc>
+          <w:tcPr>
+            <w:tcW w:w="1276" w:type="dxa"/>
+          </w:tcPr>
+          <w:p>
+            <w:pPr>
+              <w:rPr>
+                <w:rFonts w:ascii="Calibri" w:hAnsi="Calibri" w:cs="Arial"/>
+                <w:iCs/>
+                <w:sz w:val="18"/>
+                <w:szCs w:val="20"/>
+                <w:lang w:eastAsia="es-CL"/>
+              </w:rPr>
+            </w:pPr>
+            <w:r>
+              <w:rPr>
+                <w:rFonts w:ascii="Calibri" w:hAnsi="Calibri" w:cs="Arial"/>
+                <w:iCs/>
+                <w:sz w:val="18"/>
+                <w:szCs w:val="20"/>
+                <w:lang w:eastAsia="es-CL"/>
+              </w:rPr>
+              <w:t>Completado</w:t>
+            </w:r>
+          </w:p>
+        </w:tc>
+        <w:tc>
+          <w:tcPr>
+            <w:tcW w:w="992" w:type="dxa"/>
+          </w:tcPr>
+          <w:p>
+            <w:pPr>
+              <w:rPr>
+                <w:rFonts w:ascii="Calibri" w:hAnsi="Calibri" w:cs="Arial"/>
+                <w:iCs/>
+                <w:sz w:val="18"/>
+                <w:szCs w:val="20"/>
+                <w:lang w:eastAsia="es-CL"/>
+              </w:rPr>
+            </w:pPr>
+            <w:r>
+              <w:rPr>
+                <w:rFonts w:ascii="Calibri" w:hAnsi="Calibri" w:cs="Arial"/>
+                <w:iCs/>
+                <w:sz w:val="18"/>
+                <w:szCs w:val="20"/>
+                <w:lang w:eastAsia="es-CL"/>
+              </w:rPr>
+              <w:t>Se elaboraron los cinco diagramas del Documento de Diseño</w:t>
+            </w:r>
+          </w:p>
+        </w:tc>
+      </w:tr>
+      <w:tr>
+        <w:trPr>
+          <w:trHeight w:val="2410"/>
+        </w:trPr>
+        <w:tc>
+          <w:tcPr>
+            <w:tcW w:w="1271" w:type="dxa"/>
+          </w:tcPr>
+          <w:p>
+            <w:pPr>
+              <w:rPr>
+                <w:rFonts w:ascii="Calibri" w:hAnsi="Calibri" w:cs="Arial"/>
+                <w:iCs/>
+                <w:sz w:val="18"/>
+                <w:szCs w:val="20"/>
+                <w:lang w:eastAsia="es-CL"/>
+              </w:rPr>
+            </w:pPr>
+            <w:r>
+              <w:rPr>
+                <w:rFonts w:ascii="Calibri" w:hAnsi="Calibri" w:cs="Arial"/>
+                <w:iCs/>
+                <w:sz w:val="18"/>
+                <w:szCs w:val="20"/>
+                <w:lang w:eastAsia="es-CL"/>
+              </w:rPr>
+              <w:lastRenderedPageBreak/>
+              <w:t>Aseguramiento de calidad del software</w:t>
+            </w:r>
+          </w:p>
+        </w:tc>
+        <w:tc>
+          <w:tcPr>
+            <w:tcW w:w="1559" w:type="dxa"/>
+          </w:tcPr>
+          <w:p>
+            <w:pPr>
+              <w:rPr>
+                <w:rFonts w:ascii="Calibri" w:hAnsi="Calibri" w:cs="Arial"/>
+                <w:iCs/>
+                <w:sz w:val="18"/>
+                <w:szCs w:val="20"/>
+                <w:lang w:eastAsia="es-CL"/>
+              </w:rPr>
+            </w:pPr>
+            <w:r>
+              <w:rPr>
+                <w:rFonts w:ascii="Calibri" w:hAnsi="Calibri" w:cs="Arial"/>
+                <w:iCs/>
+                <w:sz w:val="18"/>
+                <w:szCs w:val="20"/>
+                <w:lang w:eastAsia="es-CL"/>
+              </w:rPr>
+              <w:t>Ejecutar automáticamente la batería de pruebas sobre el sitio demo y registrar aprobadas y rechazadas (EP-007)</w:t>
+            </w:r>
+          </w:p>
+        </w:tc>
+        <w:tc>
+          <w:tcPr>
+            <w:tcW w:w="851" w:type="dxa"/>
+          </w:tcPr>
+          <w:p>
+            <w:pPr>
+              <w:rPr>
+                <w:rFonts w:ascii="Calibri" w:hAnsi="Calibri" w:cs="Arial"/>
+                <w:iCs/>
+                <w:sz w:val="18"/>
+                <w:szCs w:val="20"/>
+                <w:lang w:eastAsia="es-CL"/>
+              </w:rPr>
+            </w:pPr>
+            <w:r>
+              <w:rPr>
+                <w:rFonts w:ascii="Calibri" w:hAnsi="Calibri" w:cs="Arial"/>
+                <w:iCs/>
+                <w:sz w:val="18"/>
+                <w:szCs w:val="20"/>
+                <w:lang w:eastAsia="es-CL"/>
+              </w:rPr>
+              <w:t>Framework propio, navegador Chromium</w:t>
+            </w:r>
+          </w:p>
+        </w:tc>
+        <w:tc>
+          <w:tcPr>
+            <w:tcW w:w="1276" w:type="dxa"/>
+          </w:tcPr>
+          <w:p>
+            <w:pPr>
+              <w:rPr>
+                <w:rFonts w:ascii="Calibri" w:hAnsi="Calibri" w:cs="Arial"/>
+                <w:iCs/>
+                <w:sz w:val="18"/>
+                <w:szCs w:val="20"/>
+                <w:lang w:eastAsia="es-CL"/>
+              </w:rPr>
+            </w:pPr>
+            <w:r>
+              <w:rPr>
+                <w:rFonts w:ascii="Calibri" w:hAnsi="Calibri" w:cs="Arial"/>
+                <w:iCs/>
+                <w:sz w:val="18"/>
+                <w:szCs w:val="20"/>
+                <w:lang w:eastAsia="es-CL"/>
+              </w:rPr>
+              <w:t>Semanas 12-13</w:t>
+            </w:r>
+          </w:p>
+        </w:tc>
+        <w:tc>
+          <w:tcPr>
+            <w:tcW w:w="1275" w:type="dxa"/>
+          </w:tcPr>
+          <w:p>
+            <w:pPr>
+              <w:rPr>
+                <w:rFonts w:ascii="Calibri" w:hAnsi="Calibri" w:cs="Arial"/>
+                <w:iCs/>
+                <w:sz w:val="18"/>
+                <w:szCs w:val="20"/>
+                <w:lang w:eastAsia="es-CL"/>
+              </w:rPr>
+            </w:pPr>
+            <w:r>
+              <w:rPr>
+                <w:rFonts w:ascii="Calibri" w:hAnsi="Calibri" w:cs="Arial"/>
+                <w:iCs/>
+                <w:sz w:val="18"/>
+                <w:szCs w:val="20"/>
+                <w:lang w:eastAsia="es-CL"/>
+              </w:rPr>
+              <w:t>Alex Mauricio Puebla Allendes</w:t>
+            </w:r>
+            <w:r>
+              <w:rPr>
+                <w:rFonts w:ascii="Calibri" w:hAnsi="Calibri" w:cs="Arial"/>
+                <w:iCs/>
+                <w:sz w:val="18"/>
+                <w:szCs w:val="20"/>
+                <w:lang w:eastAsia="es-CL"/>
+              </w:rPr>
+              <w:br/>
+              <w:t>José Ignacio Valdivia Mendoza</w:t>
+            </w:r>
+          </w:p>
+        </w:tc>
+        <w:tc>
+          <w:tcPr>
+            <w:tcW w:w="1276" w:type="dxa"/>
+          </w:tcPr>
+          <w:p>
+            <w:pPr>
+              <w:rPr>
+                <w:rFonts w:ascii="Calibri" w:hAnsi="Calibri" w:cs="Arial"/>
+                <w:iCs/>
+                <w:sz w:val="18"/>
+                <w:szCs w:val="20"/>
+                <w:lang w:eastAsia="es-CL"/>
+              </w:rPr>
+            </w:pPr>
+            <w:r>
+              <w:rPr>
+                <w:rFonts w:ascii="Calibri" w:hAnsi="Calibri" w:cs="Arial"/>
+                <w:iCs/>
+                <w:sz w:val="18"/>
+                <w:szCs w:val="20"/>
+                <w:lang w:eastAsia="es-CL"/>
+              </w:rPr>
+              <w:t>Bloqueo de Firefox por política de Windows</w:t>
+            </w:r>
+          </w:p>
+        </w:tc>
+        <w:tc>
+          <w:tcPr>
+            <w:tcW w:w="1276" w:type="dxa"/>
+          </w:tcPr>
+          <w:p>
+            <w:pPr>
+              <w:rPr>
+                <w:rFonts w:ascii="Calibri" w:hAnsi="Calibri" w:cs="Arial"/>
+                <w:iCs/>
+                <w:sz w:val="18"/>
+                <w:szCs w:val="20"/>
+                <w:lang w:eastAsia="es-CL"/>
+              </w:rPr>
+            </w:pPr>
+            <w:r>
+              <w:rPr>
+                <w:rFonts w:ascii="Calibri" w:hAnsi="Calibri" w:cs="Arial"/>
+                <w:iCs/>
+                <w:sz w:val="18"/>
+                <w:szCs w:val="20"/>
+                <w:lang w:eastAsia="es-CL"/>
+              </w:rPr>
+              <w:t>En curso</w:t>
+            </w:r>
+          </w:p>
+        </w:tc>
+        <w:tc>
+          <w:tcPr>
+            <w:tcW w:w="992" w:type="dxa"/>
+          </w:tcPr>
+          <w:p>
+            <w:pPr>
+              <w:rPr>
+                <w:rFonts w:ascii="Calibri" w:hAnsi="Calibri" w:cs="Arial"/>
+                <w:iCs/>
+                <w:sz w:val="18"/>
+                <w:szCs w:val="20"/>
+                <w:lang w:eastAsia="es-CL"/>
+              </w:rPr>
+            </w:pPr>
+            <w:r>
+              <w:rPr>
+                <w:rFonts w:ascii="Calibri" w:hAnsi="Calibri" w:cs="Arial"/>
+                <w:iCs/>
+                <w:sz w:val="18"/>
+                <w:szCs w:val="20"/>
+                <w:lang w:eastAsia="es-CL"/>
+              </w:rPr>
+              <w:t>Se usó Chromium como navegador alternativo</w:t>
+            </w:r>
+          </w:p>
+        </w:tc>
+      </w:tr>
+      <w:tr>
+        <w:trPr>
+          <w:trHeight w:val="2410"/>
+        </w:trPr>
+        <w:tc>
+          <w:tcPr>
+            <w:tcW w:w="1271" w:type="dxa"/>
+          </w:tcPr>
+          <w:p>
+            <w:pPr>
+              <w:rPr>
+                <w:rFonts w:ascii="Calibri" w:hAnsi="Calibri" w:cs="Arial"/>
+                <w:iCs/>
+                <w:sz w:val="18"/>
+                <w:szCs w:val="20"/>
+                <w:lang w:eastAsia="es-CL"/>
+              </w:rPr>
+            </w:pPr>
+            <w:r>
+              <w:rPr>
+                <w:rFonts w:ascii="Calibri" w:hAnsi="Calibri" w:cs="Arial"/>
+                <w:iCs/>
+                <w:sz w:val="18"/>
+                <w:szCs w:val="20"/>
+                <w:lang w:eastAsia="es-CL"/>
+              </w:rPr>
+              <w:t>Integración de servicios en la nube</w:t>
+            </w:r>
+          </w:p>
+        </w:tc>
+        <w:tc>
+          <w:tcPr>
+            <w:tcW w:w="1559" w:type="dxa"/>
+          </w:tcPr>
+          <w:p>
+            <w:pPr>
+              <w:rPr>
+                <w:rFonts w:ascii="Calibri" w:hAnsi="Calibri" w:cs="Arial"/>
+                <w:iCs/>
+                <w:sz w:val="18"/>
+                <w:szCs w:val="20"/>
+                <w:lang w:eastAsia="es-CL"/>
+              </w:rPr>
+            </w:pPr>
+            <w:r>
+              <w:rPr>
+                <w:rFonts w:ascii="Calibri" w:hAnsi="Calibri" w:cs="Arial"/>
+                <w:iCs/>
+                <w:sz w:val="18"/>
+                <w:szCs w:val="20"/>
+                <w:lang w:eastAsia="es-CL"/>
+              </w:rPr>
+              <w:t>Integrar la ejecución cross-browser con BrowserStack (EP-005 / HU-007)</w:t>
+            </w:r>
+          </w:p>
+        </w:tc>
+        <w:tc>
+          <w:tcPr>
+            <w:tcW w:w="851" w:type="dxa"/>
+          </w:tcPr>
+          <w:p>
+            <w:pPr>
+              <w:rPr>
+                <w:rFonts w:ascii="Calibri" w:hAnsi="Calibri" w:cs="Arial"/>
+                <w:iCs/>
+                <w:sz w:val="18"/>
+                <w:szCs w:val="20"/>
+                <w:lang w:eastAsia="es-CL"/>
+              </w:rPr>
+            </w:pPr>
+            <w:r>
+              <w:rPr>
+                <w:rFonts w:ascii="Calibri" w:hAnsi="Calibri" w:cs="Arial"/>
+                <w:iCs/>
+                <w:sz w:val="18"/>
+                <w:szCs w:val="20"/>
+                <w:lang w:eastAsia="es-CL"/>
+              </w:rPr>
+              <w:t>Cuenta BrowserStack, API, credenciales</w:t>
+            </w:r>
+          </w:p>
+        </w:tc>
+        <w:tc>
+          <w:tcPr>
+            <w:tcW w:w="1276" w:type="dxa"/>
+          </w:tcPr>
+          <w:p>
+            <w:pPr>
+              <w:rPr>
+                <w:rFonts w:ascii="Calibri" w:hAnsi="Calibri" w:cs="Arial"/>
+                <w:iCs/>
+                <w:sz w:val="18"/>
+                <w:szCs w:val="20"/>
+                <w:lang w:eastAsia="es-CL"/>
+              </w:rPr>
+            </w:pPr>
+            <w:r>
+              <w:rPr>
+                <w:rFonts w:ascii="Calibri" w:hAnsi="Calibri" w:cs="Arial"/>
+                <w:iCs/>
+                <w:sz w:val="18"/>
+                <w:szCs w:val="20"/>
+                <w:lang w:eastAsia="es-CL"/>
+              </w:rPr>
+              <w:t>Semanas 13-14</w:t>
+            </w:r>
+          </w:p>
+        </w:tc>
+        <w:tc>
+          <w:tcPr>
+            <w:tcW w:w="1275" w:type="dxa"/>
+          </w:tcPr>
+          <w:p>
+            <w:pPr>
+              <w:rPr>
+                <w:rFonts w:ascii="Calibri" w:hAnsi="Calibri" w:cs="Arial"/>
+                <w:iCs/>
+                <w:sz w:val="18"/>
+                <w:szCs w:val="20"/>
+                <w:lang w:eastAsia="es-CL"/>
+              </w:rPr>
+            </w:pPr>
+            <w:r>
+              <w:rPr>
+                <w:rFonts w:ascii="Calibri" w:hAnsi="Calibri" w:cs="Arial"/>
+                <w:iCs/>
+                <w:sz w:val="18"/>
+                <w:szCs w:val="20"/>
+                <w:lang w:eastAsia="es-CL"/>
+              </w:rPr>
+              <w:t>José Ignacio Valdivia Mendoza</w:t>
+            </w:r>
+          </w:p>
+        </w:tc>
+        <w:tc>
+          <w:tcPr>
+            <w:tcW w:w="1276" w:type="dxa"/>
+          </w:tcPr>
+          <w:p>
+            <w:pPr>
+              <w:rPr>
+                <w:rFonts w:ascii="Calibri" w:hAnsi="Calibri" w:cs="Arial"/>
+                <w:iCs/>
+                <w:sz w:val="18"/>
+                <w:szCs w:val="20"/>
+                <w:lang w:eastAsia="es-CL"/>
+              </w:rPr>
+            </w:pPr>
+            <w:r>
+              <w:rPr>
+                <w:rFonts w:ascii="Calibri" w:hAnsi="Calibri" w:cs="Arial"/>
+                <w:iCs/>
+                <w:sz w:val="18"/>
+                <w:szCs w:val="20"/>
+                <w:lang w:eastAsia="es-CL"/>
+              </w:rPr>
+              <w:t>Dependencia de credenciales externas</w:t>
+            </w:r>
+          </w:p>
+        </w:tc>
+        <w:tc>
+          <w:tcPr>
+            <w:tcW w:w="1276" w:type="dxa"/>
+          </w:tcPr>
+          <w:p>
+            <w:pPr>
+              <w:rPr>
+                <w:rFonts w:ascii="Calibri" w:hAnsi="Calibri" w:cs="Arial"/>
+                <w:iCs/>
+                <w:sz w:val="18"/>
+                <w:szCs w:val="20"/>
+                <w:lang w:eastAsia="es-CL"/>
+              </w:rPr>
+            </w:pPr>
+            <w:r>
+              <w:rPr>
+                <w:rFonts w:ascii="Calibri" w:hAnsi="Calibri" w:cs="Arial"/>
+                <w:iCs/>
+                <w:sz w:val="18"/>
+                <w:szCs w:val="20"/>
+                <w:lang w:eastAsia="es-CL"/>
+              </w:rPr>
+              <w:t>No iniciado</w:t>
+            </w:r>
+          </w:p>
+        </w:tc>
+        <w:tc>
+          <w:tcPr>
+            <w:tcW w:w="992" w:type="dxa"/>
+          </w:tcPr>
+          <w:p>
+            <w:pPr>
+              <w:rPr>
+                <w:rFonts w:ascii="Calibri" w:hAnsi="Calibri" w:cs="Arial"/>
+                <w:iCs/>
+                <w:sz w:val="18"/>
+                <w:szCs w:val="20"/>
+                <w:lang w:eastAsia="es-CL"/>
+              </w:rPr>
+            </w:pPr>
+            <w:r>
+              <w:rPr>
+                <w:rFonts w:ascii="Calibri" w:hAnsi="Calibri" w:cs="Arial"/>
+                <w:iCs/>
+                <w:sz w:val="18"/>
+                <w:szCs w:val="20"/>
+                <w:lang w:eastAsia="es-CL"/>
+              </w:rPr>
+              <w:t>Por ahora  Se priorizó la ejecución local con Chromium</w:t>
+            </w:r>
+          </w:p>
+        </w:tc>
+      </w:tr>
+      <w:tr>
+        <w:trPr>
+          <w:trHeight w:val="2410"/>
+        </w:trPr>
+        <w:tc>
+          <w:tcPr>
+            <w:tcW w:w="1271" w:type="dxa"/>
+          </w:tcPr>
+          <w:p>
+            <w:pPr>
+              <w:rPr>
+                <w:rFonts w:ascii="Calibri" w:hAnsi="Calibri" w:cs="Arial"/>
+                <w:iCs/>
+                <w:sz w:val="18"/>
+                <w:szCs w:val="20"/>
+                <w:lang w:eastAsia="es-CL"/>
+              </w:rPr>
+            </w:pPr>
+            <w:r>
+              <w:rPr>
+                <w:rFonts w:ascii="Calibri" w:hAnsi="Calibri" w:cs="Arial"/>
+                <w:iCs/>
+                <w:sz w:val="18"/>
+                <w:szCs w:val="20"/>
+                <w:lang w:eastAsia="es-CL"/>
+              </w:rPr>
+              <w:t>Comunicación técnica</w:t>
+            </w:r>
+          </w:p>
+        </w:tc>
+        <w:tc>
+          <w:tcPr>
+            <w:tcW w:w="1559" w:type="dxa"/>
+          </w:tcPr>
+          <w:p>
+            <w:pPr>
+              <w:rPr>
+                <w:rFonts w:ascii="Calibri" w:hAnsi="Calibri" w:cs="Arial"/>
+                <w:iCs/>
+                <w:sz w:val="18"/>
+                <w:szCs w:val="20"/>
+                <w:lang w:eastAsia="es-CL"/>
+              </w:rPr>
+            </w:pPr>
+            <w:r>
+              <w:rPr>
+                <w:rFonts w:ascii="Calibri" w:hAnsi="Calibri" w:cs="Arial"/>
+                <w:iCs/>
+                <w:sz w:val="18"/>
+                <w:szCs w:val="20"/>
+                <w:lang w:eastAsia="es-CL"/>
+              </w:rPr>
+              <w:t>Preparar el informe final y la presentación del proyecto</w:t>
+            </w:r>
+          </w:p>
+        </w:tc>
+        <w:tc>
+          <w:tcPr>
+            <w:tcW w:w="851" w:type="dxa"/>
+          </w:tcPr>
+          <w:p>
+            <w:pPr>
+              <w:rPr>
+                <w:rFonts w:ascii="Calibri" w:hAnsi="Calibri" w:cs="Arial"/>
+                <w:iCs/>
+                <w:sz w:val="18"/>
+                <w:szCs w:val="20"/>
+                <w:lang w:eastAsia="es-CL"/>
+              </w:rPr>
+            </w:pPr>
+            <w:r>
+              <w:rPr>
+                <w:rFonts w:ascii="Calibri" w:hAnsi="Calibri" w:cs="Arial"/>
+                <w:iCs/>
+                <w:sz w:val="18"/>
+                <w:szCs w:val="20"/>
+                <w:lang w:eastAsia="es-CL"/>
+              </w:rPr>
+              <w:t>Plantillas DUOC, PowerPoint</w:t>
+            </w:r>
+          </w:p>
+        </w:tc>
+        <w:tc>
+          <w:tcPr>
+            <w:tcW w:w="1276" w:type="dxa"/>
+          </w:tcPr>
+          <w:p>
+            <w:pPr>
+              <w:rPr>
+                <w:rFonts w:ascii="Calibri" w:hAnsi="Calibri" w:cs="Arial"/>
+                <w:iCs/>
+                <w:sz w:val="18"/>
+                <w:szCs w:val="20"/>
+                <w:lang w:eastAsia="es-CL"/>
+              </w:rPr>
+            </w:pPr>
+            <w:r>
+              <w:rPr>
+                <w:rFonts w:ascii="Calibri" w:hAnsi="Calibri" w:cs="Arial"/>
+                <w:iCs/>
+                <w:sz w:val="18"/>
+                <w:szCs w:val="20"/>
+                <w:lang w:eastAsia="es-CL"/>
+              </w:rPr>
+              <w:t>Semana 14</w:t>
+            </w:r>
+          </w:p>
+        </w:tc>
+        <w:tc>
+          <w:tcPr>
+            <w:tcW w:w="1275" w:type="dxa"/>
+          </w:tcPr>
+          <w:p>
+            <w:pPr>
+              <w:rPr>
+                <w:rFonts w:ascii="Calibri" w:hAnsi="Calibri" w:cs="Arial"/>
+                <w:iCs/>
+                <w:sz w:val="18"/>
+                <w:szCs w:val="20"/>
+                <w:lang w:eastAsia="es-CL"/>
+              </w:rPr>
+            </w:pPr>
+            <w:r>
+              <w:rPr>
+                <w:rFonts w:ascii="Calibri" w:hAnsi="Calibri" w:cs="Arial"/>
+                <w:iCs/>
+                <w:sz w:val="18"/>
+                <w:szCs w:val="20"/>
+                <w:lang w:eastAsia="es-CL"/>
+              </w:rPr>
+              <w:t>Alex Mauricio Puebla Allendes</w:t>
+            </w:r>
+            <w:r>
+              <w:rPr>
+                <w:rFonts w:ascii="Calibri" w:hAnsi="Calibri" w:cs="Arial"/>
+                <w:iCs/>
+                <w:sz w:val="18"/>
+                <w:szCs w:val="20"/>
+                <w:lang w:eastAsia="es-CL"/>
+              </w:rPr>
+              <w:br/>
+              <w:t>José Ignacio Valdivia Mendoza</w:t>
+            </w:r>
+          </w:p>
+        </w:tc>
+        <w:tc>
+          <w:tcPr>
+            <w:tcW w:w="1276" w:type="dxa"/>
+          </w:tcPr>
+          <w:p>
+            <w:pPr>
+              <w:rPr>
+                <w:rFonts w:ascii="Calibri" w:hAnsi="Calibri" w:cs="Arial"/>
+                <w:iCs/>
+                <w:sz w:val="18"/>
+                <w:szCs w:val="20"/>
+                <w:lang w:eastAsia="es-CL"/>
+              </w:rPr>
+            </w:pPr>
+            <w:r>
+              <w:rPr>
+                <w:rFonts w:ascii="Calibri" w:hAnsi="Calibri" w:cs="Arial"/>
+                <w:iCs/>
+                <w:sz w:val="18"/>
+                <w:szCs w:val="20"/>
+                <w:lang w:eastAsia="es-CL"/>
+              </w:rPr>
+              <w:t>Consolidar la evidencia de todas las épicas</w:t>
+            </w:r>
+          </w:p>
+        </w:tc>
+        <w:tc>
+          <w:tcPr>
+            <w:tcW w:w="1276" w:type="dxa"/>
+          </w:tcPr>
+          <w:p>
+            <w:pPr>
+              <w:rPr>
+                <w:rFonts w:ascii="Calibri" w:hAnsi="Calibri" w:cs="Arial"/>
+                <w:iCs/>
+                <w:sz w:val="18"/>
+                <w:szCs w:val="20"/>
+                <w:lang w:eastAsia="es-CL"/>
+              </w:rPr>
+            </w:pPr>
+            <w:r>
+              <w:rPr>
+                <w:rFonts w:ascii="Calibri" w:hAnsi="Calibri" w:cs="Arial"/>
+                <w:iCs/>
+                <w:sz w:val="18"/>
+                <w:szCs w:val="20"/>
+                <w:lang w:eastAsia="es-CL"/>
+              </w:rPr>
+              <w:t>En curso</w:t>
+            </w:r>
+          </w:p>
+        </w:tc>
+        <w:tc>
+          <w:tcPr>
+            <w:tcW w:w="992" w:type="dxa"/>
+          </w:tcPr>
+          <w:p>
+            <w:pPr>
+              <w:rPr>
+                <w:rFonts w:ascii="Calibri" w:hAnsi="Calibri" w:cs="Arial"/>
+                <w:iCs/>
+                <w:sz w:val="18"/>
+                <w:szCs w:val="20"/>
+                <w:lang w:eastAsia="es-CL"/>
+              </w:rPr>
+            </w:pPr>
           </w:p>
         </w:tc>
       </w:tr>
@@ -2577,59 +4291,33 @@
             </w:r>
           </w:p>
           <w:p>
-            <w:pPr>
+            <w:r>
+              <w:t>Facilitadores: La experiencia previa de uno de los integrantes en aseguramiento de calidad, la disponibilidad de herramientas gratuitas (Node.js, TypeScript y Playwright)</w:t>
+            </w:r>
+            <w:r>
+              <w:br/>
+            </w:r>
+            <w:r>
+              <w:br/>
+              <w:t>Dificultades: La subestimación inicial del alcance del proyecto y de la complejidad de la documentación, los cambios frecuentes en los documentos, la coordinación de tiempos entre los integrantes, la curva de aprendizaje del web crawler y un bloqueo de política de seguridad de Windows que impedía ejecutar el navegador Firefox.</w:t>
+            </w:r>
+            <w:r>
+              <w:br/>
+            </w:r>
+            <w:r>
               <w:rPr>
                 <w:rFonts w:ascii="Calibri" w:hAnsi="Calibri"/>
                 <w:color w:val="1F3864" w:themeColor="accent1" w:themeShade="80"/>
               </w:rPr>
-            </w:pPr>
-          </w:p>
-          <w:p>
-            <w:pPr>
-              <w:rPr>
-                <w:rFonts w:ascii="Calibri" w:hAnsi="Calibri"/>
-                <w:color w:val="1F3864" w:themeColor="accent1" w:themeShade="80"/>
-              </w:rPr>
-            </w:pPr>
-          </w:p>
-          <w:p>
-            <w:pPr>
-              <w:jc w:val="both"/>
-              <w:rPr>
-                <w:rFonts w:ascii="Calibri" w:hAnsi="Calibri" w:cs="Arial"/>
-                <w:i/>
-                <w:color w:val="548DD4"/>
-                <w:sz w:val="20"/>
-                <w:szCs w:val="20"/>
-                <w:lang w:eastAsia="es-CL"/>
-              </w:rPr>
-            </w:pPr>
-          </w:p>
-          <w:p>
-            <w:pPr>
-              <w:jc w:val="both"/>
-              <w:rPr>
-                <w:rFonts w:ascii="Calibri" w:hAnsi="Calibri" w:cs="Arial"/>
-                <w:i/>
-                <w:color w:val="548DD4"/>
-                <w:sz w:val="20"/>
-                <w:szCs w:val="20"/>
-                <w:lang w:eastAsia="es-CL"/>
-              </w:rPr>
-            </w:pPr>
-          </w:p>
-          <w:p>
-            <w:pPr>
-              <w:jc w:val="both"/>
-              <w:rPr>
-                <w:rFonts w:ascii="Calibri" w:hAnsi="Calibri" w:cs="Arial"/>
-                <w:i/>
-                <w:color w:val="548DD4"/>
-                <w:sz w:val="20"/>
-                <w:szCs w:val="20"/>
-                <w:lang w:eastAsia="es-CL"/>
-              </w:rPr>
-            </w:pPr>
+              <w:br/>
+            </w:r>
+            <w:r>
+              <w:t xml:space="preserve">Acciones adoptadas: priorizar la documentación para fijar el alcance, apoyarse en GitHub y en un backlog priorizado con fechas límite, investigar alternativas técnicas (lo que permitió incorporar el </w:t>
+            </w:r>
+            <w:r>
+              <w:lastRenderedPageBreak/>
+              <w:t>crawler y sus modos de escaneo) y utilizar Chromium como navegador alternativo ante el bloqueo de Firefox.</w:t>
+            </w:r>
           </w:p>
         </w:tc>
       </w:tr>
@@ -2689,7 +4377,6 @@
                 <w:rFonts w:ascii="Calibri" w:hAnsi="Calibri"/>
                 <w:color w:val="1F3864" w:themeColor="accent1" w:themeShade="80"/>
               </w:rPr>
-              <w:lastRenderedPageBreak/>
               <w:t xml:space="preserve">Actividades ajustadas o eliminadas: </w:t>
             </w:r>
             <w:r>
@@ -2818,6 +4505,22 @@
                 <w:lang w:eastAsia="es-CL"/>
               </w:rPr>
             </w:pPr>
+          </w:p>
+          <w:p>
+            <w:r>
+              <w:t>Se postergó la ejecución en la nube con BrowserStack: en lugar de abordarla de inmediato, se priorizó la ejecución local con Chromium y la generación y ejecución automática de las pruebas, dejando la integración cloud para la etapa de estabilización, ya que depende de credenciales externas y no bloqueaba el resto del desarrollo.</w:t>
+            </w:r>
+            <w:r>
+              <w:br/>
+            </w:r>
+          </w:p>
+          <w:p>
+            <w:r>
+              <w:t>Se agregaron actividades no previstas originalmente, como el panel web (dashboard) y el sitio de ejemplo, al reconocer que aportaban valor para demostrar el funcionamiento del framework.</w:t>
+            </w:r>
+            <w:r>
+              <w:br/>
+            </w:r>
           </w:p>
           <w:p>
             <w:pPr>
@@ -2831,71 +4534,9 @@
                 <w:lang w:eastAsia="es-CL"/>
               </w:rPr>
             </w:pPr>
-          </w:p>
-          <w:p>
-            <w:pPr>
-              <w:jc w:val="both"/>
-              <w:rPr>
-                <w:rFonts w:ascii="Calibri" w:hAnsi="Calibri" w:cs="Arial"/>
-                <w:i/>
-                <w:color w:val="548DD4"/>
-                <w:sz w:val="20"/>
-                <w:szCs w:val="20"/>
-                <w:lang w:eastAsia="es-CL"/>
-              </w:rPr>
-            </w:pPr>
-          </w:p>
-          <w:p>
-            <w:pPr>
-              <w:jc w:val="both"/>
-              <w:rPr>
-                <w:rFonts w:ascii="Calibri" w:hAnsi="Calibri" w:cs="Arial"/>
-                <w:i/>
-                <w:color w:val="548DD4"/>
-                <w:sz w:val="20"/>
-                <w:szCs w:val="20"/>
-                <w:lang w:eastAsia="es-CL"/>
-              </w:rPr>
-            </w:pPr>
-          </w:p>
-          <w:p>
-            <w:pPr>
-              <w:jc w:val="both"/>
-              <w:rPr>
-                <w:rFonts w:ascii="Calibri" w:hAnsi="Calibri" w:cs="Arial"/>
-                <w:i/>
-                <w:color w:val="548DD4"/>
-                <w:sz w:val="20"/>
-                <w:szCs w:val="20"/>
-                <w:lang w:eastAsia="es-CL"/>
-              </w:rPr>
-            </w:pPr>
-          </w:p>
-          <w:p>
-            <w:pPr>
-              <w:jc w:val="both"/>
-              <w:rPr>
-                <w:rFonts w:ascii="Calibri" w:hAnsi="Calibri" w:cs="Arial"/>
-                <w:i/>
-                <w:color w:val="548DD4"/>
-                <w:sz w:val="20"/>
-                <w:szCs w:val="20"/>
-                <w:lang w:eastAsia="es-CL"/>
-              </w:rPr>
-            </w:pPr>
-          </w:p>
-          <w:p>
-            <w:pPr>
-              <w:jc w:val="both"/>
-              <w:rPr>
-                <w:rFonts w:ascii="Calibri" w:hAnsi="Calibri" w:cs="Arial"/>
-                <w:i/>
-                <w:color w:val="548DD4"/>
-                <w:sz w:val="20"/>
-                <w:szCs w:val="20"/>
-                <w:lang w:eastAsia="es-CL"/>
-              </w:rPr>
-            </w:pPr>
+            <w:r>
+              <w:t>Se reordenó el plan de trabajo para desarrollar primero la documentación ágil (visión, backlog y DoD), luego el diseño UML y finalmente el desarrollo y las pruebas, evitando repetir el problema de la fase anterior.</w:t>
+            </w:r>
           </w:p>
         </w:tc>
       </w:tr>
@@ -3148,6 +4789,11 @@
             </w:pPr>
           </w:p>
           <w:p>
+            <w:r>
+              <w:t>La integración con BrowserStack (EP-005 / HU-007) no se ha iniciado y se encuentra retrasada respecto del plan original. El motivo es que se priorizó la ejecución local y aún no se contaba con las credenciales del servicio. La estrategia es ejecutar localmente con Chromium, dejar documentada la configuración de BrowserStack y abordar la integración en la etapa de estabilización.</w:t>
+            </w:r>
+          </w:p>
+          <w:p>
             <w:pPr>
               <w:jc w:val="both"/>
               <w:rPr>
@@ -3159,71 +4805,9 @@
                 <w:lang w:eastAsia="es-CL"/>
               </w:rPr>
             </w:pPr>
-          </w:p>
-          <w:p>
-            <w:pPr>
-              <w:jc w:val="both"/>
-              <w:rPr>
-                <w:rFonts w:ascii="Calibri" w:hAnsi="Calibri" w:cs="Arial"/>
-                <w:i/>
-                <w:color w:val="548DD4"/>
-                <w:sz w:val="20"/>
-                <w:szCs w:val="20"/>
-                <w:lang w:eastAsia="es-CL"/>
-              </w:rPr>
-            </w:pPr>
-          </w:p>
-          <w:p>
-            <w:pPr>
-              <w:jc w:val="both"/>
-              <w:rPr>
-                <w:rFonts w:ascii="Calibri" w:hAnsi="Calibri" w:cs="Arial"/>
-                <w:i/>
-                <w:color w:val="548DD4"/>
-                <w:sz w:val="20"/>
-                <w:szCs w:val="20"/>
-                <w:lang w:eastAsia="es-CL"/>
-              </w:rPr>
-            </w:pPr>
-          </w:p>
-          <w:p>
-            <w:pPr>
-              <w:jc w:val="both"/>
-              <w:rPr>
-                <w:rFonts w:ascii="Calibri" w:hAnsi="Calibri" w:cs="Arial"/>
-                <w:i/>
-                <w:color w:val="548DD4"/>
-                <w:sz w:val="20"/>
-                <w:szCs w:val="20"/>
-                <w:lang w:eastAsia="es-CL"/>
-              </w:rPr>
-            </w:pPr>
-          </w:p>
-          <w:p>
-            <w:pPr>
-              <w:jc w:val="both"/>
-              <w:rPr>
-                <w:rFonts w:ascii="Calibri" w:hAnsi="Calibri" w:cs="Arial"/>
-                <w:i/>
-                <w:color w:val="548DD4"/>
-                <w:sz w:val="20"/>
-                <w:szCs w:val="20"/>
-                <w:lang w:eastAsia="es-CL"/>
-              </w:rPr>
-            </w:pPr>
-          </w:p>
-          <w:p>
-            <w:pPr>
-              <w:jc w:val="both"/>
-              <w:rPr>
-                <w:rFonts w:ascii="Calibri" w:hAnsi="Calibri" w:cs="Arial"/>
-                <w:i/>
-                <w:color w:val="548DD4"/>
-                <w:sz w:val="20"/>
-                <w:szCs w:val="20"/>
-                <w:lang w:eastAsia="es-CL"/>
-              </w:rPr>
-            </w:pPr>
+            <w:r>
+              <w:t>La ejecución automática de las pruebas (EP-007) y la generación del diagnóstico y los reportes (EP-006 / HU-008) están en curso, al igual que la estabilización y el informe final. Para no afectar el proyecto se trabaja con entregas parciales, validando sobre el sitio demo y consolidando las evidencias (reportes, videos y documentos).</w:t>
+            </w:r>
           </w:p>
         </w:tc>
       </w:tr>
@@ -3882,6 +5466,7 @@
     <w:lsdException w:name="HTML Sample" w:semiHidden="1" w:unhideWhenUsed="1"/>
     <w:lsdException w:name="HTML Typewriter" w:semiHidden="1" w:unhideWhenUsed="1"/>
     <w:lsdException w:name="HTML Variable" w:semiHidden="1" w:unhideWhenUsed="1"/>
+    <w:lsdException w:name="Normal Table" w:semiHidden="1" w:unhideWhenUsed="1"/>
     <w:lsdException w:name="annotation subject" w:semiHidden="1" w:unhideWhenUsed="1"/>
     <w:lsdException w:name="No List" w:semiHidden="1" w:unhideWhenUsed="1"/>
     <w:lsdException w:name="Outline List 1" w:semiHidden="1" w:unhideWhenUsed="1"/>
@@ -3924,8 +5509,11 @@
     <w:lsdException w:name="Table Contemporary" w:semiHidden="1" w:unhideWhenUsed="1"/>
     <w:lsdException w:name="Table Elegant" w:semiHidden="1" w:unhideWhenUsed="1"/>
     <w:lsdException w:name="Table Professional" w:semiHidden="1" w:unhideWhenUsed="1"/>
+    <w:lsdException w:name="Table Subtle 1" w:semiHidden="1" w:unhideWhenUsed="1"/>
     <w:lsdException w:name="Table Subtle 2" w:semiHidden="1" w:unhideWhenUsed="1"/>
     <w:lsdException w:name="Table Web 1" w:semiHidden="1" w:unhideWhenUsed="1"/>
+    <w:lsdException w:name="Table Web 2" w:semiHidden="1" w:unhideWhenUsed="1"/>
+    <w:lsdException w:name="Table Web 3" w:semiHidden="1" w:unhideWhenUsed="1"/>
     <w:lsdException w:name="Balloon Text" w:semiHidden="1" w:unhideWhenUsed="1"/>
     <w:lsdException w:name="Table Grid" w:uiPriority="39"/>
     <w:lsdException w:name="Table Theme" w:semiHidden="1" w:unhideWhenUsed="1"/>
@@ -4751,15 +6339,6 @@
 </file>
 
 <file path=customXml/item1.xml><?xml version="1.0" encoding="utf-8"?>
-<?mso-contentType ?>
-<FormTemplates xmlns="http://schemas.microsoft.com/sharepoint/v3/contenttype/forms">
-  <Display>DocumentLibraryForm</Display>
-  <Edit>DocumentLibraryForm</Edit>
-  <New>DocumentLibraryForm</New>
-</FormTemplates>
-</file>
-
-<file path=customXml/item2.xml><?xml version="1.0" encoding="utf-8"?>
 <ct:contentTypeSchema xmlns:ct="http://schemas.microsoft.com/office/2006/metadata/contentType" xmlns:ma="http://schemas.microsoft.com/office/2006/metadata/properties/metaAttributes" ct:_="" ma:_="" ma:contentTypeName="Documento" ma:contentTypeID="0x010100E96778489EE7714D8BD12CC105EB918B" ma:contentTypeVersion="2" ma:contentTypeDescription="Crear nuevo documento." ma:contentTypeScope="" ma:versionID="416c5c7ae9b5d54d83875cd3c65194e3">
   <xsd:schema xmlns:xsd="http://www.w3.org/2001/XMLSchema" xmlns:xs="http://www.w3.org/2001/XMLSchema" xmlns:p="http://schemas.microsoft.com/office/2006/metadata/properties" xmlns:ns2="126e8a1c-9ea9-435a-ac89-d06c80d62e30" targetNamespace="http://schemas.microsoft.com/office/2006/metadata/properties" ma:root="true" ma:fieldsID="70a237c842677bd850644f8595079f5e" ns2:_="">
     <xsd:import namespace="126e8a1c-9ea9-435a-ac89-d06c80d62e30"/>
@@ -4891,21 +6470,22 @@
 </ct:contentTypeSchema>
 </file>
 
-<file path=customXml/item3.xml><?xml version="1.0" encoding="utf-8"?>
+<file path=customXml/item2.xml><?xml version="1.0" encoding="utf-8"?>
 <p:properties xmlns:p="http://schemas.microsoft.com/office/2006/metadata/properties" xmlns:xsi="http://www.w3.org/2001/XMLSchema-instance" xmlns:pc="http://schemas.microsoft.com/office/infopath/2007/PartnerControls">
   <documentManagement/>
 </p:properties>
 </file>
 
-<file path=customXml/itemProps1.xml><?xml version="1.0" encoding="utf-8"?>
-<ds:datastoreItem xmlns:ds="http://schemas.openxmlformats.org/officeDocument/2006/customXml" ds:itemID="{D51C61E4-DB75-4684-AD25-71F546404E96}">
-  <ds:schemaRefs>
-    <ds:schemaRef ds:uri="http://schemas.microsoft.com/sharepoint/v3/contenttype/forms"/>
-  </ds:schemaRefs>
-</ds:datastoreItem>
+<file path=customXml/item3.xml><?xml version="1.0" encoding="utf-8"?>
+<?mso-contentType ?>
+<FormTemplates xmlns="http://schemas.microsoft.com/sharepoint/v3/contenttype/forms">
+  <Display>DocumentLibraryForm</Display>
+  <Edit>DocumentLibraryForm</Edit>
+  <New>DocumentLibraryForm</New>
+</FormTemplates>
 </file>
 
-<file path=customXml/itemProps2.xml><?xml version="1.0" encoding="utf-8"?>
+<file path=customXml/itemProps1.xml><?xml version="1.0" encoding="utf-8"?>
 <ds:datastoreItem xmlns:ds="http://schemas.openxmlformats.org/officeDocument/2006/customXml" ds:itemID="{6F3661B0-5934-4FAB-ADC6-33A19B814E8D}">
   <ds:schemaRefs>
     <ds:schemaRef ds:uri="http://schemas.microsoft.com/office/2006/metadata/contentType"/>
@@ -4923,18 +6503,19 @@
 </ds:datastoreItem>
 </file>
 
-<file path=customXml/itemProps3.xml><?xml version="1.0" encoding="utf-8"?>
+<file path=customXml/itemProps2.xml><?xml version="1.0" encoding="utf-8"?>
 <ds:datastoreItem xmlns:ds="http://schemas.openxmlformats.org/officeDocument/2006/customXml" ds:itemID="{46CA5683-AF87-4E40-B841-2E23A3B52406}">
   <ds:schemaRefs>
-    <ds:schemaRef ds:uri="http://purl.org/dc/terms/"/>
-    <ds:schemaRef ds:uri="http://purl.org/dc/elements/1.1/"/>
-    <ds:schemaRef ds:uri="http://schemas.openxmlformats.org/package/2006/metadata/core-properties"/>
-    <ds:schemaRef ds:uri="http://www.w3.org/XML/1998/namespace"/>
     <ds:schemaRef ds:uri="http://schemas.microsoft.com/office/2006/metadata/properties"/>
-    <ds:schemaRef ds:uri="http://schemas.microsoft.com/office/2006/documentManagement/types"/>
-    <ds:schemaRef ds:uri="http://purl.org/dc/dcmitype/"/>
     <ds:schemaRef ds:uri="http://schemas.microsoft.com/office/infopath/2007/PartnerControls"/>
-    <ds:schemaRef ds:uri="126e8a1c-9ea9-435a-ac89-d06c80d62e30"/>
+  </ds:schemaRefs>
+</ds:datastoreItem>
+</file>
+
+<file path=customXml/itemProps3.xml><?xml version="1.0" encoding="utf-8"?>
+<ds:datastoreItem xmlns:ds="http://schemas.openxmlformats.org/officeDocument/2006/customXml" ds:itemID="{D51C61E4-DB75-4684-AD25-71F546404E96}">
+  <ds:schemaRefs>
+    <ds:schemaRef ds:uri="http://schemas.microsoft.com/sharepoint/v3/contenttype/forms"/>
   </ds:schemaRefs>
 </ds:datastoreItem>
 </file>
</xml_diff>